<commit_message>
feat: practice report updated
</commit_message>
<xml_diff>
--- a/Практика 1 курс/отчёт.docx
+++ b/Практика 1 курс/отчёт.docx
@@ -1,6 +1,6 @@
 
 <file path=word/document.xml><?xml version="1.0" encoding="utf-8"?>
-<w:document xmlns:wpc="http://schemas.microsoft.com/office/word/2010/wordprocessingCanvas" xmlns:cx="http://schemas.microsoft.com/office/drawing/2014/chartex" xmlns:cx1="http://schemas.microsoft.com/office/drawing/2015/9/8/chartex" xmlns:cx2="http://schemas.microsoft.com/office/drawing/2015/10/21/chartex" xmlns:cx3="http://schemas.microsoft.com/office/drawing/2016/5/9/chartex" xmlns:cx4="http://schemas.microsoft.com/office/drawing/2016/5/10/chartex" xmlns:cx5="http://schemas.microsoft.com/office/drawing/2016/5/11/chartex" xmlns:cx6="http://schemas.microsoft.com/office/drawing/2016/5/12/chartex" xmlns:cx7="http://schemas.microsoft.com/office/drawing/2016/5/13/chartex" xmlns:cx8="http://schemas.microsoft.com/office/drawing/2016/5/14/chartex" xmlns:mc="http://schemas.openxmlformats.org/markup-compatibility/2006" xmlns:aink="http://schemas.microsoft.com/office/drawing/2016/ink" xmlns:am3d="http://schemas.microsoft.com/office/drawing/2017/model3d" xmlns:o="urn:schemas-microsoft-com:office:office" xmlns:r="http://schemas.openxmlformats.org/officeDocument/2006/relationships" xmlns:m="http://schemas.openxmlformats.org/officeDocument/2006/math" xmlns:v="urn:schemas-microsoft-com:vml" xmlns:wp14="http://schemas.microsoft.com/office/word/2010/wordprocessingDrawing" xmlns:wp="http://schemas.openxmlformats.org/drawingml/2006/wordprocessingDrawing" xmlns:w10="urn:schemas-microsoft-com:office:word" xmlns:w="http://schemas.openxmlformats.org/wordprocessingml/2006/main" xmlns:w14="http://schemas.microsoft.com/office/word/2010/wordml" xmlns:w15="http://schemas.microsoft.com/office/word/2012/wordml" xmlns:w16cex="http://schemas.microsoft.com/office/word/2018/wordml/cex" xmlns:w16cid="http://schemas.microsoft.com/office/word/2016/wordml/cid" xmlns:w16="http://schemas.microsoft.com/office/word/2018/wordml" xmlns:w16sdtdh="http://schemas.microsoft.com/office/word/2020/wordml/sdtdatahash" xmlns:w16se="http://schemas.microsoft.com/office/word/2015/wordml/symex" xmlns:wpg="http://schemas.microsoft.com/office/word/2010/wordprocessingGroup" xmlns:wpi="http://schemas.microsoft.com/office/word/2010/wordprocessingInk" xmlns:wne="http://schemas.microsoft.com/office/word/2006/wordml" xmlns:wps="http://schemas.microsoft.com/office/word/2010/wordprocessingShape" mc:Ignorable="w14 w15 w16se w16cid w16 w16cex w16sdtdh wp14">
+<w:document xmlns:wpc="http://schemas.microsoft.com/office/word/2010/wordprocessingCanvas" xmlns:cx="http://schemas.microsoft.com/office/drawing/2014/chartex" xmlns:cx1="http://schemas.microsoft.com/office/drawing/2015/9/8/chartex" xmlns:cx2="http://schemas.microsoft.com/office/drawing/2015/10/21/chartex" xmlns:cx3="http://schemas.microsoft.com/office/drawing/2016/5/9/chartex" xmlns:cx4="http://schemas.microsoft.com/office/drawing/2016/5/10/chartex" xmlns:cx5="http://schemas.microsoft.com/office/drawing/2016/5/11/chartex" xmlns:cx6="http://schemas.microsoft.com/office/drawing/2016/5/12/chartex" xmlns:cx7="http://schemas.microsoft.com/office/drawing/2016/5/13/chartex" xmlns:cx8="http://schemas.microsoft.com/office/drawing/2016/5/14/chartex" xmlns:mc="http://schemas.openxmlformats.org/markup-compatibility/2006" xmlns:aink="http://schemas.microsoft.com/office/drawing/2016/ink" xmlns:am3d="http://schemas.microsoft.com/office/drawing/2017/model3d" xmlns:o="urn:schemas-microsoft-com:office:office" xmlns:oel="http://schemas.microsoft.com/office/2019/extlst" xmlns:r="http://schemas.openxmlformats.org/officeDocument/2006/relationships" xmlns:m="http://schemas.openxmlformats.org/officeDocument/2006/math" xmlns:v="urn:schemas-microsoft-com:vml" xmlns:wp14="http://schemas.microsoft.com/office/word/2010/wordprocessingDrawing" xmlns:wp="http://schemas.openxmlformats.org/drawingml/2006/wordprocessingDrawing" xmlns:w10="urn:schemas-microsoft-com:office:word" xmlns:w="http://schemas.openxmlformats.org/wordprocessingml/2006/main" xmlns:w14="http://schemas.microsoft.com/office/word/2010/wordml" xmlns:w15="http://schemas.microsoft.com/office/word/2012/wordml" xmlns:w16cex="http://schemas.microsoft.com/office/word/2018/wordml/cex" xmlns:w16cid="http://schemas.microsoft.com/office/word/2016/wordml/cid" xmlns:w16="http://schemas.microsoft.com/office/word/2018/wordml" xmlns:w16sdtdh="http://schemas.microsoft.com/office/word/2020/wordml/sdtdatahash" xmlns:w16se="http://schemas.microsoft.com/office/word/2015/wordml/symex" xmlns:wpg="http://schemas.microsoft.com/office/word/2010/wordprocessingGroup" xmlns:wpi="http://schemas.microsoft.com/office/word/2010/wordprocessingInk" xmlns:wne="http://schemas.microsoft.com/office/word/2006/wordml" xmlns:wps="http://schemas.microsoft.com/office/word/2010/wordprocessingShape" mc:Ignorable="w14 w15 w16se w16cid w16 w16cex w16sdtdh wp14">
   <w:body>
     <w:p>
       <w:pPr>
@@ -2047,7 +2047,15 @@
                 <w:sz w:val="28"/>
                 <w:szCs w:val="28"/>
               </w:rPr>
-              <w:t>От организации Вахний Т.В.</w:t>
+              <w:t xml:space="preserve">От организации </w:t>
+            </w:r>
+            <w:r>
+              <w:rPr>
+                <w:i/>
+                <w:sz w:val="28"/>
+                <w:szCs w:val="28"/>
+              </w:rPr>
+              <w:t>Симоненко А.Е.</w:t>
             </w:r>
           </w:p>
         </w:tc>
@@ -2286,7 +2294,16 @@
                 <w:sz w:val="28"/>
                 <w:szCs w:val="28"/>
               </w:rPr>
-              <w:t>От университета Симоненко А.Е.</w:t>
+              <w:t xml:space="preserve">От университета </w:t>
+            </w:r>
+            <w:r>
+              <w:rPr>
+                <w:rFonts w:cs="Times New Roman"/>
+                <w:i/>
+                <w:sz w:val="28"/>
+                <w:szCs w:val="28"/>
+              </w:rPr>
+              <w:t>Вахний Т.В.</w:t>
             </w:r>
           </w:p>
         </w:tc>
@@ -3551,12 +3568,14 @@
       </w:pPr>
       <w:bookmarkStart w:id="0" w:name="_Toc202400443"/>
       <w:bookmarkStart w:id="1" w:name="_Toc202400496"/>
+      <w:bookmarkStart w:id="2" w:name="_Toc202429541"/>
       <w:r>
         <w:lastRenderedPageBreak/>
         <w:t>Содержание</w:t>
       </w:r>
       <w:bookmarkEnd w:id="0"/>
       <w:bookmarkEnd w:id="1"/>
+      <w:bookmarkEnd w:id="2"/>
     </w:p>
     <w:sdt>
       <w:sdtPr>
@@ -3576,13 +3595,13 @@
         <w:p>
           <w:pPr>
             <w:pStyle w:val="11"/>
-            <w:ind w:left="567" w:hanging="567"/>
             <w:rPr>
               <w:rFonts w:asciiTheme="minorHAnsi" w:eastAsiaTheme="minorEastAsia" w:hAnsiTheme="minorHAnsi" w:cstheme="minorBidi"/>
               <w:noProof/>
-              <w:sz w:val="22"/>
-              <w:szCs w:val="22"/>
-              <w:lang w:val="en-US" w:eastAsia="en-US"/>
+              <w:kern w:val="2"/>
+              <w:sz w:val="24"/>
+              <w:szCs w:val="24"/>
+              <w14:ligatures w14:val="standardContextual"/>
             </w:rPr>
           </w:pPr>
           <w:r>
@@ -3594,7 +3613,7 @@
           <w:r>
             <w:fldChar w:fldCharType="separate"/>
           </w:r>
-          <w:hyperlink w:anchor="_Toc202400497" w:history="1">
+          <w:hyperlink w:anchor="_Toc202429542" w:history="1">
             <w:r>
               <w:rPr>
                 <w:rStyle w:val="a9"/>
@@ -3621,7 +3640,7 @@
                 <w:noProof/>
                 <w:webHidden/>
               </w:rPr>
-              <w:instrText xml:space="preserve"> PAGEREF _Toc202400497 \h </w:instrText>
+              <w:instrText xml:space="preserve"> PAGEREF _Toc202429542 \h </w:instrText>
             </w:r>
             <w:r>
               <w:rPr>
@@ -3655,16 +3674,16 @@
         <w:p>
           <w:pPr>
             <w:pStyle w:val="11"/>
-            <w:ind w:left="567" w:hanging="567"/>
             <w:rPr>
               <w:rFonts w:asciiTheme="minorHAnsi" w:eastAsiaTheme="minorEastAsia" w:hAnsiTheme="minorHAnsi" w:cstheme="minorBidi"/>
               <w:noProof/>
-              <w:sz w:val="22"/>
-              <w:szCs w:val="22"/>
-              <w:lang w:val="en-US" w:eastAsia="en-US"/>
+              <w:kern w:val="2"/>
+              <w:sz w:val="24"/>
+              <w:szCs w:val="24"/>
+              <w14:ligatures w14:val="standardContextual"/>
             </w:rPr>
           </w:pPr>
-          <w:hyperlink w:anchor="_Toc202400498" w:history="1">
+          <w:hyperlink w:anchor="_Toc202429543" w:history="1">
             <w:r>
               <w:rPr>
                 <w:rStyle w:val="a9"/>
@@ -3691,7 +3710,7 @@
                 <w:noProof/>
                 <w:webHidden/>
               </w:rPr>
-              <w:instrText xml:space="preserve"> PAGEREF _Toc202400498 \h </w:instrText>
+              <w:instrText xml:space="preserve"> PAGEREF _Toc202429543 \h </w:instrText>
             </w:r>
             <w:r>
               <w:rPr>
@@ -3725,16 +3744,16 @@
         <w:p>
           <w:pPr>
             <w:pStyle w:val="21"/>
-            <w:ind w:left="1134" w:hanging="567"/>
             <w:rPr>
               <w:rFonts w:asciiTheme="minorHAnsi" w:eastAsiaTheme="minorEastAsia" w:hAnsiTheme="minorHAnsi" w:cstheme="minorBidi"/>
               <w:noProof/>
-              <w:sz w:val="22"/>
-              <w:szCs w:val="22"/>
-              <w:lang w:val="en-US" w:eastAsia="en-US"/>
+              <w:kern w:val="2"/>
+              <w:sz w:val="24"/>
+              <w:szCs w:val="24"/>
+              <w14:ligatures w14:val="standardContextual"/>
             </w:rPr>
           </w:pPr>
-          <w:hyperlink w:anchor="_Toc202400499" w:history="1">
+          <w:hyperlink w:anchor="_Toc202429544" w:history="1">
             <w:r>
               <w:rPr>
                 <w:rStyle w:val="a9"/>
@@ -3761,7 +3780,7 @@
                 <w:noProof/>
                 <w:webHidden/>
               </w:rPr>
-              <w:instrText xml:space="preserve"> PAGEREF _Toc202400499 \h </w:instrText>
+              <w:instrText xml:space="preserve"> PAGEREF _Toc202429544 \h </w:instrText>
             </w:r>
             <w:r>
               <w:rPr>
@@ -3795,16 +3814,16 @@
         <w:p>
           <w:pPr>
             <w:pStyle w:val="21"/>
-            <w:ind w:left="1134" w:hanging="567"/>
             <w:rPr>
               <w:rFonts w:asciiTheme="minorHAnsi" w:eastAsiaTheme="minorEastAsia" w:hAnsiTheme="minorHAnsi" w:cstheme="minorBidi"/>
               <w:noProof/>
-              <w:sz w:val="22"/>
-              <w:szCs w:val="22"/>
-              <w:lang w:val="en-US" w:eastAsia="en-US"/>
+              <w:kern w:val="2"/>
+              <w:sz w:val="24"/>
+              <w:szCs w:val="24"/>
+              <w14:ligatures w14:val="standardContextual"/>
             </w:rPr>
           </w:pPr>
-          <w:hyperlink w:anchor="_Toc202400500" w:history="1">
+          <w:hyperlink w:anchor="_Toc202429545" w:history="1">
             <w:r>
               <w:rPr>
                 <w:rStyle w:val="a9"/>
@@ -3831,7 +3850,7 @@
                 <w:noProof/>
                 <w:webHidden/>
               </w:rPr>
-              <w:instrText xml:space="preserve"> PAGEREF _Toc202400500 \h </w:instrText>
+              <w:instrText xml:space="preserve"> PAGEREF _Toc202429545 \h </w:instrText>
             </w:r>
             <w:r>
               <w:rPr>
@@ -3851,7 +3870,7 @@
                 <w:noProof/>
                 <w:webHidden/>
               </w:rPr>
-              <w:t>4</w:t>
+              <w:t>5</w:t>
             </w:r>
             <w:r>
               <w:rPr>
@@ -3865,16 +3884,16 @@
         <w:p>
           <w:pPr>
             <w:pStyle w:val="21"/>
-            <w:ind w:left="1134" w:hanging="567"/>
             <w:rPr>
               <w:rFonts w:asciiTheme="minorHAnsi" w:eastAsiaTheme="minorEastAsia" w:hAnsiTheme="minorHAnsi" w:cstheme="minorBidi"/>
               <w:noProof/>
-              <w:sz w:val="22"/>
-              <w:szCs w:val="22"/>
-              <w:lang w:val="en-US" w:eastAsia="en-US"/>
+              <w:kern w:val="2"/>
+              <w:sz w:val="24"/>
+              <w:szCs w:val="24"/>
+              <w14:ligatures w14:val="standardContextual"/>
             </w:rPr>
           </w:pPr>
-          <w:hyperlink w:anchor="_Toc202400501" w:history="1">
+          <w:hyperlink w:anchor="_Toc202429546" w:history="1">
             <w:r>
               <w:rPr>
                 <w:rStyle w:val="a9"/>
@@ -3901,7 +3920,7 @@
                 <w:noProof/>
                 <w:webHidden/>
               </w:rPr>
-              <w:instrText xml:space="preserve"> PAGEREF _Toc202400501 \h </w:instrText>
+              <w:instrText xml:space="preserve"> PAGEREF _Toc202429546 \h </w:instrText>
             </w:r>
             <w:r>
               <w:rPr>
@@ -3935,16 +3954,16 @@
         <w:p>
           <w:pPr>
             <w:pStyle w:val="21"/>
-            <w:ind w:left="1134" w:hanging="567"/>
             <w:rPr>
               <w:rFonts w:asciiTheme="minorHAnsi" w:eastAsiaTheme="minorEastAsia" w:hAnsiTheme="minorHAnsi" w:cstheme="minorBidi"/>
               <w:noProof/>
-              <w:sz w:val="22"/>
-              <w:szCs w:val="22"/>
-              <w:lang w:val="en-US" w:eastAsia="en-US"/>
+              <w:kern w:val="2"/>
+              <w:sz w:val="24"/>
+              <w:szCs w:val="24"/>
+              <w14:ligatures w14:val="standardContextual"/>
             </w:rPr>
           </w:pPr>
-          <w:hyperlink w:anchor="_Toc202400502" w:history="1">
+          <w:hyperlink w:anchor="_Toc202429547" w:history="1">
             <w:r>
               <w:rPr>
                 <w:rStyle w:val="a9"/>
@@ -3971,7 +3990,7 @@
                 <w:noProof/>
                 <w:webHidden/>
               </w:rPr>
-              <w:instrText xml:space="preserve"> PAGEREF _Toc202400502 \h </w:instrText>
+              <w:instrText xml:space="preserve"> PAGEREF _Toc202429547 \h </w:instrText>
             </w:r>
             <w:r>
               <w:rPr>
@@ -3991,7 +4010,7 @@
                 <w:noProof/>
                 <w:webHidden/>
               </w:rPr>
-              <w:t>5</w:t>
+              <w:t>6</w:t>
             </w:r>
             <w:r>
               <w:rPr>
@@ -4005,16 +4024,16 @@
         <w:p>
           <w:pPr>
             <w:pStyle w:val="21"/>
-            <w:ind w:left="1134" w:hanging="567"/>
             <w:rPr>
               <w:rFonts w:asciiTheme="minorHAnsi" w:eastAsiaTheme="minorEastAsia" w:hAnsiTheme="minorHAnsi" w:cstheme="minorBidi"/>
               <w:noProof/>
-              <w:sz w:val="22"/>
-              <w:szCs w:val="22"/>
-              <w:lang w:val="en-US" w:eastAsia="en-US"/>
+              <w:kern w:val="2"/>
+              <w:sz w:val="24"/>
+              <w:szCs w:val="24"/>
+              <w14:ligatures w14:val="standardContextual"/>
             </w:rPr>
           </w:pPr>
-          <w:hyperlink w:anchor="_Toc202400503" w:history="1">
+          <w:hyperlink w:anchor="_Toc202429548" w:history="1">
             <w:r>
               <w:rPr>
                 <w:rStyle w:val="a9"/>
@@ -4041,7 +4060,7 @@
                 <w:noProof/>
                 <w:webHidden/>
               </w:rPr>
-              <w:instrText xml:space="preserve"> PAGEREF _Toc202400503 \h </w:instrText>
+              <w:instrText xml:space="preserve"> PAGEREF _Toc202429548 \h </w:instrText>
             </w:r>
             <w:r>
               <w:rPr>
@@ -4075,16 +4094,16 @@
         <w:p>
           <w:pPr>
             <w:pStyle w:val="11"/>
-            <w:ind w:left="567" w:hanging="567"/>
             <w:rPr>
               <w:rFonts w:asciiTheme="minorHAnsi" w:eastAsiaTheme="minorEastAsia" w:hAnsiTheme="minorHAnsi" w:cstheme="minorBidi"/>
               <w:noProof/>
-              <w:sz w:val="22"/>
-              <w:szCs w:val="22"/>
-              <w:lang w:val="en-US" w:eastAsia="en-US"/>
+              <w:kern w:val="2"/>
+              <w:sz w:val="24"/>
+              <w:szCs w:val="24"/>
+              <w14:ligatures w14:val="standardContextual"/>
             </w:rPr>
           </w:pPr>
-          <w:hyperlink w:anchor="_Toc202400504" w:history="1">
+          <w:hyperlink w:anchor="_Toc202429549" w:history="1">
             <w:r>
               <w:rPr>
                 <w:rStyle w:val="a9"/>
@@ -4111,7 +4130,7 @@
                 <w:noProof/>
                 <w:webHidden/>
               </w:rPr>
-              <w:instrText xml:space="preserve"> PAGEREF _Toc202400504 \h </w:instrText>
+              <w:instrText xml:space="preserve"> PAGEREF _Toc202429549 \h </w:instrText>
             </w:r>
             <w:r>
               <w:rPr>
@@ -4131,7 +4150,7 @@
                 <w:noProof/>
                 <w:webHidden/>
               </w:rPr>
-              <w:t>7</w:t>
+              <w:t>8</w:t>
             </w:r>
             <w:r>
               <w:rPr>
@@ -4145,16 +4164,16 @@
         <w:p>
           <w:pPr>
             <w:pStyle w:val="21"/>
-            <w:ind w:left="1134" w:hanging="567"/>
             <w:rPr>
               <w:rFonts w:asciiTheme="minorHAnsi" w:eastAsiaTheme="minorEastAsia" w:hAnsiTheme="minorHAnsi" w:cstheme="minorBidi"/>
               <w:noProof/>
-              <w:sz w:val="22"/>
-              <w:szCs w:val="22"/>
-              <w:lang w:val="en-US" w:eastAsia="en-US"/>
+              <w:kern w:val="2"/>
+              <w:sz w:val="24"/>
+              <w:szCs w:val="24"/>
+              <w14:ligatures w14:val="standardContextual"/>
             </w:rPr>
           </w:pPr>
-          <w:hyperlink w:anchor="_Toc202400505" w:history="1">
+          <w:hyperlink w:anchor="_Toc202429550" w:history="1">
             <w:r>
               <w:rPr>
                 <w:rStyle w:val="a9"/>
@@ -4181,7 +4200,7 @@
                 <w:noProof/>
                 <w:webHidden/>
               </w:rPr>
-              <w:instrText xml:space="preserve"> PAGEREF _Toc202400505 \h </w:instrText>
+              <w:instrText xml:space="preserve"> PAGEREF _Toc202429550 \h </w:instrText>
             </w:r>
             <w:r>
               <w:rPr>
@@ -4201,7 +4220,7 @@
                 <w:noProof/>
                 <w:webHidden/>
               </w:rPr>
-              <w:t>7</w:t>
+              <w:t>8</w:t>
             </w:r>
             <w:r>
               <w:rPr>
@@ -4215,16 +4234,16 @@
         <w:p>
           <w:pPr>
             <w:pStyle w:val="21"/>
-            <w:ind w:left="1134" w:hanging="567"/>
             <w:rPr>
               <w:rFonts w:asciiTheme="minorHAnsi" w:eastAsiaTheme="minorEastAsia" w:hAnsiTheme="minorHAnsi" w:cstheme="minorBidi"/>
               <w:noProof/>
-              <w:sz w:val="22"/>
-              <w:szCs w:val="22"/>
-              <w:lang w:val="en-US" w:eastAsia="en-US"/>
+              <w:kern w:val="2"/>
+              <w:sz w:val="24"/>
+              <w:szCs w:val="24"/>
+              <w14:ligatures w14:val="standardContextual"/>
             </w:rPr>
           </w:pPr>
-          <w:hyperlink w:anchor="_Toc202400506" w:history="1">
+          <w:hyperlink w:anchor="_Toc202429551" w:history="1">
             <w:r>
               <w:rPr>
                 <w:rStyle w:val="a9"/>
@@ -4251,7 +4270,7 @@
                 <w:noProof/>
                 <w:webHidden/>
               </w:rPr>
-              <w:instrText xml:space="preserve"> PAGEREF _Toc202400506 \h </w:instrText>
+              <w:instrText xml:space="preserve"> PAGEREF _Toc202429551 \h </w:instrText>
             </w:r>
             <w:r>
               <w:rPr>
@@ -4271,7 +4290,7 @@
                 <w:noProof/>
                 <w:webHidden/>
               </w:rPr>
-              <w:t>11</w:t>
+              <w:t>12</w:t>
             </w:r>
             <w:r>
               <w:rPr>
@@ -4285,16 +4304,16 @@
         <w:p>
           <w:pPr>
             <w:pStyle w:val="11"/>
-            <w:ind w:left="567" w:hanging="567"/>
             <w:rPr>
               <w:rFonts w:asciiTheme="minorHAnsi" w:eastAsiaTheme="minorEastAsia" w:hAnsiTheme="minorHAnsi" w:cstheme="minorBidi"/>
               <w:noProof/>
-              <w:sz w:val="22"/>
-              <w:szCs w:val="22"/>
-              <w:lang w:val="en-US" w:eastAsia="en-US"/>
+              <w:kern w:val="2"/>
+              <w:sz w:val="24"/>
+              <w:szCs w:val="24"/>
+              <w14:ligatures w14:val="standardContextual"/>
             </w:rPr>
           </w:pPr>
-          <w:hyperlink w:anchor="_Toc202400507" w:history="1">
+          <w:hyperlink w:anchor="_Toc202429552" w:history="1">
             <w:r>
               <w:rPr>
                 <w:rStyle w:val="a9"/>
@@ -4321,7 +4340,7 @@
                 <w:noProof/>
                 <w:webHidden/>
               </w:rPr>
-              <w:instrText xml:space="preserve"> PAGEREF _Toc202400507 \h </w:instrText>
+              <w:instrText xml:space="preserve"> PAGEREF _Toc202429552 \h </w:instrText>
             </w:r>
             <w:r>
               <w:rPr>
@@ -4341,7 +4360,7 @@
                 <w:noProof/>
                 <w:webHidden/>
               </w:rPr>
-              <w:t>12</w:t>
+              <w:t>13</w:t>
             </w:r>
             <w:r>
               <w:rPr>
@@ -4355,16 +4374,16 @@
         <w:p>
           <w:pPr>
             <w:pStyle w:val="21"/>
-            <w:ind w:left="1134" w:hanging="567"/>
             <w:rPr>
               <w:rFonts w:asciiTheme="minorHAnsi" w:eastAsiaTheme="minorEastAsia" w:hAnsiTheme="minorHAnsi" w:cstheme="minorBidi"/>
               <w:noProof/>
-              <w:sz w:val="22"/>
-              <w:szCs w:val="22"/>
-              <w:lang w:val="en-US" w:eastAsia="en-US"/>
+              <w:kern w:val="2"/>
+              <w:sz w:val="24"/>
+              <w:szCs w:val="24"/>
+              <w14:ligatures w14:val="standardContextual"/>
             </w:rPr>
           </w:pPr>
-          <w:hyperlink w:anchor="_Toc202400508" w:history="1">
+          <w:hyperlink w:anchor="_Toc202429553" w:history="1">
             <w:r>
               <w:rPr>
                 <w:rStyle w:val="a9"/>
@@ -4391,7 +4410,7 @@
                 <w:noProof/>
                 <w:webHidden/>
               </w:rPr>
-              <w:instrText xml:space="preserve"> PAGEREF _Toc202400508 \h </w:instrText>
+              <w:instrText xml:space="preserve"> PAGEREF _Toc202429553 \h </w:instrText>
             </w:r>
             <w:r>
               <w:rPr>
@@ -4411,7 +4430,7 @@
                 <w:noProof/>
                 <w:webHidden/>
               </w:rPr>
-              <w:t>13</w:t>
+              <w:t>14</w:t>
             </w:r>
             <w:r>
               <w:rPr>
@@ -4425,16 +4444,16 @@
         <w:p>
           <w:pPr>
             <w:pStyle w:val="21"/>
-            <w:ind w:left="1134" w:hanging="567"/>
             <w:rPr>
               <w:rFonts w:asciiTheme="minorHAnsi" w:eastAsiaTheme="minorEastAsia" w:hAnsiTheme="minorHAnsi" w:cstheme="minorBidi"/>
               <w:noProof/>
-              <w:sz w:val="22"/>
-              <w:szCs w:val="22"/>
-              <w:lang w:val="en-US" w:eastAsia="en-US"/>
+              <w:kern w:val="2"/>
+              <w:sz w:val="24"/>
+              <w:szCs w:val="24"/>
+              <w14:ligatures w14:val="standardContextual"/>
             </w:rPr>
           </w:pPr>
-          <w:hyperlink w:anchor="_Toc202400509" w:history="1">
+          <w:hyperlink w:anchor="_Toc202429554" w:history="1">
             <w:r>
               <w:rPr>
                 <w:rStyle w:val="a9"/>
@@ -4461,7 +4480,7 @@
                 <w:noProof/>
                 <w:webHidden/>
               </w:rPr>
-              <w:instrText xml:space="preserve"> PAGEREF _Toc202400509 \h </w:instrText>
+              <w:instrText xml:space="preserve"> PAGEREF _Toc202429554 \h </w:instrText>
             </w:r>
             <w:r>
               <w:rPr>
@@ -4481,7 +4500,7 @@
                 <w:noProof/>
                 <w:webHidden/>
               </w:rPr>
-              <w:t>14</w:t>
+              <w:t>16</w:t>
             </w:r>
             <w:r>
               <w:rPr>
@@ -4495,16 +4514,16 @@
         <w:p>
           <w:pPr>
             <w:pStyle w:val="11"/>
-            <w:ind w:left="567" w:hanging="567"/>
             <w:rPr>
               <w:rFonts w:asciiTheme="minorHAnsi" w:eastAsiaTheme="minorEastAsia" w:hAnsiTheme="minorHAnsi" w:cstheme="minorBidi"/>
               <w:noProof/>
-              <w:sz w:val="22"/>
-              <w:szCs w:val="22"/>
-              <w:lang w:val="en-US" w:eastAsia="en-US"/>
+              <w:kern w:val="2"/>
+              <w:sz w:val="24"/>
+              <w:szCs w:val="24"/>
+              <w14:ligatures w14:val="standardContextual"/>
             </w:rPr>
           </w:pPr>
-          <w:hyperlink w:anchor="_Toc202400510" w:history="1">
+          <w:hyperlink w:anchor="_Toc202429555" w:history="1">
             <w:r>
               <w:rPr>
                 <w:rStyle w:val="a9"/>
@@ -4531,7 +4550,7 @@
                 <w:noProof/>
                 <w:webHidden/>
               </w:rPr>
-              <w:instrText xml:space="preserve"> PAGEREF _Toc202400510 \h </w:instrText>
+              <w:instrText xml:space="preserve"> PAGEREF _Toc202429555 \h </w:instrText>
             </w:r>
             <w:r>
               <w:rPr>
@@ -4551,7 +4570,7 @@
                 <w:noProof/>
                 <w:webHidden/>
               </w:rPr>
-              <w:t>15</w:t>
+              <w:t>17</w:t>
             </w:r>
             <w:r>
               <w:rPr>
@@ -4565,16 +4584,16 @@
         <w:p>
           <w:pPr>
             <w:pStyle w:val="11"/>
-            <w:ind w:left="567" w:hanging="567"/>
             <w:rPr>
               <w:rFonts w:asciiTheme="minorHAnsi" w:eastAsiaTheme="minorEastAsia" w:hAnsiTheme="minorHAnsi" w:cstheme="minorBidi"/>
               <w:noProof/>
-              <w:sz w:val="22"/>
-              <w:szCs w:val="22"/>
-              <w:lang w:val="en-US" w:eastAsia="en-US"/>
+              <w:kern w:val="2"/>
+              <w:sz w:val="24"/>
+              <w:szCs w:val="24"/>
+              <w14:ligatures w14:val="standardContextual"/>
             </w:rPr>
           </w:pPr>
-          <w:hyperlink w:anchor="_Toc202400511" w:history="1">
+          <w:hyperlink w:anchor="_Toc202429556" w:history="1">
             <w:r>
               <w:rPr>
                 <w:rStyle w:val="a9"/>
@@ -4601,7 +4620,7 @@
                 <w:noProof/>
                 <w:webHidden/>
               </w:rPr>
-              <w:instrText xml:space="preserve"> PAGEREF _Toc202400511 \h </w:instrText>
+              <w:instrText xml:space="preserve"> PAGEREF _Toc202429556 \h </w:instrText>
             </w:r>
             <w:r>
               <w:rPr>
@@ -4621,7 +4640,294 @@
                 <w:noProof/>
                 <w:webHidden/>
               </w:rPr>
-              <w:t>16</w:t>
+              <w:t>18</w:t>
+            </w:r>
+            <w:r>
+              <w:rPr>
+                <w:noProof/>
+                <w:webHidden/>
+              </w:rPr>
+              <w:fldChar w:fldCharType="end"/>
+            </w:r>
+          </w:hyperlink>
+        </w:p>
+        <w:p>
+          <w:pPr>
+            <w:pStyle w:val="11"/>
+            <w:rPr>
+              <w:rFonts w:asciiTheme="minorHAnsi" w:eastAsiaTheme="minorEastAsia" w:hAnsiTheme="minorHAnsi" w:cstheme="minorBidi"/>
+              <w:noProof/>
+              <w:kern w:val="2"/>
+              <w:sz w:val="24"/>
+              <w:szCs w:val="24"/>
+              <w14:ligatures w14:val="standardContextual"/>
+            </w:rPr>
+          </w:pPr>
+          <w:hyperlink w:anchor="_Toc202429557" w:history="1">
+            <w:r>
+              <w:rPr>
+                <w:rStyle w:val="a9"/>
+                <w:noProof/>
+              </w:rPr>
+              <w:t>Приложение</w:t>
+            </w:r>
+            <w:r>
+              <w:rPr>
+                <w:rStyle w:val="a9"/>
+                <w:noProof/>
+              </w:rPr>
+              <w:t xml:space="preserve"> А</w:t>
+            </w:r>
+            <w:r>
+              <w:rPr>
+                <w:noProof/>
+                <w:webHidden/>
+              </w:rPr>
+              <w:tab/>
+            </w:r>
+            <w:r>
+              <w:rPr>
+                <w:noProof/>
+                <w:webHidden/>
+              </w:rPr>
+              <w:fldChar w:fldCharType="begin"/>
+            </w:r>
+            <w:r>
+              <w:rPr>
+                <w:noProof/>
+                <w:webHidden/>
+              </w:rPr>
+              <w:instrText xml:space="preserve"> PAGEREF _Toc202429557 \h </w:instrText>
+            </w:r>
+            <w:r>
+              <w:rPr>
+                <w:noProof/>
+                <w:webHidden/>
+              </w:rPr>
+            </w:r>
+            <w:r>
+              <w:rPr>
+                <w:noProof/>
+                <w:webHidden/>
+              </w:rPr>
+              <w:fldChar w:fldCharType="separate"/>
+            </w:r>
+            <w:r>
+              <w:rPr>
+                <w:noProof/>
+                <w:webHidden/>
+              </w:rPr>
+              <w:t>19</w:t>
+            </w:r>
+            <w:r>
+              <w:rPr>
+                <w:noProof/>
+                <w:webHidden/>
+              </w:rPr>
+              <w:fldChar w:fldCharType="end"/>
+            </w:r>
+          </w:hyperlink>
+        </w:p>
+        <w:p>
+          <w:pPr>
+            <w:pStyle w:val="21"/>
+            <w:rPr>
+              <w:rFonts w:asciiTheme="minorHAnsi" w:eastAsiaTheme="minorEastAsia" w:hAnsiTheme="minorHAnsi" w:cstheme="minorBidi"/>
+              <w:noProof/>
+              <w:kern w:val="2"/>
+              <w:sz w:val="24"/>
+              <w:szCs w:val="24"/>
+              <w14:ligatures w14:val="standardContextual"/>
+            </w:rPr>
+          </w:pPr>
+          <w:hyperlink w:anchor="_Toc202429558" w:history="1">
+            <w:r>
+              <w:rPr>
+                <w:rStyle w:val="a9"/>
+                <w:noProof/>
+              </w:rPr>
+              <w:t>1. Код объектно-ориентированного приложения</w:t>
+            </w:r>
+            <w:r>
+              <w:rPr>
+                <w:noProof/>
+                <w:webHidden/>
+              </w:rPr>
+              <w:tab/>
+            </w:r>
+            <w:r>
+              <w:rPr>
+                <w:noProof/>
+                <w:webHidden/>
+              </w:rPr>
+              <w:fldChar w:fldCharType="begin"/>
+            </w:r>
+            <w:r>
+              <w:rPr>
+                <w:noProof/>
+                <w:webHidden/>
+              </w:rPr>
+              <w:instrText xml:space="preserve"> PAGEREF _Toc202429558 \h </w:instrText>
+            </w:r>
+            <w:r>
+              <w:rPr>
+                <w:noProof/>
+                <w:webHidden/>
+              </w:rPr>
+            </w:r>
+            <w:r>
+              <w:rPr>
+                <w:noProof/>
+                <w:webHidden/>
+              </w:rPr>
+              <w:fldChar w:fldCharType="separate"/>
+            </w:r>
+            <w:r>
+              <w:rPr>
+                <w:noProof/>
+                <w:webHidden/>
+              </w:rPr>
+              <w:t>19</w:t>
+            </w:r>
+            <w:r>
+              <w:rPr>
+                <w:noProof/>
+                <w:webHidden/>
+              </w:rPr>
+              <w:fldChar w:fldCharType="end"/>
+            </w:r>
+          </w:hyperlink>
+        </w:p>
+        <w:p>
+          <w:pPr>
+            <w:pStyle w:val="21"/>
+            <w:rPr>
+              <w:rFonts w:asciiTheme="minorHAnsi" w:eastAsiaTheme="minorEastAsia" w:hAnsiTheme="minorHAnsi" w:cstheme="minorBidi"/>
+              <w:noProof/>
+              <w:kern w:val="2"/>
+              <w:sz w:val="24"/>
+              <w:szCs w:val="24"/>
+              <w14:ligatures w14:val="standardContextual"/>
+            </w:rPr>
+          </w:pPr>
+          <w:hyperlink w:anchor="_Toc202429559" w:history="1">
+            <w:r>
+              <w:rPr>
+                <w:rStyle w:val="a9"/>
+                <w:noProof/>
+              </w:rPr>
+              <w:t>2. Код первой задачи для анализа данных</w:t>
+            </w:r>
+            <w:r>
+              <w:rPr>
+                <w:noProof/>
+                <w:webHidden/>
+              </w:rPr>
+              <w:tab/>
+            </w:r>
+            <w:r>
+              <w:rPr>
+                <w:noProof/>
+                <w:webHidden/>
+              </w:rPr>
+              <w:fldChar w:fldCharType="begin"/>
+            </w:r>
+            <w:r>
+              <w:rPr>
+                <w:noProof/>
+                <w:webHidden/>
+              </w:rPr>
+              <w:instrText xml:space="preserve"> PAGEREF _Toc202429559 \h </w:instrText>
+            </w:r>
+            <w:r>
+              <w:rPr>
+                <w:noProof/>
+                <w:webHidden/>
+              </w:rPr>
+            </w:r>
+            <w:r>
+              <w:rPr>
+                <w:noProof/>
+                <w:webHidden/>
+              </w:rPr>
+              <w:fldChar w:fldCharType="separate"/>
+            </w:r>
+            <w:r>
+              <w:rPr>
+                <w:noProof/>
+                <w:webHidden/>
+              </w:rPr>
+              <w:t>22</w:t>
+            </w:r>
+            <w:r>
+              <w:rPr>
+                <w:noProof/>
+                <w:webHidden/>
+              </w:rPr>
+              <w:fldChar w:fldCharType="end"/>
+            </w:r>
+          </w:hyperlink>
+        </w:p>
+        <w:p>
+          <w:pPr>
+            <w:pStyle w:val="21"/>
+            <w:rPr>
+              <w:rFonts w:asciiTheme="minorHAnsi" w:eastAsiaTheme="minorEastAsia" w:hAnsiTheme="minorHAnsi" w:cstheme="minorBidi"/>
+              <w:noProof/>
+              <w:kern w:val="2"/>
+              <w:sz w:val="24"/>
+              <w:szCs w:val="24"/>
+              <w14:ligatures w14:val="standardContextual"/>
+            </w:rPr>
+          </w:pPr>
+          <w:hyperlink w:anchor="_Toc202429560" w:history="1">
+            <w:r>
+              <w:rPr>
+                <w:rStyle w:val="a9"/>
+                <w:noProof/>
+              </w:rPr>
+              <w:t>3. Код второй задачи для анализа данных</w:t>
+            </w:r>
+            <w:r>
+              <w:rPr>
+                <w:noProof/>
+                <w:webHidden/>
+              </w:rPr>
+              <w:tab/>
+            </w:r>
+            <w:r>
+              <w:rPr>
+                <w:noProof/>
+                <w:webHidden/>
+              </w:rPr>
+              <w:fldChar w:fldCharType="begin"/>
+            </w:r>
+            <w:r>
+              <w:rPr>
+                <w:noProof/>
+                <w:webHidden/>
+              </w:rPr>
+              <w:instrText xml:space="preserve"> PAGEREF _Toc202429560 \h </w:instrText>
+            </w:r>
+            <w:r>
+              <w:rPr>
+                <w:noProof/>
+                <w:webHidden/>
+              </w:rPr>
+            </w:r>
+            <w:r>
+              <w:rPr>
+                <w:noProof/>
+                <w:webHidden/>
+              </w:rPr>
+              <w:fldChar w:fldCharType="separate"/>
+            </w:r>
+            <w:r>
+              <w:rPr>
+                <w:noProof/>
+                <w:webHidden/>
+              </w:rPr>
+              <w:t>22</w:t>
             </w:r>
             <w:r>
               <w:rPr>
@@ -4653,16 +4959,34 @@
       <w:r>
         <w:br w:type="page"/>
       </w:r>
-      <w:bookmarkStart w:id="2" w:name="_Toc202400497"/>
+      <w:bookmarkStart w:id="3" w:name="_Toc202429542"/>
       <w:r>
         <w:lastRenderedPageBreak/>
         <w:t>Введение</w:t>
       </w:r>
-      <w:bookmarkEnd w:id="2"/>
+      <w:bookmarkEnd w:id="3"/>
     </w:p>
     <w:p>
       <w:r>
-        <w:t xml:space="preserve">Отчёт содержит 32 с., 5 рис., 6 ист., 1 прил.  </w:t>
+        <w:t xml:space="preserve">Отчёт содержит </w:t>
+      </w:r>
+      <w:r>
+        <w:t>18</w:t>
+      </w:r>
+      <w:r>
+        <w:t xml:space="preserve"> с., </w:t>
+      </w:r>
+      <w:r>
+        <w:t>9</w:t>
+      </w:r>
+      <w:r>
+        <w:t xml:space="preserve"> рис., </w:t>
+      </w:r>
+      <w:r>
+        <w:t>8</w:t>
+      </w:r>
+      <w:r>
+        <w:t xml:space="preserve"> ист., 1 прил.  </w:t>
       </w:r>
     </w:p>
     <w:p>
@@ -4751,49 +5075,10 @@
         <w:ind w:firstLine="567"/>
         <w:jc w:val="left"/>
       </w:pPr>
-      <w:bookmarkStart w:id="3" w:name="_Toc202400498"/>
+      <w:bookmarkStart w:id="4" w:name="_Toc202429543"/>
       <w:r>
         <w:lastRenderedPageBreak/>
         <w:t>1. РЕФЕРАТ ПО ТЕМЕ ТЕСТИРОВАНИЕ ПО</w:t>
-      </w:r>
-      <w:bookmarkEnd w:id="3"/>
-    </w:p>
-    <w:p>
-      <w:pPr>
-        <w:rPr>
-          <w:lang w:eastAsia="x-none"/>
-        </w:rPr>
-      </w:pPr>
-      <w:r>
-        <w:rPr>
-          <w:lang w:eastAsia="x-none"/>
-        </w:rPr>
-        <w:t>Тестирование программного обеспечения занимает одно из центральных мест в процессе разработки современных программных систем. По мере усложнения технологий и расширения применения программных продуктов в критически важных сферах — таких как медицина, транспорт, финансы — возрастает необходимость обеспечения их надёжности. Тестирование рассматривается не как заключительный этап разработки, а как неотъемлемая часть жизненного цикла программного обеспечения. Оно представляет собой систематизированный процесс выявления и устранения ошибок до их попадания к конечному пользователю.</w:t>
-      </w:r>
-    </w:p>
-    <w:p>
-      <w:pPr>
-        <w:rPr>
-          <w:lang w:eastAsia="x-none"/>
-        </w:rPr>
-      </w:pPr>
-      <w:r>
-        <w:rPr>
-          <w:lang w:eastAsia="x-none"/>
-        </w:rPr>
-        <w:t>Разработка программных продуктов без систематического тестирования приводит к появлению скрытых дефектов, которые могут проявиться в самый неожиданный момент. Именно поэтому уже на ранних этапах проектирования формулируются стратегии тестирования, определяются уровни покрытия и критерии приёмки. Такой подход позволяет строить надёжные и устойчивые к ошибкам системы, особенно если речь идёт о массовом или промышленном программном обеспечении, где сбои недопустимы.</w:t>
-      </w:r>
-    </w:p>
-    <w:p>
-      <w:pPr>
-        <w:pStyle w:val="2"/>
-      </w:pPr>
-      <w:bookmarkStart w:id="4" w:name="_Toc202400499"/>
-      <w:r>
-        <w:t>1.1 Ц</w:t>
-      </w:r>
-      <w:r>
-        <w:t>ели и задачи тестирования программного обеспечения</w:t>
       </w:r>
       <w:bookmarkEnd w:id="4"/>
     </w:p>
@@ -4807,7 +5092,7 @@
         <w:rPr>
           <w:lang w:eastAsia="x-none"/>
         </w:rPr>
-        <w:t>Основная цель тестирования — обеспечение качества программного продукта. Однако под этим термином скрывается целый комплекс задач, связанных с проверкой, верификацией и валидацией. Качество невозможно измерить напрямую, поэтому используются разнообразные метрики, такие как количество обнаруженных дефектов, плотность ошибок, стабильность версий, процент покрытия кода тестами.</w:t>
+        <w:t>Тестирование программного обеспечения занимает одно из центральных мест в процессе разработки современных программных систем. По мере усложнения технологий и расширения применения программных продуктов в критически важных сферах — таких как медицина, транспорт, финансы — возрастает необходимость обеспечения их надёжности. Тестирование рассматривается не как заключительный этап разработки, а как неотъемлемая часть жизненного цикла программного обеспечения. Оно представляет собой систематизированный процесс выявления и устранения ошибок до их попадания к конечному пользователю.</w:t>
       </w:r>
     </w:p>
     <w:p>
@@ -4820,20 +5105,59 @@
         <w:rPr>
           <w:lang w:eastAsia="x-none"/>
         </w:rPr>
-        <w:t>Важно понимать, что тестирование не гарантирует отсутствие ошибок, но значительно снижает вероятность их возникновения при эксплуатации. За счёт системного подхода удаётся не только зафиксировать сбои, но и выявить закономерности, приводящие к ошибкам, что, в свою очередь, позволяет совершенствовать архитектуру продукта. Тестирование также служит инструментом оценки зрелости разработки, особенно в распределённых командах, где взаимодействие между разработчиками, аналитиками и тестировщиками критично</w:t>
-      </w:r>
-      <w:r>
-        <w:rPr>
-          <w:lang w:eastAsia="x-none"/>
-        </w:rPr>
-        <w:t>.</w:t>
+        <w:t>Разработка программных продуктов без систематического тестирования приводит к появлению скрытых дефектов, которые могут проявиться в самый неожиданный момент. Именно поэтому уже на ранних этапах проектирования формулируются стратегии тестирования, определяются уровни покрытия и критерии приёмки. Такой подход позволяет строить надёжные и устойчивые к ошибкам системы, особенно если речь идёт о массовом или промышленном программном обеспечении, где сбои недопустимы.</w:t>
       </w:r>
     </w:p>
     <w:p>
       <w:pPr>
         <w:pStyle w:val="2"/>
       </w:pPr>
-      <w:bookmarkStart w:id="5" w:name="_Toc202400500"/>
+      <w:bookmarkStart w:id="5" w:name="_Toc202429544"/>
+      <w:r>
+        <w:t>1.1 Ц</w:t>
+      </w:r>
+      <w:r>
+        <w:t>ели и задачи тестирования программного обеспечения</w:t>
+      </w:r>
+      <w:bookmarkEnd w:id="5"/>
+    </w:p>
+    <w:p>
+      <w:pPr>
+        <w:rPr>
+          <w:lang w:eastAsia="x-none"/>
+        </w:rPr>
+      </w:pPr>
+      <w:r>
+        <w:rPr>
+          <w:lang w:eastAsia="x-none"/>
+        </w:rPr>
+        <w:t>Основная цель тестирования — обеспечение качества программного продукта. Однако под этим термином скрывается целый комплекс задач, связанных с проверкой, верификацией и валидацией. Качество невозможно измерить напрямую, поэтому используются разнообразные метрики, такие как количество обнаруженных дефектов, плотность ошибок, стабильность версий, процент покрытия кода тестами.</w:t>
+      </w:r>
+    </w:p>
+    <w:p>
+      <w:pPr>
+        <w:rPr>
+          <w:lang w:eastAsia="x-none"/>
+        </w:rPr>
+      </w:pPr>
+      <w:r>
+        <w:rPr>
+          <w:lang w:eastAsia="x-none"/>
+        </w:rPr>
+        <w:t>Важно понимать, что тестирование не гарантирует отсутствие ошибок, но значительно снижает вероятность их возникновения при эксплуатации. За счёт системного подхода удаётся не только зафиксировать сбои, но и выявить закономерности, приводящие к ошибкам, что, в свою очередь, позволяет совершенствовать архитектуру продукта. Тестирование также служит инструментом оценки зрелости разработки, особенно в распределённых командах, где взаимодействие между разработчиками, аналитиками и тестировщиками критично</w:t>
+      </w:r>
+      <w:r>
+        <w:rPr>
+          <w:lang w:eastAsia="x-none"/>
+        </w:rPr>
+        <w:t>.</w:t>
+      </w:r>
+    </w:p>
+    <w:p>
+      <w:pPr>
+        <w:pStyle w:val="2"/>
+      </w:pPr>
+      <w:bookmarkStart w:id="6" w:name="_Toc202429545"/>
       <w:r>
         <w:lastRenderedPageBreak/>
         <w:t xml:space="preserve">1.2 </w:t>
@@ -4841,7 +5165,7 @@
       <w:r>
         <w:t>Классификация и типология тестирования</w:t>
       </w:r>
-      <w:bookmarkEnd w:id="5"/>
+      <w:bookmarkEnd w:id="6"/>
     </w:p>
     <w:p>
       <w:pPr>
@@ -4861,21 +5185,7 @@
             <w:rFonts w:ascii="Cambria Math" w:hAnsi="Cambria Math"/>
             <w:lang w:eastAsia="x-none"/>
           </w:rPr>
-          <m:t>unit</m:t>
-        </m:r>
-        <m:r>
-          <w:rPr>
-            <w:rFonts w:ascii="Cambria Math" w:hAnsi="Cambria Math"/>
-            <w:lang w:eastAsia="x-none"/>
-          </w:rPr>
-          <m:t xml:space="preserve"> </m:t>
-        </m:r>
-        <m:r>
-          <w:rPr>
-            <w:rFonts w:ascii="Cambria Math" w:hAnsi="Cambria Math"/>
-            <w:lang w:eastAsia="x-none"/>
-          </w:rPr>
-          <m:t>testing</m:t>
+          <m:t>unit testing</m:t>
         </m:r>
       </m:oMath>
       <w:r>
@@ -4895,35 +5205,7 @@
         <w:rPr>
           <w:lang w:eastAsia="x-none"/>
         </w:rPr>
-        <w:t xml:space="preserve">Модульное тестирование фокусируется на отдельных функциях и методах. Оно требует изоляции логики и независимости от внешних зависимостей. Для этого применяются </w:t>
-      </w:r>
-      <w:proofErr w:type="spellStart"/>
-      <w:r>
-        <w:rPr>
-          <w:lang w:eastAsia="x-none"/>
-        </w:rPr>
-        <w:t>моки</w:t>
-      </w:r>
-      <w:proofErr w:type="spellEnd"/>
-      <w:r>
-        <w:rPr>
-          <w:lang w:eastAsia="x-none"/>
-        </w:rPr>
-        <w:t xml:space="preserve">, заглушки и шпионы. Интеграционное тестирование обеспечивает связность компонентов. Оно особенно важно при использовании </w:t>
-      </w:r>
-      <w:proofErr w:type="spellStart"/>
-      <w:r>
-        <w:rPr>
-          <w:lang w:eastAsia="x-none"/>
-        </w:rPr>
-        <w:t>микросервисной</w:t>
-      </w:r>
-      <w:proofErr w:type="spellEnd"/>
-      <w:r>
-        <w:rPr>
-          <w:lang w:eastAsia="x-none"/>
-        </w:rPr>
-        <w:t xml:space="preserve"> архитектуры, где взаимодействие между сервисами может вызывать сложности, несмотря на корректную работу каждой части в отдельности.</w:t>
+        <w:t>Модульное тестирование фокусируется на отдельных функциях и методах. Оно требует изоляции логики и независимости от внешних зависимостей. Для этого применяются моки, заглушки и шпионы. Интеграционное тестирование обеспечивает связность компонентов. Оно особенно важно при использовании микросервисной архитектуры, где взаимодействие между сервисами может вызывать сложности, несмотря на корректную работу каждой части в отдельности.</w:t>
       </w:r>
     </w:p>
     <w:p>
@@ -4962,14 +5244,14 @@
       <w:pPr>
         <w:pStyle w:val="2"/>
       </w:pPr>
-      <w:bookmarkStart w:id="6" w:name="_Toc202400501"/>
+      <w:bookmarkStart w:id="7" w:name="_Toc202429546"/>
       <w:r>
         <w:t xml:space="preserve">1.3 </w:t>
       </w:r>
       <w:r>
         <w:t>Методологии и подходы к тестированию</w:t>
       </w:r>
-      <w:bookmarkEnd w:id="6"/>
+      <w:bookmarkEnd w:id="7"/>
     </w:p>
     <w:p>
       <w:pPr>
@@ -4996,21 +5278,7 @@
         <w:rPr>
           <w:lang w:eastAsia="x-none"/>
         </w:rPr>
-        <w:t>) моделях тестирован</w:t>
-      </w:r>
-      <w:proofErr w:type="spellStart"/>
-      <w:r>
-        <w:rPr>
-          <w:lang w:eastAsia="x-none"/>
-        </w:rPr>
-        <w:t>ие</w:t>
-      </w:r>
-      <w:proofErr w:type="spellEnd"/>
-      <w:r>
-        <w:rPr>
-          <w:lang w:eastAsia="x-none"/>
-        </w:rPr>
-        <w:t xml:space="preserve"> следует за разработкой. В гибких (</w:t>
+        <w:t>) моделях тестирование следует за разработкой. В гибких (</w:t>
       </w:r>
       <m:oMath>
         <m:r>
@@ -5170,14 +5438,14 @@
       <w:pPr>
         <w:pStyle w:val="2"/>
       </w:pPr>
-      <w:bookmarkStart w:id="7" w:name="_Toc202400502"/>
+      <w:bookmarkStart w:id="8" w:name="_Toc202429547"/>
       <w:r>
         <w:t xml:space="preserve">1.4 </w:t>
       </w:r>
       <w:r>
         <w:t>Инструменты и автоматизация тестирования</w:t>
       </w:r>
-      <w:bookmarkEnd w:id="7"/>
+      <w:bookmarkEnd w:id="8"/>
     </w:p>
     <w:p>
       <w:pPr>
@@ -5468,14 +5736,14 @@
       <w:pPr>
         <w:pStyle w:val="2"/>
       </w:pPr>
-      <w:bookmarkStart w:id="8" w:name="_Toc202400503"/>
+      <w:bookmarkStart w:id="9" w:name="_Toc202429548"/>
       <w:r>
         <w:t xml:space="preserve">1.5 </w:t>
       </w:r>
       <w:r>
         <w:t>Заключение</w:t>
       </w:r>
-      <w:bookmarkEnd w:id="8"/>
+      <w:bookmarkEnd w:id="9"/>
     </w:p>
     <w:p>
       <w:pPr>
@@ -5528,12 +5796,12 @@
         <w:ind w:firstLine="567"/>
         <w:jc w:val="left"/>
       </w:pPr>
-      <w:bookmarkStart w:id="9" w:name="_Toc202400504"/>
+      <w:bookmarkStart w:id="10" w:name="_Toc202429549"/>
       <w:r>
         <w:lastRenderedPageBreak/>
         <w:t>2 ПРОГРАММИРОВАНИЕ В ОБЪЕКТНО-ОРИЕНТИРОВАННОМ СТИЛЕ</w:t>
       </w:r>
-      <w:bookmarkEnd w:id="9"/>
+      <w:bookmarkEnd w:id="10"/>
     </w:p>
     <w:p>
       <w:pPr>
@@ -5552,7 +5820,7 @@
       <w:pPr>
         <w:pStyle w:val="2"/>
       </w:pPr>
-      <w:bookmarkStart w:id="10" w:name="_Toc202400505"/>
+      <w:bookmarkStart w:id="11" w:name="_Toc202429550"/>
       <w:r>
         <w:t xml:space="preserve">2.1 </w:t>
       </w:r>
@@ -5574,7 +5842,7 @@
       <w:r>
         <w:t xml:space="preserve"> работы</w:t>
       </w:r>
-      <w:bookmarkEnd w:id="10"/>
+      <w:bookmarkEnd w:id="11"/>
     </w:p>
     <w:p>
       <w:pPr>
@@ -6329,12 +6597,12 @@
       <w:pPr>
         <w:pStyle w:val="2"/>
       </w:pPr>
-      <w:bookmarkStart w:id="11" w:name="_Toc202400506"/>
+      <w:bookmarkStart w:id="12" w:name="_Toc202429551"/>
       <w:r>
         <w:lastRenderedPageBreak/>
         <w:t>2.2 Вывод по разработке приложения</w:t>
       </w:r>
-      <w:bookmarkEnd w:id="11"/>
+      <w:bookmarkEnd w:id="12"/>
     </w:p>
     <w:p>
       <w:pPr>
@@ -6608,21 +6876,7 @@
         <w:rPr>
           <w:lang w:eastAsia="x-none"/>
         </w:rPr>
-        <w:t xml:space="preserve"> для </w:t>
-      </w:r>
-      <w:proofErr w:type="spellStart"/>
-      <w:r>
-        <w:rPr>
-          <w:lang w:eastAsia="x-none"/>
-        </w:rPr>
-        <w:t>переиспользования</w:t>
-      </w:r>
-      <w:proofErr w:type="spellEnd"/>
-      <w:r>
-        <w:rPr>
-          <w:lang w:eastAsia="x-none"/>
-        </w:rPr>
-        <w:t xml:space="preserve"> общей логики,</w:t>
+        <w:t xml:space="preserve"> для переиспользования общей логики,</w:t>
       </w:r>
     </w:p>
     <w:p>
@@ -6760,6 +7014,27 @@
         </w:rPr>
         <w:t>Такой подход делает код удобным для сопровождения и расширения. В будущем можно легко добавить новые типы транспортных средств или новые критерии фильтрации, не нарушая архитектуру программы.</w:t>
       </w:r>
+    </w:p>
+    <w:p>
+      <w:pPr>
+        <w:rPr>
+          <w:lang w:eastAsia="x-none"/>
+        </w:rPr>
+      </w:pPr>
+      <w:r>
+        <w:rPr>
+          <w:lang w:eastAsia="x-none"/>
+        </w:rPr>
+        <w:t>Я научился разрабатывать модели компонентов информационных систем, включая модели баз данных, и модели интерфейсов «человек – электронно-вычислительная машина».</w:t>
+      </w:r>
+    </w:p>
+    <w:p>
+      <w:pPr>
+        <w:ind w:firstLine="0"/>
+        <w:rPr>
+          <w:lang w:eastAsia="x-none"/>
+        </w:rPr>
+      </w:pPr>
       <w:r>
         <w:rPr>
           <w:lang w:eastAsia="x-none"/>
@@ -6773,12 +7048,12 @@
         <w:ind w:firstLine="567"/>
         <w:jc w:val="left"/>
       </w:pPr>
-      <w:bookmarkStart w:id="12" w:name="_Toc202400507"/>
+      <w:bookmarkStart w:id="13" w:name="_Toc202429552"/>
       <w:r>
         <w:lastRenderedPageBreak/>
         <w:t>3 РЕШЕНИЕ ЗАДАЧ ПО АНАЛИЗУ ДАННЫХ</w:t>
       </w:r>
-      <w:bookmarkEnd w:id="12"/>
+      <w:bookmarkEnd w:id="13"/>
     </w:p>
     <w:p>
       <w:pPr>
@@ -6790,25 +7065,237 @@
         <w:rPr>
           <w:lang w:eastAsia="x-none"/>
         </w:rPr>
-        <w:t xml:space="preserve">Задача: Считайте в переменную </w:t>
-      </w:r>
-      <w:r>
-        <w:rPr>
-          <w:lang w:val="en-US" w:eastAsia="x-none"/>
-        </w:rPr>
-        <w:t>transactions</w:t>
-      </w:r>
-      <w:r>
-        <w:rPr>
-          <w:lang w:eastAsia="x-none"/>
-        </w:rPr>
-        <w:t xml:space="preserve"> </w:t>
-      </w:r>
-      <w:r>
-        <w:rPr>
-          <w:lang w:eastAsia="x-none"/>
-        </w:rPr>
-        <w:t xml:space="preserve">одноименную таблицу. Из всех типов транзакций оставьте только траты (отрицательные суммы по столбцу </w:t>
+        <w:t xml:space="preserve">Задача: </w:t>
+      </w:r>
+      <w:r>
+        <w:rPr>
+          <w:lang w:eastAsia="x-none"/>
+        </w:rPr>
+        <w:t xml:space="preserve">Считайте в переменные </w:t>
+      </w:r>
+      <m:oMath>
+        <m:r>
+          <w:rPr>
+            <w:rFonts w:ascii="Cambria Math" w:hAnsi="Cambria Math"/>
+            <w:lang w:eastAsia="x-none"/>
+          </w:rPr>
+          <m:t>tr_mcc_codes</m:t>
+        </m:r>
+      </m:oMath>
+      <w:r>
+        <w:rPr>
+          <w:lang w:eastAsia="x-none"/>
+        </w:rPr>
+        <w:t xml:space="preserve">, </w:t>
+      </w:r>
+      <m:oMath>
+        <m:r>
+          <w:rPr>
+            <w:rFonts w:ascii="Cambria Math" w:hAnsi="Cambria Math"/>
+            <w:lang w:eastAsia="x-none"/>
+          </w:rPr>
+          <m:t>tr_types</m:t>
+        </m:r>
+      </m:oMath>
+      <w:r>
+        <w:rPr>
+          <w:lang w:eastAsia="x-none"/>
+        </w:rPr>
+        <w:t xml:space="preserve">, </w:t>
+      </w:r>
+      <m:oMath>
+        <m:r>
+          <w:rPr>
+            <w:rFonts w:ascii="Cambria Math" w:hAnsi="Cambria Math"/>
+            <w:lang w:eastAsia="x-none"/>
+          </w:rPr>
+          <m:t>transactions</m:t>
+        </m:r>
+      </m:oMath>
+      <w:r>
+        <w:rPr>
+          <w:lang w:eastAsia="x-none"/>
+        </w:rPr>
+        <w:t xml:space="preserve"> и </w:t>
+      </w:r>
+      <m:oMath>
+        <m:r>
+          <w:rPr>
+            <w:rFonts w:ascii="Cambria Math" w:hAnsi="Cambria Math"/>
+            <w:lang w:eastAsia="x-none"/>
+          </w:rPr>
+          <m:t>customers_gender_train</m:t>
+        </m:r>
+      </m:oMath>
+      <w:r>
+        <w:rPr>
+          <w:lang w:eastAsia="x-none"/>
+        </w:rPr>
+        <w:t xml:space="preserve"> из одноимённых таблиц из папки </w:t>
+      </w:r>
+      <m:oMath>
+        <m:r>
+          <w:rPr>
+            <w:rFonts w:ascii="Cambria Math" w:hAnsi="Cambria Math"/>
+            <w:lang w:eastAsia="x-none"/>
+          </w:rPr>
+          <m:t>data</m:t>
+        </m:r>
+      </m:oMath>
+      <w:r>
+        <w:rPr>
+          <w:lang w:eastAsia="x-none"/>
+        </w:rPr>
+        <w:t xml:space="preserve">. В </w:t>
+      </w:r>
+      <m:oMath>
+        <m:r>
+          <w:rPr>
+            <w:rFonts w:ascii="Cambria Math" w:hAnsi="Cambria Math"/>
+            <w:lang w:eastAsia="x-none"/>
+          </w:rPr>
+          <m:t>transactions</m:t>
+        </m:r>
+      </m:oMath>
+      <w:r>
+        <w:rPr>
+          <w:lang w:eastAsia="x-none"/>
+        </w:rPr>
+        <w:t xml:space="preserve"> считайте только первые 1000000 строк. Соедините </w:t>
+      </w:r>
+      <m:oMath>
+        <m:r>
+          <w:rPr>
+            <w:rFonts w:ascii="Cambria Math" w:hAnsi="Cambria Math"/>
+            <w:lang w:eastAsia="x-none"/>
+          </w:rPr>
+          <m:t>transactions</m:t>
+        </m:r>
+      </m:oMath>
+      <w:r>
+        <w:rPr>
+          <w:lang w:eastAsia="x-none"/>
+        </w:rPr>
+        <w:t xml:space="preserve"> со всеми остальными таблицами (</w:t>
+      </w:r>
+      <m:oMath>
+        <m:r>
+          <w:rPr>
+            <w:rFonts w:ascii="Cambria Math" w:hAnsi="Cambria Math"/>
+            <w:lang w:eastAsia="x-none"/>
+          </w:rPr>
+          <m:t>tr_mcc_codes</m:t>
+        </m:r>
+      </m:oMath>
+      <w:r>
+        <w:rPr>
+          <w:lang w:eastAsia="x-none"/>
+        </w:rPr>
+        <w:t xml:space="preserve">, </w:t>
+      </w:r>
+      <m:oMath>
+        <m:r>
+          <w:rPr>
+            <w:rFonts w:ascii="Cambria Math" w:hAnsi="Cambria Math"/>
+            <w:lang w:eastAsia="x-none"/>
+          </w:rPr>
+          <m:t>tr_types</m:t>
+        </m:r>
+      </m:oMath>
+      <w:r>
+        <w:rPr>
+          <w:lang w:eastAsia="x-none"/>
+        </w:rPr>
+        <w:t xml:space="preserve">, </w:t>
+      </w:r>
+      <m:oMath>
+        <m:r>
+          <w:rPr>
+            <w:rFonts w:ascii="Cambria Math" w:hAnsi="Cambria Math"/>
+            <w:lang w:eastAsia="x-none"/>
+          </w:rPr>
+          <m:t>gender_train</m:t>
+        </m:r>
+      </m:oMath>
+      <w:r>
+        <w:rPr>
+          <w:lang w:eastAsia="x-none"/>
+        </w:rPr>
+        <w:t xml:space="preserve">). Причём с </w:t>
+      </w:r>
+      <m:oMath>
+        <m:r>
+          <w:rPr>
+            <w:rFonts w:ascii="Cambria Math" w:hAnsi="Cambria Math"/>
+            <w:lang w:eastAsia="x-none"/>
+          </w:rPr>
+          <m:t>customers_gender_train</m:t>
+        </m:r>
+      </m:oMath>
+      <w:r>
+        <w:rPr>
+          <w:lang w:eastAsia="x-none"/>
+        </w:rPr>
+        <w:t xml:space="preserve"> необходимо смёрджиться с помощью </w:t>
+      </w:r>
+      <m:oMath>
+        <m:r>
+          <w:rPr>
+            <w:rFonts w:ascii="Cambria Math" w:hAnsi="Cambria Math"/>
+            <w:lang w:eastAsia="x-none"/>
+          </w:rPr>
+          <m:t>left</m:t>
+        </m:r>
+        <m:r>
+          <w:rPr>
+            <w:rFonts w:ascii="Cambria Math" w:hAnsi="Cambria Math"/>
+            <w:lang w:eastAsia="x-none"/>
+          </w:rPr>
+          <m:t xml:space="preserve"> </m:t>
+        </m:r>
+        <m:r>
+          <w:rPr>
+            <w:rFonts w:ascii="Cambria Math" w:hAnsi="Cambria Math"/>
+            <w:lang w:eastAsia="x-none"/>
+          </w:rPr>
+          <m:t>join</m:t>
+        </m:r>
+      </m:oMath>
+      <w:r>
+        <w:rPr>
+          <w:lang w:eastAsia="x-none"/>
+        </w:rPr>
+        <w:t xml:space="preserve">, а с оставшимися датафреймами – через </w:t>
+      </w:r>
+      <m:oMath>
+        <m:r>
+          <w:rPr>
+            <w:rFonts w:ascii="Cambria Math" w:hAnsi="Cambria Math"/>
+            <w:lang w:eastAsia="x-none"/>
+          </w:rPr>
+          <m:t>inner</m:t>
+        </m:r>
+      </m:oMath>
+      <w:r>
+        <w:rPr>
+          <w:lang w:eastAsia="x-none"/>
+        </w:rPr>
+        <w:t xml:space="preserve"> (в результате соединения датафреймов должно получиться </w:t>
+      </w:r>
+      <m:oMath>
+        <m:r>
+          <w:rPr>
+            <w:rFonts w:ascii="Cambria Math" w:hAnsi="Cambria Math"/>
+            <w:lang w:eastAsia="x-none"/>
+          </w:rPr>
+          <m:t>999584</m:t>
+        </m:r>
+      </m:oMath>
+      <w:r>
+        <w:rPr>
+          <w:lang w:eastAsia="x-none"/>
+        </w:rPr>
+        <w:t xml:space="preserve"> строки). Определите модуль разницы между средними тратами женщин и мужчин (трата – отрицательное значение </w:t>
       </w:r>
       <m:oMath>
         <m:r>
@@ -6823,6 +7310,70 @@
         <w:rPr>
           <w:lang w:eastAsia="x-none"/>
         </w:rPr>
+        <w:t>). Выведите ответ в виде вещественного числа, округлённого до двух знаков после запятой, отделив дробную часть точкой в формате "</w:t>
+      </w:r>
+      <m:oMath>
+        <m:r>
+          <w:rPr>
+            <w:rFonts w:ascii="Cambria Math" w:hAnsi="Cambria Math"/>
+            <w:lang w:eastAsia="x-none"/>
+          </w:rPr>
+          <m:t>123.45</m:t>
+        </m:r>
+      </m:oMath>
+      <w:r>
+        <w:rPr>
+          <w:lang w:eastAsia="x-none"/>
+        </w:rPr>
+        <w:t xml:space="preserve">". Создайте новый столбец – </w:t>
+      </w:r>
+      <m:oMath>
+        <m:r>
+          <w:rPr>
+            <w:rFonts w:ascii="Cambria Math" w:hAnsi="Cambria Math"/>
+            <w:lang w:eastAsia="x-none"/>
+          </w:rPr>
+          <m:t>mcc_code+tr_type</m:t>
+        </m:r>
+      </m:oMath>
+      <w:r>
+        <w:rPr>
+          <w:lang w:eastAsia="x-none"/>
+        </w:rPr>
+        <w:t>, сложив значения из соответствующих столбцов.</w:t>
+      </w:r>
+    </w:p>
+    <w:p>
+      <w:pPr>
+        <w:rPr>
+          <w:lang w:eastAsia="x-none"/>
+        </w:rPr>
+      </w:pPr>
+      <w:r>
+        <w:rPr>
+          <w:lang w:eastAsia="x-none"/>
+        </w:rPr>
+        <w:t>Из</w:t>
+      </w:r>
+      <w:r>
+        <w:rPr>
+          <w:lang w:eastAsia="x-none"/>
+        </w:rPr>
+        <w:t xml:space="preserve"> всех типов транзакций оставьте только траты (отрицательные суммы по столбцу </w:t>
+      </w:r>
+      <m:oMath>
+        <m:r>
+          <w:rPr>
+            <w:rFonts w:ascii="Cambria Math" w:hAnsi="Cambria Math"/>
+            <w:lang w:eastAsia="x-none"/>
+          </w:rPr>
+          <m:t>amount</m:t>
+        </m:r>
+      </m:oMath>
+      <w:r>
+        <w:rPr>
+          <w:lang w:eastAsia="x-none"/>
+        </w:rPr>
         <w:t xml:space="preserve">). Выделите из поля </w:t>
       </w:r>
       <m:oMath>
@@ -6898,21 +7449,7 @@
         <w:rPr>
           <w:lang w:eastAsia="x-none"/>
         </w:rPr>
-        <w:t xml:space="preserve"> все MCC коды, которые встретились в выборке более чем 60000 раз. Сгруппируйте отфильтрованный </w:t>
-      </w:r>
-      <w:proofErr w:type="spellStart"/>
-      <w:r>
-        <w:rPr>
-          <w:lang w:eastAsia="x-none"/>
-        </w:rPr>
-        <w:t>датафрейм</w:t>
-      </w:r>
-      <w:proofErr w:type="spellEnd"/>
-      <w:r>
-        <w:rPr>
-          <w:lang w:eastAsia="x-none"/>
-        </w:rPr>
-        <w:t xml:space="preserve"> по дню и MCC-коду, получая средние значения суммы </w:t>
+        <w:t xml:space="preserve"> все MCC коды, которые встретились в выборке более чем 60000 раз. Сгруппируйте отфильтрованный датафрейм по дню и MCC-коду, получая средние значения суммы </w:t>
       </w:r>
       <m:oMath>
         <m:r>
@@ -6942,79 +7479,22 @@
         <w:rPr>
           <w:lang w:eastAsia="x-none"/>
         </w:rPr>
-        <w:t xml:space="preserve">) по каждому из MCC-кодов по дням. Проверьте верно ли, что 2 из полученных MCC-кодов связаны с финансовыми институтами. </w:t>
+        <w:t>) по каждому из MCC-кодов по дням. Проверьте верно ли, что 2 из полученных MCC-кодов связаны с финансовыми институтами.</w:t>
       </w:r>
     </w:p>
     <w:p>
       <w:pPr>
-        <w:rPr>
-          <w:lang w:eastAsia="x-none"/>
-        </w:rPr>
-      </w:pPr>
-      <w:r>
-        <w:rPr>
-          <w:lang w:eastAsia="x-none"/>
-        </w:rPr>
-        <w:t xml:space="preserve">Пояснение: Для того, чтобы выделить всё, что стоит до первого пробела, можно использовать строковые методы для </w:t>
-      </w:r>
-      <w:proofErr w:type="spellStart"/>
-      <w:r>
-        <w:rPr>
-          <w:lang w:eastAsia="x-none"/>
-        </w:rPr>
-        <w:t>датафрейма</w:t>
-      </w:r>
-      <w:proofErr w:type="spellEnd"/>
-      <w:r>
-        <w:rPr>
-          <w:lang w:eastAsia="x-none"/>
-        </w:rPr>
-        <w:t xml:space="preserve"> - </w:t>
-      </w:r>
-      <m:oMath>
-        <m:r>
-          <w:rPr>
-            <w:rFonts w:ascii="Cambria Math" w:hAnsi="Cambria Math"/>
-            <w:lang w:eastAsia="x-none"/>
-          </w:rPr>
-          <m:t>.str.split()</m:t>
-        </m:r>
-      </m:oMath>
-      <w:r>
-        <w:rPr>
-          <w:lang w:eastAsia="x-none"/>
-        </w:rPr>
-        <w:t xml:space="preserve">, например. Либо же реализовывать логику выделения подстроки с помощью метода </w:t>
-      </w:r>
-      <m:oMath>
-        <m:r>
-          <w:rPr>
-            <w:rFonts w:ascii="Cambria Math" w:hAnsi="Cambria Math"/>
-            <w:lang w:eastAsia="x-none"/>
-          </w:rPr>
-          <m:t>apply</m:t>
-        </m:r>
-      </m:oMath>
-      <w:r>
-        <w:rPr>
-          <w:lang w:eastAsia="x-none"/>
-        </w:rPr>
-        <w:t>.</w:t>
-      </w:r>
+        <w:pStyle w:val="2"/>
+      </w:pPr>
+      <w:bookmarkStart w:id="14" w:name="_Toc202429553"/>
+      <w:r>
+        <w:lastRenderedPageBreak/>
+        <w:t>3.1 Описание хода выполнения работы</w:t>
+      </w:r>
+      <w:bookmarkEnd w:id="14"/>
     </w:p>
     <w:p>
       <w:pPr>
-        <w:pStyle w:val="2"/>
-      </w:pPr>
-      <w:bookmarkStart w:id="13" w:name="_Toc202400508"/>
-      <w:r>
-        <w:lastRenderedPageBreak/>
-        <w:t>3.1 Описание хода выполнения работы</w:t>
-      </w:r>
-      <w:bookmarkEnd w:id="13"/>
-    </w:p>
-    <w:p>
-      <w:pPr>
         <w:keepNext/>
         <w:jc w:val="center"/>
       </w:pPr>
@@ -7023,10 +7503,10 @@
           <w:noProof/>
         </w:rPr>
         <w:drawing>
-          <wp:inline distT="0" distB="0" distL="0" distR="0" wp14:anchorId="391D0073" wp14:editId="4BE1A120">
-            <wp:extent cx="6121400" cy="5487035"/>
-            <wp:effectExtent l="0" t="0" r="0" b="0"/>
-            <wp:docPr id="27" name="Рисунок 27"/>
+          <wp:inline distT="0" distB="0" distL="0" distR="0" wp14:anchorId="5CC0F71B" wp14:editId="6FF79F1B">
+            <wp:extent cx="6121400" cy="3632835"/>
+            <wp:effectExtent l="0" t="0" r="0" b="5715"/>
+            <wp:docPr id="2" name="Рисунок 2"/>
             <wp:cNvGraphicFramePr>
               <a:graphicFrameLocks xmlns:a="http://schemas.openxmlformats.org/drawingml/2006/main" noChangeAspect="1"/>
             </wp:cNvGraphicFramePr>
@@ -7046,7 +7526,7 @@
                   <pic:spPr>
                     <a:xfrm>
                       <a:off x="0" y="0"/>
-                      <a:ext cx="6121400" cy="5487035"/>
+                      <a:ext cx="6121400" cy="3632835"/>
                     </a:xfrm>
                     <a:prstGeom prst="rect">
                       <a:avLst/>
@@ -7062,9 +7542,6 @@
     <w:p>
       <w:pPr>
         <w:pStyle w:val="afe"/>
-        <w:rPr>
-          <w:lang w:val="x-none" w:eastAsia="x-none"/>
-        </w:rPr>
       </w:pPr>
       <w:r>
         <w:t xml:space="preserve">Рисунок </w:t>
@@ -7088,49 +7565,146 @@
         <w:fldChar w:fldCharType="end"/>
       </w:r>
       <w:r>
-        <w:t xml:space="preserve"> – код с анализом данных.</w:t>
+        <w:t xml:space="preserve"> – нахождения </w:t>
+      </w:r>
+      <w:r>
+        <w:rPr>
+          <w:lang w:eastAsia="x-none"/>
+        </w:rPr>
+        <w:t>модул</w:t>
+      </w:r>
+      <w:r>
+        <w:rPr>
+          <w:lang w:eastAsia="x-none"/>
+        </w:rPr>
+        <w:t>я</w:t>
+      </w:r>
+      <w:r>
+        <w:rPr>
+          <w:lang w:eastAsia="x-none"/>
+        </w:rPr>
+        <w:t xml:space="preserve"> разницы между средними тратами женщин и мужчин</w:t>
+      </w:r>
+      <w:r>
+        <w:rPr>
+          <w:lang w:eastAsia="x-none"/>
+        </w:rPr>
+        <w:t>.</w:t>
       </w:r>
     </w:p>
     <w:p>
-      <w:pPr>
-        <w:rPr>
-          <w:lang w:eastAsia="x-none"/>
-        </w:rPr>
-      </w:pPr>
-      <w:r>
-        <w:rPr>
-          <w:lang w:eastAsia="x-none"/>
-        </w:rPr>
-        <w:t xml:space="preserve">На рисунке 6 показан процесс анализа </w:t>
-      </w:r>
-      <w:r>
-        <w:rPr>
-          <w:lang w:eastAsia="x-none"/>
-        </w:rPr>
-        <w:t>данных таблицы транзакций. Мы оставляем только отрицательные транзакции, выводим для отладки первые 10 строк. Затем выделяем день в отдельный столбец и присоединяем его справа, также делаем отладочный вывод. Находим самые популярные коды транзакций и выводим их. Затем создаём таблицу</w:t>
-      </w:r>
-      <w:r>
-        <w:rPr>
-          <w:lang w:eastAsia="x-none"/>
-        </w:rPr>
-        <w:t>,</w:t>
-      </w:r>
-      <w:r>
-        <w:rPr>
-          <w:lang w:eastAsia="x-none"/>
-        </w:rPr>
-        <w:t xml:space="preserve"> где каждому коду транзакции и каждому дню соответствует количество использований этого кода в этот день.</w:t>
-      </w:r>
-      <w:r>
-        <w:rPr>
-          <w:lang w:eastAsia="x-none"/>
-        </w:rPr>
-        <w:t xml:space="preserve"> Формируем график на основе нашей таблицы и показываем его. В конце проверяем, сколько среди самых используемых кодов принадлежит к финансовым институтам.</w:t>
+      <w:r>
+        <w:t>На рисунке 7 показано считывание четырёх таблиц</w:t>
+      </w:r>
+      <w:r>
+        <w:t xml:space="preserve"> и</w:t>
+      </w:r>
+      <w:r>
+        <w:t xml:space="preserve"> соединение их в одну различными методами. </w:t>
+      </w:r>
+      <w:r>
+        <w:t>После соединения из таблицы</w:t>
+      </w:r>
+      <w:r>
+        <w:t xml:space="preserve"> отсеива</w:t>
+      </w:r>
+      <w:r>
+        <w:t>ются</w:t>
+      </w:r>
+      <w:r>
+        <w:t xml:space="preserve"> только отрицательны</w:t>
+      </w:r>
+      <w:r>
+        <w:t>е</w:t>
+      </w:r>
+      <w:r>
+        <w:t xml:space="preserve"> тра</w:t>
+      </w:r>
+      <w:r>
+        <w:t>ты</w:t>
+      </w:r>
+      <w:r>
+        <w:t xml:space="preserve">, </w:t>
+      </w:r>
+      <w:r>
+        <w:t>которые сортируются</w:t>
+      </w:r>
+      <w:r>
+        <w:t xml:space="preserve"> по гендеру</w:t>
+      </w:r>
+      <w:r>
+        <w:t>. Затем происходит п</w:t>
+      </w:r>
+      <w:r>
+        <w:t>одсчёт итого значения разницы средних трат между мужчинами и жен</w:t>
+      </w:r>
+      <w:r>
+        <w:t>щи</w:t>
+      </w:r>
+      <w:r>
+        <w:t>нами</w:t>
+      </w:r>
+      <w:r>
+        <w:t xml:space="preserve">, а также добавление новой колонки с объединенными значениями колонок </w:t>
+      </w:r>
+      <m:oMath>
+        <m:r>
+          <w:rPr>
+            <w:rFonts w:ascii="Cambria Math" w:hAnsi="Cambria Math"/>
+            <w:lang w:val="en-US"/>
+          </w:rPr>
+          <m:t>mcc</m:t>
+        </m:r>
+        <m:r>
+          <w:rPr>
+            <w:rFonts w:ascii="Cambria Math" w:hAnsi="Cambria Math"/>
+          </w:rPr>
+          <m:t>_</m:t>
+        </m:r>
+        <m:r>
+          <w:rPr>
+            <w:rFonts w:ascii="Cambria Math" w:hAnsi="Cambria Math"/>
+            <w:lang w:val="en-US"/>
+          </w:rPr>
+          <m:t>code</m:t>
+        </m:r>
+      </m:oMath>
+      <w:r>
+        <w:t xml:space="preserve"> </w:t>
+      </w:r>
+      <w:r>
+        <w:t xml:space="preserve">и </w:t>
+      </w:r>
+      <m:oMath>
+        <m:r>
+          <w:rPr>
+            <w:rFonts w:ascii="Cambria Math" w:hAnsi="Cambria Math"/>
+            <w:lang w:val="en-US"/>
+          </w:rPr>
+          <m:t>tr</m:t>
+        </m:r>
+        <m:r>
+          <w:rPr>
+            <w:rFonts w:ascii="Cambria Math" w:hAnsi="Cambria Math"/>
+          </w:rPr>
+          <m:t>_</m:t>
+        </m:r>
+        <m:r>
+          <w:rPr>
+            <w:rFonts w:ascii="Cambria Math" w:hAnsi="Cambria Math"/>
+            <w:lang w:val="en-US"/>
+          </w:rPr>
+          <m:t>type</m:t>
+        </m:r>
+      </m:oMath>
+      <w:r>
+        <w:t>.</w:t>
       </w:r>
     </w:p>
     <w:p>
       <w:pPr>
         <w:keepNext/>
+        <w:jc w:val="center"/>
       </w:pPr>
       <w:r>
         <w:rPr>
@@ -7138,10 +7712,10 @@
         </w:rPr>
         <w:lastRenderedPageBreak/>
         <w:drawing>
-          <wp:inline distT="0" distB="0" distL="0" distR="0" wp14:anchorId="7954E9FE" wp14:editId="0E079E3F">
-            <wp:extent cx="6121400" cy="3432175"/>
+          <wp:inline distT="0" distB="0" distL="0" distR="0" wp14:anchorId="391D0073" wp14:editId="4BE1A120">
+            <wp:extent cx="6121400" cy="5487035"/>
             <wp:effectExtent l="0" t="0" r="0" b="0"/>
-            <wp:docPr id="30" name="Рисунок 30"/>
+            <wp:docPr id="27" name="Рисунок 27"/>
             <wp:cNvGraphicFramePr>
               <a:graphicFrameLocks xmlns:a="http://schemas.openxmlformats.org/drawingml/2006/main" noChangeAspect="1"/>
             </wp:cNvGraphicFramePr>
@@ -7161,6 +7735,157 @@
                   <pic:spPr>
                     <a:xfrm>
                       <a:off x="0" y="0"/>
+                      <a:ext cx="6121400" cy="5487035"/>
+                    </a:xfrm>
+                    <a:prstGeom prst="rect">
+                      <a:avLst/>
+                    </a:prstGeom>
+                  </pic:spPr>
+                </pic:pic>
+              </a:graphicData>
+            </a:graphic>
+          </wp:inline>
+        </w:drawing>
+      </w:r>
+    </w:p>
+    <w:p>
+      <w:pPr>
+        <w:pStyle w:val="afe"/>
+        <w:rPr>
+          <w:lang w:val="x-none" w:eastAsia="x-none"/>
+        </w:rPr>
+      </w:pPr>
+      <w:r>
+        <w:t xml:space="preserve">Рисунок </w:t>
+      </w:r>
+      <w:r>
+        <w:fldChar w:fldCharType="begin"/>
+      </w:r>
+      <w:r>
+        <w:instrText xml:space="preserve"> SEQ Рисунок \* ARABIC </w:instrText>
+      </w:r>
+      <w:r>
+        <w:fldChar w:fldCharType="separate"/>
+      </w:r>
+      <w:r>
+        <w:rPr>
+          <w:noProof/>
+        </w:rPr>
+        <w:t>8</w:t>
+      </w:r>
+      <w:r>
+        <w:fldChar w:fldCharType="end"/>
+      </w:r>
+      <w:r>
+        <w:t xml:space="preserve"> – </w:t>
+      </w:r>
+      <w:r>
+        <w:t xml:space="preserve">нахождение </w:t>
+      </w:r>
+      <w:r>
+        <w:rPr>
+          <w:lang w:eastAsia="x-none"/>
+        </w:rPr>
+        <w:t>зависимост</w:t>
+      </w:r>
+      <w:r>
+        <w:rPr>
+          <w:lang w:eastAsia="x-none"/>
+        </w:rPr>
+        <w:t>и</w:t>
+      </w:r>
+      <w:r>
+        <w:rPr>
+          <w:lang w:eastAsia="x-none"/>
+        </w:rPr>
+        <w:t xml:space="preserve"> средних сумм по каждому из MCC-кодов по дням</w:t>
+      </w:r>
+      <w:r>
+        <w:t>.</w:t>
+      </w:r>
+    </w:p>
+    <w:p>
+      <w:pPr>
+        <w:rPr>
+          <w:lang w:eastAsia="x-none"/>
+        </w:rPr>
+      </w:pPr>
+      <w:r>
+        <w:rPr>
+          <w:lang w:eastAsia="x-none"/>
+        </w:rPr>
+        <w:t xml:space="preserve">На рисунке </w:t>
+      </w:r>
+      <w:r>
+        <w:rPr>
+          <w:lang w:eastAsia="x-none"/>
+        </w:rPr>
+        <w:t>8</w:t>
+      </w:r>
+      <w:r>
+        <w:rPr>
+          <w:lang w:eastAsia="x-none"/>
+        </w:rPr>
+        <w:t xml:space="preserve"> показан процесс анализа </w:t>
+      </w:r>
+      <w:r>
+        <w:rPr>
+          <w:lang w:eastAsia="x-none"/>
+        </w:rPr>
+        <w:t>данных таблицы транзакций. Мы оставляем только отрицательные транзакции, выводим для отладки первые 10 строк. Затем выделяем день в отдельный столбец и присоединяем его справа, также делаем отладочный вывод. Находим самые популярные коды транзакций и выводим их. Затем создаём таблицу</w:t>
+      </w:r>
+      <w:r>
+        <w:rPr>
+          <w:lang w:eastAsia="x-none"/>
+        </w:rPr>
+        <w:t>,</w:t>
+      </w:r>
+      <w:r>
+        <w:rPr>
+          <w:lang w:eastAsia="x-none"/>
+        </w:rPr>
+        <w:t xml:space="preserve"> где каждому коду транзакции и каждому дню соответствует количество использований этого кода в этот день.</w:t>
+      </w:r>
+      <w:r>
+        <w:rPr>
+          <w:lang w:eastAsia="x-none"/>
+        </w:rPr>
+        <w:t xml:space="preserve"> Формируем график на основе нашей таблицы и показываем его. В конце проверяем, сколько среди самых используемых кодов принадлежит к финансовым институтам.</w:t>
+      </w:r>
+    </w:p>
+    <w:p>
+      <w:pPr>
+        <w:keepNext/>
+      </w:pPr>
+      <w:r>
+        <w:rPr>
+          <w:noProof/>
+        </w:rPr>
+        <w:lastRenderedPageBreak/>
+        <w:drawing>
+          <wp:inline distT="0" distB="0" distL="0" distR="0" wp14:anchorId="7954E9FE" wp14:editId="0E079E3F">
+            <wp:extent cx="6121400" cy="3432175"/>
+            <wp:effectExtent l="0" t="0" r="0" b="0"/>
+            <wp:docPr id="30" name="Рисунок 30"/>
+            <wp:cNvGraphicFramePr>
+              <a:graphicFrameLocks xmlns:a="http://schemas.openxmlformats.org/drawingml/2006/main" noChangeAspect="1"/>
+            </wp:cNvGraphicFramePr>
+            <a:graphic xmlns:a="http://schemas.openxmlformats.org/drawingml/2006/main">
+              <a:graphicData uri="http://schemas.openxmlformats.org/drawingml/2006/picture">
+                <pic:pic xmlns:pic="http://schemas.openxmlformats.org/drawingml/2006/picture">
+                  <pic:nvPicPr>
+                    <pic:cNvPr id="1" name=""/>
+                    <pic:cNvPicPr/>
+                  </pic:nvPicPr>
+                  <pic:blipFill>
+                    <a:blip r:embed="rId22"/>
+                    <a:stretch>
+                      <a:fillRect/>
+                    </a:stretch>
+                  </pic:blipFill>
+                  <pic:spPr>
+                    <a:xfrm>
+                      <a:off x="0" y="0"/>
                       <a:ext cx="6121400" cy="3432175"/>
                     </a:xfrm>
                     <a:prstGeom prst="rect">
@@ -7197,7 +7922,7 @@
         <w:rPr>
           <w:noProof/>
         </w:rPr>
-        <w:t>8</w:t>
+        <w:t>9</w:t>
       </w:r>
       <w:r>
         <w:fldChar w:fldCharType="end"/>
@@ -7216,11 +7941,11 @@
       <w:pPr>
         <w:pStyle w:val="2"/>
       </w:pPr>
-      <w:bookmarkStart w:id="14" w:name="_Toc202400509"/>
+      <w:bookmarkStart w:id="15" w:name="_Toc202429554"/>
       <w:r>
         <w:t>3.2 Вывод по разработке приложения</w:t>
       </w:r>
-      <w:bookmarkEnd w:id="14"/>
+      <w:bookmarkEnd w:id="15"/>
     </w:p>
     <w:p>
       <w:pPr>
@@ -7327,12 +8052,12 @@
       <w:pPr>
         <w:pStyle w:val="1"/>
       </w:pPr>
-      <w:bookmarkStart w:id="15" w:name="_Toc202400510"/>
+      <w:bookmarkStart w:id="16" w:name="_Toc202429555"/>
       <w:r>
         <w:lastRenderedPageBreak/>
         <w:t>Заключение</w:t>
       </w:r>
-      <w:bookmarkEnd w:id="15"/>
+      <w:bookmarkEnd w:id="16"/>
     </w:p>
     <w:p>
       <w:pPr>
@@ -7383,12 +8108,12 @@
       <w:pPr>
         <w:pStyle w:val="1"/>
       </w:pPr>
-      <w:bookmarkStart w:id="16" w:name="_Toc202400511"/>
+      <w:bookmarkStart w:id="17" w:name="_Toc202429556"/>
       <w:r>
         <w:lastRenderedPageBreak/>
         <w:t>Список использованных источников</w:t>
       </w:r>
-      <w:bookmarkEnd w:id="16"/>
+      <w:bookmarkEnd w:id="17"/>
     </w:p>
     <w:p>
       <w:pPr>
@@ -7402,103 +8127,17 @@
           <w:lang w:val="en-US" w:eastAsia="x-none"/>
         </w:rPr>
       </w:pPr>
-      <w:proofErr w:type="spellStart"/>
-      <w:r>
-        <w:rPr>
-          <w:lang w:eastAsia="x-none"/>
-        </w:rPr>
-        <w:t>Канер</w:t>
-      </w:r>
-      <w:proofErr w:type="spellEnd"/>
-      <w:r>
-        <w:rPr>
-          <w:lang w:eastAsia="x-none"/>
-        </w:rPr>
-        <w:t xml:space="preserve"> С., Фолк Н., Нгуен Х. Тестирование программного обеспечения. </w:t>
-      </w:r>
-      <w:proofErr w:type="spellStart"/>
-      <w:r>
-        <w:rPr>
-          <w:lang w:val="en-US" w:eastAsia="x-none"/>
-        </w:rPr>
-        <w:t>Фундаментальные</w:t>
-      </w:r>
-      <w:proofErr w:type="spellEnd"/>
-      <w:r>
-        <w:rPr>
-          <w:lang w:val="en-US" w:eastAsia="x-none"/>
-        </w:rPr>
-        <w:t xml:space="preserve"> </w:t>
-      </w:r>
-      <w:proofErr w:type="spellStart"/>
-      <w:r>
-        <w:rPr>
-          <w:lang w:val="en-US" w:eastAsia="x-none"/>
-        </w:rPr>
-        <w:t>концепции</w:t>
-      </w:r>
-      <w:proofErr w:type="spellEnd"/>
-      <w:r>
-        <w:rPr>
-          <w:lang w:val="en-US" w:eastAsia="x-none"/>
-        </w:rPr>
-        <w:t xml:space="preserve">: </w:t>
-      </w:r>
-      <w:proofErr w:type="spellStart"/>
-      <w:r>
-        <w:rPr>
-          <w:lang w:val="en-US" w:eastAsia="x-none"/>
-        </w:rPr>
-        <w:t>пер</w:t>
-      </w:r>
-      <w:proofErr w:type="spellEnd"/>
-      <w:r>
-        <w:rPr>
-          <w:lang w:val="en-US" w:eastAsia="x-none"/>
-        </w:rPr>
-        <w:t xml:space="preserve">. с </w:t>
-      </w:r>
-      <w:proofErr w:type="spellStart"/>
-      <w:r>
-        <w:rPr>
-          <w:lang w:val="en-US" w:eastAsia="x-none"/>
-        </w:rPr>
-        <w:t>англ</w:t>
-      </w:r>
-      <w:proofErr w:type="spellEnd"/>
-      <w:r>
-        <w:rPr>
-          <w:lang w:val="en-US" w:eastAsia="x-none"/>
-        </w:rPr>
-        <w:t xml:space="preserve">. — </w:t>
-      </w:r>
-      <w:proofErr w:type="spellStart"/>
-      <w:r>
-        <w:rPr>
-          <w:lang w:val="en-US" w:eastAsia="x-none"/>
-        </w:rPr>
-        <w:t>Москва</w:t>
-      </w:r>
-      <w:proofErr w:type="spellEnd"/>
-      <w:r>
-        <w:rPr>
-          <w:lang w:val="en-US" w:eastAsia="x-none"/>
-        </w:rPr>
-        <w:t xml:space="preserve">: </w:t>
-      </w:r>
-      <w:proofErr w:type="spellStart"/>
-      <w:r>
-        <w:rPr>
-          <w:lang w:val="en-US" w:eastAsia="x-none"/>
-        </w:rPr>
-        <w:t>Вильямс</w:t>
-      </w:r>
-      <w:proofErr w:type="spellEnd"/>
-      <w:r>
-        <w:rPr>
-          <w:lang w:val="en-US" w:eastAsia="x-none"/>
-        </w:rPr>
-        <w:t>, 2003. — 560 с.</w:t>
+      <w:r>
+        <w:rPr>
+          <w:lang w:eastAsia="x-none"/>
+        </w:rPr>
+        <w:t xml:space="preserve">Канер С., Фолк Н., Нгуен Х. Тестирование программного обеспечения. </w:t>
+      </w:r>
+      <w:r>
+        <w:rPr>
+          <w:lang w:val="en-US" w:eastAsia="x-none"/>
+        </w:rPr>
+        <w:t>Фундаментальные концепции: пер. с англ. — Москва: Вильямс, 2003. — 560 с.</w:t>
       </w:r>
     </w:p>
     <w:p>
@@ -7536,21 +8175,7 @@
         <w:rPr>
           <w:lang w:val="en-US" w:eastAsia="x-none"/>
         </w:rPr>
-        <w:t xml:space="preserve">International Organization for Standardization. ISO/IEC/IEEE 29119: Software and Systems Engineering — Software Testing. — </w:t>
-      </w:r>
-      <w:proofErr w:type="spellStart"/>
-      <w:r>
-        <w:rPr>
-          <w:lang w:val="en-US" w:eastAsia="x-none"/>
-        </w:rPr>
-        <w:t>Женева</w:t>
-      </w:r>
-      <w:proofErr w:type="spellEnd"/>
-      <w:r>
-        <w:rPr>
-          <w:lang w:val="en-US" w:eastAsia="x-none"/>
-        </w:rPr>
-        <w:t>: ISO, 2013.</w:t>
+        <w:t>International Organization for Standardization. ISO/IEC/IEEE 29119: Software and Systems Engineering — Software Testing. — Женева: ISO, 2013.</w:t>
       </w:r>
     </w:p>
     <w:p>
@@ -7569,119 +8194,7 @@
         <w:rPr>
           <w:lang w:val="en-US" w:eastAsia="x-none"/>
         </w:rPr>
-        <w:t xml:space="preserve">Python Software Foundation. Documentation for </w:t>
-      </w:r>
-      <w:proofErr w:type="spellStart"/>
-      <w:r>
-        <w:rPr>
-          <w:lang w:val="en-US" w:eastAsia="x-none"/>
-        </w:rPr>
-        <w:t>unittest</w:t>
-      </w:r>
-      <w:proofErr w:type="spellEnd"/>
-      <w:r>
-        <w:rPr>
-          <w:lang w:val="en-US" w:eastAsia="x-none"/>
-        </w:rPr>
-        <w:t xml:space="preserve">, </w:t>
-      </w:r>
-      <w:proofErr w:type="spellStart"/>
-      <w:r>
-        <w:rPr>
-          <w:lang w:val="en-US" w:eastAsia="x-none"/>
-        </w:rPr>
-        <w:t>pytest</w:t>
-      </w:r>
-      <w:proofErr w:type="spellEnd"/>
-      <w:r>
-        <w:rPr>
-          <w:lang w:val="en-US" w:eastAsia="x-none"/>
-        </w:rPr>
-        <w:t>, coverage. — [</w:t>
-      </w:r>
-      <w:proofErr w:type="spellStart"/>
-      <w:r>
-        <w:rPr>
-          <w:lang w:val="en-US" w:eastAsia="x-none"/>
-        </w:rPr>
-        <w:t>Электронный</w:t>
-      </w:r>
-      <w:proofErr w:type="spellEnd"/>
-      <w:r>
-        <w:rPr>
-          <w:lang w:val="en-US" w:eastAsia="x-none"/>
-        </w:rPr>
-        <w:t xml:space="preserve"> </w:t>
-      </w:r>
-      <w:proofErr w:type="spellStart"/>
-      <w:r>
-        <w:rPr>
-          <w:lang w:val="en-US" w:eastAsia="x-none"/>
-        </w:rPr>
-        <w:t>ресурс</w:t>
-      </w:r>
-      <w:proofErr w:type="spellEnd"/>
-      <w:r>
-        <w:rPr>
-          <w:lang w:val="en-US" w:eastAsia="x-none"/>
-        </w:rPr>
-        <w:t xml:space="preserve">]. — </w:t>
-      </w:r>
-      <w:proofErr w:type="spellStart"/>
-      <w:r>
-        <w:rPr>
-          <w:lang w:val="en-US" w:eastAsia="x-none"/>
-        </w:rPr>
-        <w:t>Режим</w:t>
-      </w:r>
-      <w:proofErr w:type="spellEnd"/>
-      <w:r>
-        <w:rPr>
-          <w:lang w:val="en-US" w:eastAsia="x-none"/>
-        </w:rPr>
-        <w:t xml:space="preserve"> </w:t>
-      </w:r>
-      <w:proofErr w:type="spellStart"/>
-      <w:r>
-        <w:rPr>
-          <w:lang w:val="en-US" w:eastAsia="x-none"/>
-        </w:rPr>
-        <w:t>доступа</w:t>
-      </w:r>
-      <w:proofErr w:type="spellEnd"/>
-      <w:r>
-        <w:rPr>
-          <w:lang w:val="en-US" w:eastAsia="x-none"/>
-        </w:rPr>
-        <w:t>: https://docs.python.org, https://docs.pytest.org, https://coverage.readthedocs.io (</w:t>
-      </w:r>
-      <w:proofErr w:type="spellStart"/>
-      <w:r>
-        <w:rPr>
-          <w:lang w:val="en-US" w:eastAsia="x-none"/>
-        </w:rPr>
-        <w:t>дата</w:t>
-      </w:r>
-      <w:proofErr w:type="spellEnd"/>
-      <w:r>
-        <w:rPr>
-          <w:lang w:val="en-US" w:eastAsia="x-none"/>
-        </w:rPr>
-        <w:t xml:space="preserve"> </w:t>
-      </w:r>
-      <w:proofErr w:type="spellStart"/>
-      <w:r>
-        <w:rPr>
-          <w:lang w:val="en-US" w:eastAsia="x-none"/>
-        </w:rPr>
-        <w:t>обращения</w:t>
-      </w:r>
-      <w:proofErr w:type="spellEnd"/>
-      <w:r>
-        <w:rPr>
-          <w:lang w:val="en-US" w:eastAsia="x-none"/>
-        </w:rPr>
-        <w:t>: 01.07.2025).</w:t>
+        <w:t>Python Software Foundation. Documentation for unittest, pytest, coverage. — [Электронный ресурс]. — Режим доступа: https://docs.python.org, https://docs.pytest.org, https://coverage.readthedocs.io (дата обращения: 01.07.2025).</w:t>
       </w:r>
     </w:p>
     <w:p>
@@ -7759,9 +8272,1385 @@
         </w:rPr>
         <w:t>Cohn M. Succeeding with Agile: Software Development Using Scrum. — Addison-Wesley, 2009. — 504 p.</w:t>
       </w:r>
+      <w:r>
+        <w:rPr>
+          <w:lang w:val="en-US" w:eastAsia="x-none"/>
+        </w:rPr>
+        <w:br w:type="page"/>
+      </w:r>
+    </w:p>
+    <w:p>
+      <w:pPr>
+        <w:pStyle w:val="1"/>
+      </w:pPr>
+      <w:bookmarkStart w:id="18" w:name="_Toc202429557"/>
+      <w:r>
+        <w:lastRenderedPageBreak/>
+        <w:t>Приложение</w:t>
+      </w:r>
+      <w:bookmarkEnd w:id="18"/>
+      <w:r>
+        <w:t xml:space="preserve"> А</w:t>
+      </w:r>
+    </w:p>
+    <w:p>
+      <w:pPr>
+        <w:pStyle w:val="2"/>
+      </w:pPr>
+      <w:bookmarkStart w:id="19" w:name="_Toc202429558"/>
+      <w:r>
+        <w:t>1. Код объектно-ориентированного приложения</w:t>
+      </w:r>
+      <w:bookmarkEnd w:id="19"/>
+    </w:p>
+    <w:p>
+      <w:pPr>
+        <w:ind w:firstLine="0"/>
+        <w:rPr>
+          <w:lang w:val="en-US" w:eastAsia="x-none"/>
+        </w:rPr>
+      </w:pPr>
+      <w:r>
+        <w:rPr>
+          <w:lang w:val="en-US" w:eastAsia="x-none"/>
+        </w:rPr>
+        <w:t>class Car:</w:t>
+      </w:r>
+      <w:r>
+        <w:rPr>
+          <w:lang w:val="en-US" w:eastAsia="x-none"/>
+        </w:rPr>
+        <w:br/>
+        <w:t xml:space="preserve">    def __init__(self, brand, model, year):</w:t>
+      </w:r>
+      <w:r>
+        <w:rPr>
+          <w:lang w:val="en-US" w:eastAsia="x-none"/>
+        </w:rPr>
+        <w:br/>
+        <w:t xml:space="preserve">       self.brand = brand</w:t>
+      </w:r>
+      <w:r>
+        <w:rPr>
+          <w:lang w:val="en-US" w:eastAsia="x-none"/>
+        </w:rPr>
+        <w:br/>
+        <w:t xml:space="preserve">       self.model = model</w:t>
+      </w:r>
+      <w:r>
+        <w:rPr>
+          <w:lang w:val="en-US" w:eastAsia="x-none"/>
+        </w:rPr>
+        <w:br/>
+        <w:t xml:space="preserve">       self.year = year</w:t>
+      </w:r>
+      <w:r>
+        <w:rPr>
+          <w:lang w:val="en-US" w:eastAsia="x-none"/>
+        </w:rPr>
+        <w:br/>
+      </w:r>
+      <w:r>
+        <w:rPr>
+          <w:lang w:val="en-US" w:eastAsia="x-none"/>
+        </w:rPr>
+        <w:br/>
+        <w:t xml:space="preserve">    def display_info(self):</w:t>
+      </w:r>
+      <w:r>
+        <w:rPr>
+          <w:lang w:val="en-US" w:eastAsia="x-none"/>
+        </w:rPr>
+        <w:br/>
+        <w:t xml:space="preserve">       info = f"Brand: {self.brand}, Model: {self.model}, Year: {self.year}"</w:t>
+      </w:r>
+      <w:r>
+        <w:rPr>
+          <w:lang w:val="en-US" w:eastAsia="x-none"/>
+        </w:rPr>
+        <w:br/>
+        <w:t xml:space="preserve">       return info</w:t>
+      </w:r>
+      <w:r>
+        <w:rPr>
+          <w:lang w:val="en-US" w:eastAsia="x-none"/>
+        </w:rPr>
+        <w:br/>
+      </w:r>
+      <w:r>
+        <w:rPr>
+          <w:lang w:val="en-US" w:eastAsia="x-none"/>
+        </w:rPr>
+        <w:br/>
+        <w:t xml:space="preserve">    def matches_conditions(self, **conditions):</w:t>
+      </w:r>
+      <w:r>
+        <w:rPr>
+          <w:lang w:val="en-US" w:eastAsia="x-none"/>
+        </w:rPr>
+        <w:br/>
+        <w:t xml:space="preserve">       matches = True</w:t>
+      </w:r>
+      <w:r>
+        <w:rPr>
+          <w:lang w:val="en-US" w:eastAsia="x-none"/>
+        </w:rPr>
+        <w:br/>
+        <w:t xml:space="preserve">       if 'brand' in conditions and conditions['brand'].lower() != self.brand.lower():</w:t>
+      </w:r>
+      <w:r>
+        <w:rPr>
+          <w:lang w:val="en-US" w:eastAsia="x-none"/>
+        </w:rPr>
+        <w:br/>
+        <w:t xml:space="preserve">          matches = False</w:t>
+      </w:r>
+      <w:r>
+        <w:rPr>
+          <w:lang w:val="en-US" w:eastAsia="x-none"/>
+        </w:rPr>
+        <w:br/>
+        <w:t xml:space="preserve">       if 'model' in conditions and conditions['model'].lower() != self.model.lower():</w:t>
+      </w:r>
+      <w:r>
+        <w:rPr>
+          <w:lang w:val="en-US" w:eastAsia="x-none"/>
+        </w:rPr>
+        <w:br/>
+        <w:t xml:space="preserve">          matches = False</w:t>
+      </w:r>
+      <w:r>
+        <w:rPr>
+          <w:lang w:val="en-US" w:eastAsia="x-none"/>
+        </w:rPr>
+        <w:br/>
+        <w:t xml:space="preserve">       if 'year' in conditions and conditions['year'] != self.year:</w:t>
+      </w:r>
+      <w:r>
+        <w:rPr>
+          <w:lang w:val="en-US" w:eastAsia="x-none"/>
+        </w:rPr>
+        <w:br/>
+        <w:t xml:space="preserve">          matches = False</w:t>
+      </w:r>
+      <w:r>
+        <w:rPr>
+          <w:lang w:val="en-US" w:eastAsia="x-none"/>
+        </w:rPr>
+        <w:br/>
+        <w:t xml:space="preserve">       return matches</w:t>
+      </w:r>
+      <w:r>
+        <w:rPr>
+          <w:lang w:val="en-US" w:eastAsia="x-none"/>
+        </w:rPr>
+        <w:br/>
+      </w:r>
+      <w:r>
+        <w:rPr>
+          <w:lang w:val="en-US" w:eastAsia="x-none"/>
+        </w:rPr>
+        <w:br/>
+      </w:r>
+      <w:r>
+        <w:rPr>
+          <w:lang w:val="en-US" w:eastAsia="x-none"/>
+        </w:rPr>
+        <w:br/>
+        <w:t>class PassengerCar(Car):</w:t>
+      </w:r>
+      <w:r>
+        <w:rPr>
+          <w:lang w:val="en-US" w:eastAsia="x-none"/>
+        </w:rPr>
+        <w:br/>
+        <w:t xml:space="preserve">    def __init__(self, brand, model, year, body_type):</w:t>
+      </w:r>
+      <w:r>
+        <w:rPr>
+          <w:lang w:val="en-US" w:eastAsia="x-none"/>
+        </w:rPr>
+        <w:br/>
+        <w:t xml:space="preserve">       super().__init__(brand, model, year)</w:t>
+      </w:r>
+      <w:r>
+        <w:rPr>
+          <w:lang w:val="en-US" w:eastAsia="x-none"/>
+        </w:rPr>
+        <w:br/>
+        <w:t xml:space="preserve">       self.body_type = body_type</w:t>
+      </w:r>
+      <w:r>
+        <w:rPr>
+          <w:lang w:val="en-US" w:eastAsia="x-none"/>
+        </w:rPr>
+        <w:br/>
+      </w:r>
+      <w:r>
+        <w:rPr>
+          <w:lang w:val="en-US" w:eastAsia="x-none"/>
+        </w:rPr>
+        <w:br/>
+        <w:t xml:space="preserve">    def display_info(self):</w:t>
+      </w:r>
+      <w:r>
+        <w:rPr>
+          <w:lang w:val="en-US" w:eastAsia="x-none"/>
+        </w:rPr>
+        <w:br/>
+        <w:t xml:space="preserve">       base_info = super().display_info()</w:t>
+      </w:r>
+      <w:r>
+        <w:rPr>
+          <w:lang w:val="en-US" w:eastAsia="x-none"/>
+        </w:rPr>
+        <w:br/>
+        <w:t xml:space="preserve">       return f"{base_info}, Body Type: {self.body_type}"</w:t>
+      </w:r>
+      <w:r>
+        <w:rPr>
+          <w:lang w:val="en-US" w:eastAsia="x-none"/>
+        </w:rPr>
+        <w:br/>
+      </w:r>
+      <w:r>
+        <w:rPr>
+          <w:lang w:val="en-US" w:eastAsia="x-none"/>
+        </w:rPr>
+        <w:br/>
+        <w:t xml:space="preserve">    def matches_conditions(self, **conditions):</w:t>
+      </w:r>
+      <w:r>
+        <w:rPr>
+          <w:lang w:val="en-US" w:eastAsia="x-none"/>
+        </w:rPr>
+        <w:br/>
+        <w:t xml:space="preserve">       matches = True</w:t>
+      </w:r>
+      <w:r>
+        <w:rPr>
+          <w:lang w:val="en-US" w:eastAsia="x-none"/>
+        </w:rPr>
+        <w:br/>
+      </w:r>
+      <w:r>
+        <w:rPr>
+          <w:lang w:val="en-US" w:eastAsia="x-none"/>
+        </w:rPr>
+        <w:lastRenderedPageBreak/>
+        <w:t xml:space="preserve">       if not super().matches_conditions(**conditions):</w:t>
+      </w:r>
+      <w:r>
+        <w:rPr>
+          <w:lang w:val="en-US" w:eastAsia="x-none"/>
+        </w:rPr>
+        <w:br/>
+        <w:t xml:space="preserve">          matches = False</w:t>
+      </w:r>
+      <w:r>
+        <w:rPr>
+          <w:lang w:val="en-US" w:eastAsia="x-none"/>
+        </w:rPr>
+        <w:br/>
+        <w:t xml:space="preserve">       if 'body_type' in conditions and conditions['body_type'].lower() != self.body_type.lower():</w:t>
+      </w:r>
+      <w:r>
+        <w:rPr>
+          <w:lang w:val="en-US" w:eastAsia="x-none"/>
+        </w:rPr>
+        <w:br/>
+        <w:t xml:space="preserve">          matches = False</w:t>
+      </w:r>
+      <w:r>
+        <w:rPr>
+          <w:lang w:val="en-US" w:eastAsia="x-none"/>
+        </w:rPr>
+        <w:br/>
+        <w:t xml:space="preserve">       return matches</w:t>
+      </w:r>
+      <w:r>
+        <w:rPr>
+          <w:lang w:val="en-US" w:eastAsia="x-none"/>
+        </w:rPr>
+        <w:br/>
+      </w:r>
+      <w:r>
+        <w:rPr>
+          <w:lang w:val="en-US" w:eastAsia="x-none"/>
+        </w:rPr>
+        <w:br/>
+      </w:r>
+      <w:r>
+        <w:rPr>
+          <w:lang w:val="en-US" w:eastAsia="x-none"/>
+        </w:rPr>
+        <w:br/>
+        <w:t>class Truck(Car):</w:t>
+      </w:r>
+      <w:r>
+        <w:rPr>
+          <w:lang w:val="en-US" w:eastAsia="x-none"/>
+        </w:rPr>
+        <w:br/>
+        <w:t xml:space="preserve">    def __init__(self, brand, model, year, load_capacity):</w:t>
+      </w:r>
+      <w:r>
+        <w:rPr>
+          <w:lang w:val="en-US" w:eastAsia="x-none"/>
+        </w:rPr>
+        <w:br/>
+        <w:t xml:space="preserve">       super().__init__(brand, model, year)</w:t>
+      </w:r>
+      <w:r>
+        <w:rPr>
+          <w:lang w:val="en-US" w:eastAsia="x-none"/>
+        </w:rPr>
+        <w:br/>
+        <w:t xml:space="preserve">       self.load_capacity = load_capacity  # in tons</w:t>
+      </w:r>
+      <w:r>
+        <w:rPr>
+          <w:lang w:val="en-US" w:eastAsia="x-none"/>
+        </w:rPr>
+        <w:br/>
+      </w:r>
+      <w:r>
+        <w:rPr>
+          <w:lang w:val="en-US" w:eastAsia="x-none"/>
+        </w:rPr>
+        <w:br/>
+        <w:t xml:space="preserve">    def display_info(self):</w:t>
+      </w:r>
+      <w:r>
+        <w:rPr>
+          <w:lang w:val="en-US" w:eastAsia="x-none"/>
+        </w:rPr>
+        <w:br/>
+        <w:t xml:space="preserve">       base_info = super().display_info()</w:t>
+      </w:r>
+      <w:r>
+        <w:rPr>
+          <w:lang w:val="en-US" w:eastAsia="x-none"/>
+        </w:rPr>
+        <w:br/>
+        <w:t xml:space="preserve">       return f"{base_info}, Load Capacity: {self.load_capacity} tons"</w:t>
+      </w:r>
+      <w:r>
+        <w:rPr>
+          <w:lang w:val="en-US" w:eastAsia="x-none"/>
+        </w:rPr>
+        <w:br/>
+      </w:r>
+      <w:r>
+        <w:rPr>
+          <w:lang w:val="en-US" w:eastAsia="x-none"/>
+        </w:rPr>
+        <w:br/>
+        <w:t xml:space="preserve">    def matches_conditions(self, **conditions):</w:t>
+      </w:r>
+      <w:r>
+        <w:rPr>
+          <w:lang w:val="en-US" w:eastAsia="x-none"/>
+        </w:rPr>
+        <w:br/>
+        <w:t xml:space="preserve">       matches = True</w:t>
+      </w:r>
+      <w:r>
+        <w:rPr>
+          <w:lang w:val="en-US" w:eastAsia="x-none"/>
+        </w:rPr>
+        <w:br/>
+        <w:t xml:space="preserve">       if not super().matches_conditions(**conditions):</w:t>
+      </w:r>
+      <w:r>
+        <w:rPr>
+          <w:lang w:val="en-US" w:eastAsia="x-none"/>
+        </w:rPr>
+        <w:br/>
+        <w:t xml:space="preserve">          matches = False</w:t>
+      </w:r>
+      <w:r>
+        <w:rPr>
+          <w:lang w:val="en-US" w:eastAsia="x-none"/>
+        </w:rPr>
+        <w:br/>
+        <w:t xml:space="preserve">       if 'min_load_capacity' in conditions and self.load_capacity &lt; conditions['min_load_capacity']:</w:t>
+      </w:r>
+      <w:r>
+        <w:rPr>
+          <w:lang w:val="en-US" w:eastAsia="x-none"/>
+        </w:rPr>
+        <w:br/>
+        <w:t xml:space="preserve">          matches = False</w:t>
+      </w:r>
+      <w:r>
+        <w:rPr>
+          <w:lang w:val="en-US" w:eastAsia="x-none"/>
+        </w:rPr>
+        <w:br/>
+        <w:t xml:space="preserve">       return matches</w:t>
+      </w:r>
+      <w:r>
+        <w:rPr>
+          <w:lang w:val="en-US" w:eastAsia="x-none"/>
+        </w:rPr>
+        <w:br/>
+      </w:r>
+      <w:r>
+        <w:rPr>
+          <w:lang w:val="en-US" w:eastAsia="x-none"/>
+        </w:rPr>
+        <w:br/>
+      </w:r>
+      <w:r>
+        <w:rPr>
+          <w:lang w:val="en-US" w:eastAsia="x-none"/>
+        </w:rPr>
+        <w:br/>
+        <w:t>class Bus(Car):</w:t>
+      </w:r>
+      <w:r>
+        <w:rPr>
+          <w:lang w:val="en-US" w:eastAsia="x-none"/>
+        </w:rPr>
+        <w:br/>
+        <w:t xml:space="preserve">    def __init__(self, brand, model, year, seat_count):</w:t>
+      </w:r>
+      <w:r>
+        <w:rPr>
+          <w:lang w:val="en-US" w:eastAsia="x-none"/>
+        </w:rPr>
+        <w:br/>
+        <w:t xml:space="preserve">       super().__init__(brand, model, year)</w:t>
+      </w:r>
+      <w:r>
+        <w:rPr>
+          <w:lang w:val="en-US" w:eastAsia="x-none"/>
+        </w:rPr>
+        <w:br/>
+        <w:t xml:space="preserve">       self.seat_count = seat_count</w:t>
+      </w:r>
+      <w:r>
+        <w:rPr>
+          <w:lang w:val="en-US" w:eastAsia="x-none"/>
+        </w:rPr>
+        <w:br/>
+      </w:r>
+      <w:r>
+        <w:rPr>
+          <w:lang w:val="en-US" w:eastAsia="x-none"/>
+        </w:rPr>
+        <w:br/>
+        <w:t xml:space="preserve">    def display_info(self):</w:t>
+      </w:r>
+      <w:r>
+        <w:rPr>
+          <w:lang w:val="en-US" w:eastAsia="x-none"/>
+        </w:rPr>
+        <w:br/>
+        <w:t xml:space="preserve">       base_info = super().display_info()</w:t>
+      </w:r>
+      <w:r>
+        <w:rPr>
+          <w:lang w:val="en-US" w:eastAsia="x-none"/>
+        </w:rPr>
+        <w:br/>
+        <w:t xml:space="preserve">       return f"{base_info}, Seat Count: {self.seat_count}"</w:t>
+      </w:r>
+      <w:r>
+        <w:rPr>
+          <w:lang w:val="en-US" w:eastAsia="x-none"/>
+        </w:rPr>
+        <w:br/>
+      </w:r>
+      <w:r>
+        <w:rPr>
+          <w:lang w:val="en-US" w:eastAsia="x-none"/>
+        </w:rPr>
+        <w:lastRenderedPageBreak/>
+        <w:br/>
+        <w:t xml:space="preserve">    def matches_conditions(self, **conditions):</w:t>
+      </w:r>
+      <w:r>
+        <w:rPr>
+          <w:lang w:val="en-US" w:eastAsia="x-none"/>
+        </w:rPr>
+        <w:br/>
+        <w:t xml:space="preserve">       matches = True</w:t>
+      </w:r>
+      <w:r>
+        <w:rPr>
+          <w:lang w:val="en-US" w:eastAsia="x-none"/>
+        </w:rPr>
+        <w:br/>
+        <w:t xml:space="preserve">       if not super().matches_conditions(**conditions):</w:t>
+      </w:r>
+      <w:r>
+        <w:rPr>
+          <w:lang w:val="en-US" w:eastAsia="x-none"/>
+        </w:rPr>
+        <w:br/>
+        <w:t xml:space="preserve">          matches = False</w:t>
+      </w:r>
+      <w:r>
+        <w:rPr>
+          <w:lang w:val="en-US" w:eastAsia="x-none"/>
+        </w:rPr>
+        <w:br/>
+        <w:t xml:space="preserve">       if 'min_seat_count' in conditions and self.seat_count &lt; conditions['min_seat_count']:</w:t>
+      </w:r>
+      <w:r>
+        <w:rPr>
+          <w:lang w:val="en-US" w:eastAsia="x-none"/>
+        </w:rPr>
+        <w:br/>
+        <w:t xml:space="preserve">          matches = False</w:t>
+      </w:r>
+      <w:r>
+        <w:rPr>
+          <w:lang w:val="en-US" w:eastAsia="x-none"/>
+        </w:rPr>
+        <w:br/>
+        <w:t xml:space="preserve">       return matches</w:t>
+      </w:r>
+      <w:r>
+        <w:rPr>
+          <w:lang w:val="en-US" w:eastAsia="x-none"/>
+        </w:rPr>
+        <w:br/>
+      </w:r>
+      <w:r>
+        <w:rPr>
+          <w:lang w:val="en-US" w:eastAsia="x-none"/>
+        </w:rPr>
+        <w:br/>
+      </w:r>
+      <w:r>
+        <w:rPr>
+          <w:lang w:val="en-US" w:eastAsia="x-none"/>
+        </w:rPr>
+        <w:br/>
+        <w:t>vehicles = [</w:t>
+      </w:r>
+      <w:r>
+        <w:rPr>
+          <w:lang w:val="en-US" w:eastAsia="x-none"/>
+        </w:rPr>
+        <w:br/>
+        <w:t xml:space="preserve">    PassengerCar("Audi"</w:t>
+      </w:r>
+      <w:r>
+        <w:rPr>
+          <w:lang w:eastAsia="x-none"/>
+        </w:rPr>
+        <w:t>ф</w:t>
+      </w:r>
+      <w:r>
+        <w:rPr>
+          <w:lang w:val="en-US" w:eastAsia="x-none"/>
+        </w:rPr>
+        <w:t>, "SQ7", 2018, "SUV"),</w:t>
+      </w:r>
+      <w:r>
+        <w:rPr>
+          <w:lang w:val="en-US" w:eastAsia="x-none"/>
+        </w:rPr>
+        <w:br/>
+        <w:t xml:space="preserve">    PassengerCar("Volkswagen", "Passat", 2023, "sedan"),</w:t>
+      </w:r>
+      <w:r>
+        <w:rPr>
+          <w:lang w:val="en-US" w:eastAsia="x-none"/>
+        </w:rPr>
+        <w:br/>
+        <w:t xml:space="preserve">    Truck("Volvo", "FH16", 2015, 20),</w:t>
+      </w:r>
+      <w:r>
+        <w:rPr>
+          <w:lang w:val="en-US" w:eastAsia="x-none"/>
+        </w:rPr>
+        <w:br/>
+        <w:t xml:space="preserve">    Truck("Scania", "R450", 2019, 18),</w:t>
+      </w:r>
+      <w:r>
+        <w:rPr>
+          <w:lang w:val="en-US" w:eastAsia="x-none"/>
+        </w:rPr>
+        <w:br/>
+        <w:t xml:space="preserve">    Bus("Mercedes", "Sprinter", 2017, 20),</w:t>
+      </w:r>
+      <w:r>
+        <w:rPr>
+          <w:lang w:val="en-US" w:eastAsia="x-none"/>
+        </w:rPr>
+        <w:br/>
+        <w:t xml:space="preserve">    Bus("Volvo", "B9R", 2014, 50)</w:t>
+      </w:r>
+      <w:r>
+        <w:rPr>
+          <w:lang w:val="en-US" w:eastAsia="x-none"/>
+        </w:rPr>
+        <w:br/>
+        <w:t>]</w:t>
+      </w:r>
+      <w:r>
+        <w:rPr>
+          <w:lang w:val="en-US" w:eastAsia="x-none"/>
+        </w:rPr>
+        <w:br/>
+      </w:r>
+      <w:r>
+        <w:rPr>
+          <w:lang w:val="en-US" w:eastAsia="x-none"/>
+        </w:rPr>
+        <w:br/>
+        <w:t>print("</w:t>
+      </w:r>
+      <w:r>
+        <w:rPr>
+          <w:lang w:eastAsia="x-none"/>
+        </w:rPr>
+        <w:t>Все</w:t>
+      </w:r>
+      <w:r>
+        <w:rPr>
+          <w:lang w:val="en-US" w:eastAsia="x-none"/>
+        </w:rPr>
+        <w:t xml:space="preserve"> </w:t>
+      </w:r>
+      <w:r>
+        <w:rPr>
+          <w:lang w:eastAsia="x-none"/>
+        </w:rPr>
+        <w:t>машины</w:t>
+      </w:r>
+      <w:r>
+        <w:rPr>
+          <w:lang w:val="en-US" w:eastAsia="x-none"/>
+        </w:rPr>
+        <w:t>:")</w:t>
+      </w:r>
+      <w:r>
+        <w:rPr>
+          <w:lang w:val="en-US" w:eastAsia="x-none"/>
+        </w:rPr>
+        <w:br/>
+        <w:t>for vehicle in vehicles:</w:t>
+      </w:r>
+      <w:r>
+        <w:rPr>
+          <w:lang w:val="en-US" w:eastAsia="x-none"/>
+        </w:rPr>
+        <w:br/>
+        <w:t xml:space="preserve">    print(vehicle.display_info())</w:t>
+      </w:r>
+      <w:r>
+        <w:rPr>
+          <w:lang w:val="en-US" w:eastAsia="x-none"/>
+        </w:rPr>
+        <w:br/>
+      </w:r>
+      <w:r>
+        <w:rPr>
+          <w:lang w:val="en-US" w:eastAsia="x-none"/>
+        </w:rPr>
+        <w:br/>
+        <w:t>search_brand = "Volvo"</w:t>
+      </w:r>
+      <w:r>
+        <w:rPr>
+          <w:lang w:val="en-US" w:eastAsia="x-none"/>
+        </w:rPr>
+        <w:br/>
+        <w:t>print(f"\n</w:t>
+      </w:r>
+      <w:r>
+        <w:rPr>
+          <w:lang w:eastAsia="x-none"/>
+        </w:rPr>
+        <w:t>Машины</w:t>
+      </w:r>
+      <w:r>
+        <w:rPr>
+          <w:lang w:val="en-US" w:eastAsia="x-none"/>
+        </w:rPr>
+        <w:t xml:space="preserve"> </w:t>
+      </w:r>
+      <w:r>
+        <w:rPr>
+          <w:lang w:eastAsia="x-none"/>
+        </w:rPr>
+        <w:t>бренда</w:t>
+      </w:r>
+      <w:r>
+        <w:rPr>
+          <w:lang w:val="en-US" w:eastAsia="x-none"/>
+        </w:rPr>
+        <w:t xml:space="preserve"> - '{search_brand}':")</w:t>
+      </w:r>
+      <w:r>
+        <w:rPr>
+          <w:lang w:val="en-US" w:eastAsia="x-none"/>
+        </w:rPr>
+        <w:br/>
+        <w:t>for vehicle in vehicles:</w:t>
+      </w:r>
+      <w:r>
+        <w:rPr>
+          <w:lang w:val="en-US" w:eastAsia="x-none"/>
+        </w:rPr>
+        <w:br/>
+        <w:t xml:space="preserve">    if vehicle.brand.lower() == search_brand.lower():</w:t>
+      </w:r>
+      <w:r>
+        <w:rPr>
+          <w:lang w:val="en-US" w:eastAsia="x-none"/>
+        </w:rPr>
+        <w:br/>
+        <w:t xml:space="preserve">       print(vehicle.display_info())</w:t>
+      </w:r>
+      <w:r>
+        <w:rPr>
+          <w:lang w:val="en-US" w:eastAsia="x-none"/>
+        </w:rPr>
+        <w:br/>
+      </w:r>
+      <w:r>
+        <w:rPr>
+          <w:lang w:val="en-US" w:eastAsia="x-none"/>
+        </w:rPr>
+        <w:br/>
+        <w:t>search_year = 2019</w:t>
+      </w:r>
+      <w:r>
+        <w:rPr>
+          <w:lang w:val="en-US" w:eastAsia="x-none"/>
+        </w:rPr>
+        <w:br/>
+        <w:t>print(f"\n</w:t>
+      </w:r>
+      <w:r>
+        <w:rPr>
+          <w:lang w:eastAsia="x-none"/>
+        </w:rPr>
+        <w:t>Машины</w:t>
+      </w:r>
+      <w:r>
+        <w:rPr>
+          <w:lang w:val="en-US" w:eastAsia="x-none"/>
+        </w:rPr>
+        <w:t xml:space="preserve"> </w:t>
+      </w:r>
+      <w:r>
+        <w:rPr>
+          <w:lang w:eastAsia="x-none"/>
+        </w:rPr>
+        <w:t>года</w:t>
+      </w:r>
+      <w:r>
+        <w:rPr>
+          <w:lang w:val="en-US" w:eastAsia="x-none"/>
+        </w:rPr>
+        <w:t xml:space="preserve"> - {search_year}:")</w:t>
+      </w:r>
+      <w:r>
+        <w:rPr>
+          <w:lang w:val="en-US" w:eastAsia="x-none"/>
+        </w:rPr>
+        <w:br/>
+        <w:t>for vehicle in vehicles:</w:t>
+      </w:r>
+      <w:r>
+        <w:rPr>
+          <w:lang w:val="en-US" w:eastAsia="x-none"/>
+        </w:rPr>
+        <w:br/>
+        <w:t xml:space="preserve">    if vehicle.year == search_year:</w:t>
+      </w:r>
+      <w:r>
+        <w:rPr>
+          <w:lang w:val="en-US" w:eastAsia="x-none"/>
+        </w:rPr>
+        <w:br/>
+        <w:t xml:space="preserve">       print(vehicle.display_info())</w:t>
+      </w:r>
+    </w:p>
+    <w:p>
+      <w:pPr>
+        <w:pStyle w:val="2"/>
+      </w:pPr>
+      <w:bookmarkStart w:id="20" w:name="_Toc202429559"/>
+      <w:r>
+        <w:lastRenderedPageBreak/>
+        <w:t>2. Код первой задачи для анализа данных</w:t>
+      </w:r>
+      <w:bookmarkEnd w:id="20"/>
+    </w:p>
+    <w:p>
+      <w:pPr>
+        <w:ind w:firstLine="0"/>
+        <w:rPr>
+          <w:lang w:val="en-US" w:eastAsia="x-none"/>
+        </w:rPr>
+      </w:pPr>
+      <w:r>
+        <w:rPr>
+          <w:lang w:val="en-US" w:eastAsia="x-none"/>
+        </w:rPr>
+        <w:t>import pandas as pd</w:t>
+      </w:r>
+      <w:r>
+        <w:rPr>
+          <w:lang w:val="en-US" w:eastAsia="x-none"/>
+        </w:rPr>
+        <w:br/>
+      </w:r>
+      <w:r>
+        <w:rPr>
+          <w:lang w:val="en-US" w:eastAsia="x-none"/>
+        </w:rPr>
+        <w:br/>
+        <w:t>tr_mcc_codes = pd.read_csv("data/tr_mcc_codes.csv", sep=";")</w:t>
+      </w:r>
+      <w:r>
+        <w:rPr>
+          <w:lang w:val="en-US" w:eastAsia="x-none"/>
+        </w:rPr>
+        <w:br/>
+        <w:t>transactions = pd.read_csv("data/transactions.csv", sep=",", nrows=1_000_000)</w:t>
+      </w:r>
+      <w:r>
+        <w:rPr>
+          <w:lang w:val="en-US" w:eastAsia="x-none"/>
+        </w:rPr>
+        <w:br/>
+        <w:t>tr_types = pd.read_csv("data/tr_types.csv", sep=";")</w:t>
+      </w:r>
+      <w:r>
+        <w:rPr>
+          <w:lang w:val="en-US" w:eastAsia="x-none"/>
+        </w:rPr>
+        <w:br/>
+        <w:t>gender_train = pd.read_csv("data/gender_train.csv", sep=",")</w:t>
+      </w:r>
+      <w:r>
+        <w:rPr>
+          <w:lang w:val="en-US" w:eastAsia="x-none"/>
+        </w:rPr>
+        <w:br/>
+      </w:r>
+      <w:r>
+        <w:rPr>
+          <w:lang w:val="en-US" w:eastAsia="x-none"/>
+        </w:rPr>
+        <w:br/>
+        <w:t>df = transactions.merge(tr_mcc_codes, on="mcc_code", how="inner")</w:t>
+      </w:r>
+      <w:r>
+        <w:rPr>
+          <w:lang w:val="en-US" w:eastAsia="x-none"/>
+        </w:rPr>
+        <w:br/>
+        <w:t>df = df.merge(tr_types, on="tr_type", how="inner")</w:t>
+      </w:r>
+      <w:r>
+        <w:rPr>
+          <w:lang w:val="en-US" w:eastAsia="x-none"/>
+        </w:rPr>
+        <w:br/>
+        <w:t>df = df.merge(gender_train, on="customer_id", how="left")</w:t>
+      </w:r>
+      <w:r>
+        <w:rPr>
+          <w:lang w:val="en-US" w:eastAsia="x-none"/>
+        </w:rPr>
+        <w:br/>
+      </w:r>
+      <w:r>
+        <w:rPr>
+          <w:lang w:val="en-US" w:eastAsia="x-none"/>
+        </w:rPr>
+        <w:br/>
+        <w:t>expenses = df[df["amount"] &lt; 0]</w:t>
+      </w:r>
+      <w:r>
+        <w:rPr>
+          <w:lang w:val="en-US" w:eastAsia="x-none"/>
+        </w:rPr>
+        <w:br/>
+        <w:t>avg_by_gender = expenses.groupby("gender")["amount"].mean().abs()</w:t>
+      </w:r>
+      <w:r>
+        <w:rPr>
+          <w:lang w:val="en-US" w:eastAsia="x-none"/>
+        </w:rPr>
+        <w:br/>
+        <w:t>difference = round(abs(avg_by_gender.iloc[0] - avg_by_gender.iloc[1]), 2)</w:t>
+      </w:r>
+      <w:r>
+        <w:rPr>
+          <w:lang w:val="en-US" w:eastAsia="x-none"/>
+        </w:rPr>
+        <w:br/>
+      </w:r>
+      <w:r>
+        <w:rPr>
+          <w:lang w:val="en-US" w:eastAsia="x-none"/>
+        </w:rPr>
+        <w:br/>
+        <w:t>df["mcc_code+tr_type"] = df["mcc_code"].astype(str) + df["tr_type"].astype(str)</w:t>
+      </w:r>
+      <w:r>
+        <w:rPr>
+          <w:lang w:val="en-US" w:eastAsia="x-none"/>
+        </w:rPr>
+        <w:br/>
+        <w:t># df["mcc_code+tr_type"] = df["mcc_code"].astype(int) + df["tr_type"].astype(int)</w:t>
+      </w:r>
+      <w:r>
+        <w:rPr>
+          <w:lang w:val="en-US" w:eastAsia="x-none"/>
+        </w:rPr>
+        <w:br/>
+      </w:r>
+      <w:r>
+        <w:rPr>
+          <w:lang w:val="en-US" w:eastAsia="x-none"/>
+        </w:rPr>
+        <w:br/>
+        <w:t>print(difference)</w:t>
+      </w:r>
+      <w:r>
+        <w:rPr>
+          <w:lang w:val="en-US" w:eastAsia="x-none"/>
+        </w:rPr>
+        <w:br/>
+        <w:t>print(df)</w:t>
+      </w:r>
+    </w:p>
+    <w:p>
+      <w:pPr>
+        <w:pStyle w:val="2"/>
+      </w:pPr>
+      <w:bookmarkStart w:id="21" w:name="_Toc202429560"/>
+      <w:r>
+        <w:t>3. Код второй задачи для анализа данных</w:t>
+      </w:r>
+      <w:bookmarkEnd w:id="21"/>
+    </w:p>
+    <w:p>
+      <w:pPr>
+        <w:ind w:firstLine="0"/>
+        <w:rPr>
+          <w:lang w:val="en-US" w:eastAsia="x-none"/>
+        </w:rPr>
+      </w:pPr>
+      <w:r>
+        <w:rPr>
+          <w:lang w:val="en-US" w:eastAsia="x-none"/>
+        </w:rPr>
+        <w:t>import pandas as pd</w:t>
+      </w:r>
+      <w:r>
+        <w:rPr>
+          <w:lang w:val="en-US" w:eastAsia="x-none"/>
+        </w:rPr>
+        <w:br/>
+        <w:t>import matplotlib.pyplot as plt</w:t>
+      </w:r>
+      <w:r>
+        <w:rPr>
+          <w:lang w:val="en-US" w:eastAsia="x-none"/>
+        </w:rPr>
+        <w:br/>
+      </w:r>
+      <w:r>
+        <w:rPr>
+          <w:lang w:val="en-US" w:eastAsia="x-none"/>
+        </w:rPr>
+        <w:br/>
+        <w:t>transactions = pd.read_csv("data/transactions.csv", sep=",", nrows=1_000_000)</w:t>
+      </w:r>
+      <w:r>
+        <w:rPr>
+          <w:lang w:val="en-US" w:eastAsia="x-none"/>
+        </w:rPr>
+        <w:br/>
+      </w:r>
+      <w:r>
+        <w:rPr>
+          <w:lang w:val="en-US" w:eastAsia="x-none"/>
+        </w:rPr>
+        <w:br/>
+        <w:t>transactions_expenses = transactions[transactions["amount"] &lt; 0].copy()</w:t>
+      </w:r>
+      <w:r>
+        <w:rPr>
+          <w:lang w:val="en-US" w:eastAsia="x-none"/>
+        </w:rPr>
+        <w:br/>
+        <w:t>print(transactions_expenses.head(10))</w:t>
+      </w:r>
+      <w:r>
+        <w:rPr>
+          <w:lang w:val="en-US" w:eastAsia="x-none"/>
+        </w:rPr>
+        <w:br/>
+      </w:r>
+      <w:r>
+        <w:rPr>
+          <w:lang w:val="en-US" w:eastAsia="x-none"/>
+        </w:rPr>
+        <w:br/>
+        <w:t>transactions_expenses["tr_day"] = transactions_expenses["tr_datetime"].str.split().str[0].astype(int)</w:t>
+      </w:r>
+      <w:r>
+        <w:rPr>
+          <w:lang w:val="en-US" w:eastAsia="x-none"/>
+        </w:rPr>
+        <w:br/>
+        <w:t>print(transactions_expenses.head(10))</w:t>
+      </w:r>
+      <w:r>
+        <w:rPr>
+          <w:lang w:val="en-US" w:eastAsia="x-none"/>
+        </w:rPr>
+        <w:br/>
+      </w:r>
+      <w:r>
+        <w:rPr>
+          <w:lang w:val="en-US" w:eastAsia="x-none"/>
+        </w:rPr>
+        <w:br/>
+      </w:r>
+      <w:r>
+        <w:rPr>
+          <w:lang w:val="en-US" w:eastAsia="x-none"/>
+        </w:rPr>
+        <w:lastRenderedPageBreak/>
+        <w:t>mcc_counts = transactions_expenses["mcc_code"].value_counts()</w:t>
+      </w:r>
+      <w:r>
+        <w:rPr>
+          <w:lang w:val="en-US" w:eastAsia="x-none"/>
+        </w:rPr>
+        <w:br/>
+        <w:t>print(mcc_counts)</w:t>
+      </w:r>
+      <w:r>
+        <w:rPr>
+          <w:lang w:val="en-US" w:eastAsia="x-none"/>
+        </w:rPr>
+        <w:br/>
+        <w:t>popular_mccs = mcc_counts[mcc_counts &gt; 60_000].index</w:t>
+      </w:r>
+      <w:r>
+        <w:rPr>
+          <w:lang w:val="en-US" w:eastAsia="x-none"/>
+        </w:rPr>
+        <w:br/>
+        <w:t>print(popular_mccs)</w:t>
+      </w:r>
+      <w:r>
+        <w:rPr>
+          <w:lang w:val="en-US" w:eastAsia="x-none"/>
+        </w:rPr>
+        <w:br/>
+      </w:r>
+      <w:r>
+        <w:rPr>
+          <w:lang w:val="en-US" w:eastAsia="x-none"/>
+        </w:rPr>
+        <w:br/>
+        <w:t>filtered = transactions_expenses[transactions_expenses["mcc_code"].isin(popular_mccs)]</w:t>
+      </w:r>
+      <w:r>
+        <w:rPr>
+          <w:lang w:val="en-US" w:eastAsia="x-none"/>
+        </w:rPr>
+        <w:br/>
+        <w:t>print(filtered)</w:t>
+      </w:r>
+      <w:r>
+        <w:rPr>
+          <w:lang w:val="en-US" w:eastAsia="x-none"/>
+        </w:rPr>
+        <w:br/>
+      </w:r>
+      <w:r>
+        <w:rPr>
+          <w:lang w:val="en-US" w:eastAsia="x-none"/>
+        </w:rPr>
+        <w:br/>
+        <w:t>grouped = filtered.groupby(["tr_day", "mcc_code"])["amount"].mean().unstack()</w:t>
+      </w:r>
+      <w:r>
+        <w:rPr>
+          <w:lang w:val="en-US" w:eastAsia="x-none"/>
+        </w:rPr>
+        <w:br/>
+        <w:t>print(grouped.head(10))</w:t>
+      </w:r>
+      <w:r>
+        <w:rPr>
+          <w:lang w:val="en-US" w:eastAsia="x-none"/>
+        </w:rPr>
+        <w:br/>
+      </w:r>
+      <w:r>
+        <w:rPr>
+          <w:lang w:val="en-US" w:eastAsia="x-none"/>
+        </w:rPr>
+        <w:br/>
+        <w:t>grouped.plot(figsize=(12, 6), title="</w:t>
+      </w:r>
+      <w:r>
+        <w:rPr>
+          <w:lang w:eastAsia="x-none"/>
+        </w:rPr>
+        <w:t>Средние</w:t>
+      </w:r>
+      <w:r>
+        <w:rPr>
+          <w:lang w:val="en-US" w:eastAsia="x-none"/>
+        </w:rPr>
+        <w:t xml:space="preserve"> </w:t>
+      </w:r>
+      <w:r>
+        <w:rPr>
+          <w:lang w:eastAsia="x-none"/>
+        </w:rPr>
+        <w:t>траты</w:t>
+      </w:r>
+      <w:r>
+        <w:rPr>
+          <w:lang w:val="en-US" w:eastAsia="x-none"/>
+        </w:rPr>
+        <w:t xml:space="preserve"> </w:t>
+      </w:r>
+      <w:r>
+        <w:rPr>
+          <w:lang w:eastAsia="x-none"/>
+        </w:rPr>
+        <w:t>по</w:t>
+      </w:r>
+      <w:r>
+        <w:rPr>
+          <w:lang w:val="en-US" w:eastAsia="x-none"/>
+        </w:rPr>
+        <w:t xml:space="preserve"> MCC-</w:t>
+      </w:r>
+      <w:r>
+        <w:rPr>
+          <w:lang w:eastAsia="x-none"/>
+        </w:rPr>
+        <w:t>кодам</w:t>
+      </w:r>
+      <w:r>
+        <w:rPr>
+          <w:lang w:val="en-US" w:eastAsia="x-none"/>
+        </w:rPr>
+        <w:t xml:space="preserve"> </w:t>
+      </w:r>
+      <w:r>
+        <w:rPr>
+          <w:lang w:eastAsia="x-none"/>
+        </w:rPr>
+        <w:t>по</w:t>
+      </w:r>
+      <w:r>
+        <w:rPr>
+          <w:lang w:val="en-US" w:eastAsia="x-none"/>
+        </w:rPr>
+        <w:t xml:space="preserve"> </w:t>
+      </w:r>
+      <w:r>
+        <w:rPr>
+          <w:lang w:eastAsia="x-none"/>
+        </w:rPr>
+        <w:t>дням</w:t>
+      </w:r>
+      <w:r>
+        <w:rPr>
+          <w:lang w:val="en-US" w:eastAsia="x-none"/>
+        </w:rPr>
+        <w:t>")</w:t>
+      </w:r>
+      <w:r>
+        <w:rPr>
+          <w:lang w:val="en-US" w:eastAsia="x-none"/>
+        </w:rPr>
+        <w:br/>
+        <w:t>plt.xlabel("</w:t>
+      </w:r>
+      <w:r>
+        <w:rPr>
+          <w:lang w:eastAsia="x-none"/>
+        </w:rPr>
+        <w:t>День</w:t>
+      </w:r>
+      <w:r>
+        <w:rPr>
+          <w:lang w:val="en-US" w:eastAsia="x-none"/>
+        </w:rPr>
+        <w:t>")</w:t>
+      </w:r>
+      <w:r>
+        <w:rPr>
+          <w:lang w:val="en-US" w:eastAsia="x-none"/>
+        </w:rPr>
+        <w:br/>
+        <w:t>plt.ylabel("</w:t>
+      </w:r>
+      <w:r>
+        <w:rPr>
+          <w:lang w:eastAsia="x-none"/>
+        </w:rPr>
+        <w:t>Средняя</w:t>
+      </w:r>
+      <w:r>
+        <w:rPr>
+          <w:lang w:val="en-US" w:eastAsia="x-none"/>
+        </w:rPr>
+        <w:t xml:space="preserve"> </w:t>
+      </w:r>
+      <w:r>
+        <w:rPr>
+          <w:lang w:eastAsia="x-none"/>
+        </w:rPr>
+        <w:t>сумма</w:t>
+      </w:r>
+      <w:r>
+        <w:rPr>
+          <w:lang w:val="en-US" w:eastAsia="x-none"/>
+        </w:rPr>
+        <w:t xml:space="preserve"> </w:t>
+      </w:r>
+      <w:r>
+        <w:rPr>
+          <w:lang w:eastAsia="x-none"/>
+        </w:rPr>
+        <w:t>трат</w:t>
+      </w:r>
+      <w:r>
+        <w:rPr>
+          <w:lang w:val="en-US" w:eastAsia="x-none"/>
+        </w:rPr>
+        <w:t>")</w:t>
+      </w:r>
+      <w:r>
+        <w:rPr>
+          <w:lang w:val="en-US" w:eastAsia="x-none"/>
+        </w:rPr>
+        <w:br/>
+        <w:t>plt.grid(True)</w:t>
+      </w:r>
+      <w:r>
+        <w:rPr>
+          <w:lang w:val="en-US" w:eastAsia="x-none"/>
+        </w:rPr>
+        <w:br/>
+        <w:t>plt.tight_layout()</w:t>
+      </w:r>
+      <w:r>
+        <w:rPr>
+          <w:lang w:val="en-US" w:eastAsia="x-none"/>
+        </w:rPr>
+        <w:br/>
+        <w:t>plt.show()</w:t>
+      </w:r>
+      <w:r>
+        <w:rPr>
+          <w:lang w:val="en-US" w:eastAsia="x-none"/>
+        </w:rPr>
+        <w:br/>
+      </w:r>
+      <w:r>
+        <w:rPr>
+          <w:lang w:val="en-US" w:eastAsia="x-none"/>
+        </w:rPr>
+        <w:br/>
+        <w:t>financial = [6011, 6012]</w:t>
+      </w:r>
+      <w:r>
+        <w:rPr>
+          <w:lang w:val="en-US" w:eastAsia="x-none"/>
+        </w:rPr>
+        <w:br/>
+        <w:t>found_financial = [i for i in grouped.columns if i in financial]</w:t>
+      </w:r>
+      <w:r>
+        <w:rPr>
+          <w:lang w:val="en-US" w:eastAsia="x-none"/>
+        </w:rPr>
+        <w:br/>
+      </w:r>
+      <w:r>
+        <w:rPr>
+          <w:lang w:val="en-US" w:eastAsia="x-none"/>
+        </w:rPr>
+        <w:br/>
+        <w:t>print("</w:t>
+      </w:r>
+      <w:r>
+        <w:rPr>
+          <w:lang w:eastAsia="x-none"/>
+        </w:rPr>
+        <w:t>Связанные</w:t>
+      </w:r>
+      <w:r>
+        <w:rPr>
+          <w:lang w:val="en-US" w:eastAsia="x-none"/>
+        </w:rPr>
+        <w:t xml:space="preserve"> </w:t>
+      </w:r>
+      <w:r>
+        <w:rPr>
+          <w:lang w:eastAsia="x-none"/>
+        </w:rPr>
+        <w:t>с</w:t>
+      </w:r>
+      <w:r>
+        <w:rPr>
+          <w:lang w:val="en-US" w:eastAsia="x-none"/>
+        </w:rPr>
+        <w:t xml:space="preserve"> </w:t>
+      </w:r>
+      <w:r>
+        <w:rPr>
+          <w:lang w:eastAsia="x-none"/>
+        </w:rPr>
+        <w:t>фин</w:t>
+      </w:r>
+      <w:r>
+        <w:rPr>
+          <w:lang w:val="en-US" w:eastAsia="x-none"/>
+        </w:rPr>
+        <w:t xml:space="preserve">. </w:t>
+      </w:r>
+      <w:r>
+        <w:rPr>
+          <w:lang w:eastAsia="x-none"/>
+        </w:rPr>
+        <w:t>институтами</w:t>
+      </w:r>
+      <w:r>
+        <w:rPr>
+          <w:lang w:val="en-US" w:eastAsia="x-none"/>
+        </w:rPr>
+        <w:t>:", found_financial)</w:t>
+      </w:r>
+    </w:p>
+    <w:p>
+      <w:pPr>
+        <w:ind w:firstLine="0"/>
+        <w:rPr>
+          <w:lang w:val="en-US" w:eastAsia="x-none"/>
+        </w:rPr>
+      </w:pPr>
     </w:p>
     <w:sectPr>
-      <w:footerReference w:type="default" r:id="rId22"/>
+      <w:footerReference w:type="default" r:id="rId23"/>
       <w:pgSz w:w="11909" w:h="16834"/>
       <w:pgMar w:top="1134" w:right="1418" w:bottom="1134" w:left="851" w:header="567" w:footer="567" w:gutter="0"/>
       <w:pgNumType w:start="2"/>
@@ -7774,7 +9663,7 @@
 </file>
 
 <file path=word/endnotes.xml><?xml version="1.0" encoding="utf-8"?>
-<w:endnotes xmlns:wpc="http://schemas.microsoft.com/office/word/2010/wordprocessingCanvas" xmlns:cx="http://schemas.microsoft.com/office/drawing/2014/chartex" xmlns:cx1="http://schemas.microsoft.com/office/drawing/2015/9/8/chartex" xmlns:cx2="http://schemas.microsoft.com/office/drawing/2015/10/21/chartex" xmlns:cx3="http://schemas.microsoft.com/office/drawing/2016/5/9/chartex" xmlns:cx4="http://schemas.microsoft.com/office/drawing/2016/5/10/chartex" xmlns:cx5="http://schemas.microsoft.com/office/drawing/2016/5/11/chartex" xmlns:cx6="http://schemas.microsoft.com/office/drawing/2016/5/12/chartex" xmlns:cx7="http://schemas.microsoft.com/office/drawing/2016/5/13/chartex" xmlns:cx8="http://schemas.microsoft.com/office/drawing/2016/5/14/chartex" xmlns:mc="http://schemas.openxmlformats.org/markup-compatibility/2006" xmlns:aink="http://schemas.microsoft.com/office/drawing/2016/ink" xmlns:am3d="http://schemas.microsoft.com/office/drawing/2017/model3d" xmlns:o="urn:schemas-microsoft-com:office:office" xmlns:r="http://schemas.openxmlformats.org/officeDocument/2006/relationships" xmlns:m="http://schemas.openxmlformats.org/officeDocument/2006/math" xmlns:v="urn:schemas-microsoft-com:vml" xmlns:wp14="http://schemas.microsoft.com/office/word/2010/wordprocessingDrawing" xmlns:wp="http://schemas.openxmlformats.org/drawingml/2006/wordprocessingDrawing" xmlns:w10="urn:schemas-microsoft-com:office:word" xmlns:w="http://schemas.openxmlformats.org/wordprocessingml/2006/main" xmlns:w14="http://schemas.microsoft.com/office/word/2010/wordml" xmlns:w15="http://schemas.microsoft.com/office/word/2012/wordml" xmlns:w16cex="http://schemas.microsoft.com/office/word/2018/wordml/cex" xmlns:w16cid="http://schemas.microsoft.com/office/word/2016/wordml/cid" xmlns:w16="http://schemas.microsoft.com/office/word/2018/wordml" xmlns:w16sdtdh="http://schemas.microsoft.com/office/word/2020/wordml/sdtdatahash" xmlns:w16se="http://schemas.microsoft.com/office/word/2015/wordml/symex" xmlns:wpg="http://schemas.microsoft.com/office/word/2010/wordprocessingGroup" xmlns:wpi="http://schemas.microsoft.com/office/word/2010/wordprocessingInk" xmlns:wne="http://schemas.microsoft.com/office/word/2006/wordml" xmlns:wps="http://schemas.microsoft.com/office/word/2010/wordprocessingShape" mc:Ignorable="w14 w15 w16se w16cid w16 w16cex w16sdtdh wp14">
+<w:endnotes xmlns:wpc="http://schemas.microsoft.com/office/word/2010/wordprocessingCanvas" xmlns:cx="http://schemas.microsoft.com/office/drawing/2014/chartex" xmlns:cx1="http://schemas.microsoft.com/office/drawing/2015/9/8/chartex" xmlns:cx2="http://schemas.microsoft.com/office/drawing/2015/10/21/chartex" xmlns:cx3="http://schemas.microsoft.com/office/drawing/2016/5/9/chartex" xmlns:cx4="http://schemas.microsoft.com/office/drawing/2016/5/10/chartex" xmlns:cx5="http://schemas.microsoft.com/office/drawing/2016/5/11/chartex" xmlns:cx6="http://schemas.microsoft.com/office/drawing/2016/5/12/chartex" xmlns:cx7="http://schemas.microsoft.com/office/drawing/2016/5/13/chartex" xmlns:cx8="http://schemas.microsoft.com/office/drawing/2016/5/14/chartex" xmlns:mc="http://schemas.openxmlformats.org/markup-compatibility/2006" xmlns:aink="http://schemas.microsoft.com/office/drawing/2016/ink" xmlns:am3d="http://schemas.microsoft.com/office/drawing/2017/model3d" xmlns:o="urn:schemas-microsoft-com:office:office" xmlns:oel="http://schemas.microsoft.com/office/2019/extlst" xmlns:r="http://schemas.openxmlformats.org/officeDocument/2006/relationships" xmlns:m="http://schemas.openxmlformats.org/officeDocument/2006/math" xmlns:v="urn:schemas-microsoft-com:vml" xmlns:wp14="http://schemas.microsoft.com/office/word/2010/wordprocessingDrawing" xmlns:wp="http://schemas.openxmlformats.org/drawingml/2006/wordprocessingDrawing" xmlns:w10="urn:schemas-microsoft-com:office:word" xmlns:w="http://schemas.openxmlformats.org/wordprocessingml/2006/main" xmlns:w14="http://schemas.microsoft.com/office/word/2010/wordml" xmlns:w15="http://schemas.microsoft.com/office/word/2012/wordml" xmlns:w16cex="http://schemas.microsoft.com/office/word/2018/wordml/cex" xmlns:w16cid="http://schemas.microsoft.com/office/word/2016/wordml/cid" xmlns:w16="http://schemas.microsoft.com/office/word/2018/wordml" xmlns:w16sdtdh="http://schemas.microsoft.com/office/word/2020/wordml/sdtdatahash" xmlns:w16se="http://schemas.microsoft.com/office/word/2015/wordml/symex" xmlns:wpg="http://schemas.microsoft.com/office/word/2010/wordprocessingGroup" xmlns:wpi="http://schemas.microsoft.com/office/word/2010/wordprocessingInk" xmlns:wne="http://schemas.microsoft.com/office/word/2006/wordml" xmlns:wps="http://schemas.microsoft.com/office/word/2010/wordprocessingShape" mc:Ignorable="w14 w15 w16se w16cid w16 w16cex w16sdtdh wp14">
   <w:endnote w:type="separator" w:id="-1">
     <w:p>
       <w:r>
@@ -7793,7 +9682,7 @@
 </file>
 
 <file path=word/footer1.xml><?xml version="1.0" encoding="utf-8"?>
-<w:ftr xmlns:wpc="http://schemas.microsoft.com/office/word/2010/wordprocessingCanvas" xmlns:cx="http://schemas.microsoft.com/office/drawing/2014/chartex" xmlns:cx1="http://schemas.microsoft.com/office/drawing/2015/9/8/chartex" xmlns:cx2="http://schemas.microsoft.com/office/drawing/2015/10/21/chartex" xmlns:cx3="http://schemas.microsoft.com/office/drawing/2016/5/9/chartex" xmlns:cx4="http://schemas.microsoft.com/office/drawing/2016/5/10/chartex" xmlns:cx5="http://schemas.microsoft.com/office/drawing/2016/5/11/chartex" xmlns:cx6="http://schemas.microsoft.com/office/drawing/2016/5/12/chartex" xmlns:cx7="http://schemas.microsoft.com/office/drawing/2016/5/13/chartex" xmlns:cx8="http://schemas.microsoft.com/office/drawing/2016/5/14/chartex" xmlns:mc="http://schemas.openxmlformats.org/markup-compatibility/2006" xmlns:aink="http://schemas.microsoft.com/office/drawing/2016/ink" xmlns:am3d="http://schemas.microsoft.com/office/drawing/2017/model3d" xmlns:o="urn:schemas-microsoft-com:office:office" xmlns:r="http://schemas.openxmlformats.org/officeDocument/2006/relationships" xmlns:m="http://schemas.openxmlformats.org/officeDocument/2006/math" xmlns:v="urn:schemas-microsoft-com:vml" xmlns:wp14="http://schemas.microsoft.com/office/word/2010/wordprocessingDrawing" xmlns:wp="http://schemas.openxmlformats.org/drawingml/2006/wordprocessingDrawing" xmlns:w10="urn:schemas-microsoft-com:office:word" xmlns:w="http://schemas.openxmlformats.org/wordprocessingml/2006/main" xmlns:w14="http://schemas.microsoft.com/office/word/2010/wordml" xmlns:w15="http://schemas.microsoft.com/office/word/2012/wordml" xmlns:w16cex="http://schemas.microsoft.com/office/word/2018/wordml/cex" xmlns:w16cid="http://schemas.microsoft.com/office/word/2016/wordml/cid" xmlns:w16="http://schemas.microsoft.com/office/word/2018/wordml" xmlns:w16sdtdh="http://schemas.microsoft.com/office/word/2020/wordml/sdtdatahash" xmlns:w16se="http://schemas.microsoft.com/office/word/2015/wordml/symex" xmlns:wpg="http://schemas.microsoft.com/office/word/2010/wordprocessingGroup" xmlns:wpi="http://schemas.microsoft.com/office/word/2010/wordprocessingInk" xmlns:wne="http://schemas.microsoft.com/office/word/2006/wordml" xmlns:wps="http://schemas.microsoft.com/office/word/2010/wordprocessingShape" mc:Ignorable="w14 w15 w16se w16cid w16 w16cex w16sdtdh wp14">
+<w:ftr xmlns:wpc="http://schemas.microsoft.com/office/word/2010/wordprocessingCanvas" xmlns:cx="http://schemas.microsoft.com/office/drawing/2014/chartex" xmlns:cx1="http://schemas.microsoft.com/office/drawing/2015/9/8/chartex" xmlns:cx2="http://schemas.microsoft.com/office/drawing/2015/10/21/chartex" xmlns:cx3="http://schemas.microsoft.com/office/drawing/2016/5/9/chartex" xmlns:cx4="http://schemas.microsoft.com/office/drawing/2016/5/10/chartex" xmlns:cx5="http://schemas.microsoft.com/office/drawing/2016/5/11/chartex" xmlns:cx6="http://schemas.microsoft.com/office/drawing/2016/5/12/chartex" xmlns:cx7="http://schemas.microsoft.com/office/drawing/2016/5/13/chartex" xmlns:cx8="http://schemas.microsoft.com/office/drawing/2016/5/14/chartex" xmlns:mc="http://schemas.openxmlformats.org/markup-compatibility/2006" xmlns:aink="http://schemas.microsoft.com/office/drawing/2016/ink" xmlns:am3d="http://schemas.microsoft.com/office/drawing/2017/model3d" xmlns:o="urn:schemas-microsoft-com:office:office" xmlns:oel="http://schemas.microsoft.com/office/2019/extlst" xmlns:r="http://schemas.openxmlformats.org/officeDocument/2006/relationships" xmlns:m="http://schemas.openxmlformats.org/officeDocument/2006/math" xmlns:v="urn:schemas-microsoft-com:vml" xmlns:wp14="http://schemas.microsoft.com/office/word/2010/wordprocessingDrawing" xmlns:wp="http://schemas.openxmlformats.org/drawingml/2006/wordprocessingDrawing" xmlns:w10="urn:schemas-microsoft-com:office:word" xmlns:w="http://schemas.openxmlformats.org/wordprocessingml/2006/main" xmlns:w14="http://schemas.microsoft.com/office/word/2010/wordml" xmlns:w15="http://schemas.microsoft.com/office/word/2012/wordml" xmlns:w16cex="http://schemas.microsoft.com/office/word/2018/wordml/cex" xmlns:w16cid="http://schemas.microsoft.com/office/word/2016/wordml/cid" xmlns:w16="http://schemas.microsoft.com/office/word/2018/wordml" xmlns:w16sdtdh="http://schemas.microsoft.com/office/word/2020/wordml/sdtdatahash" xmlns:w16se="http://schemas.microsoft.com/office/word/2015/wordml/symex" xmlns:wpg="http://schemas.microsoft.com/office/word/2010/wordprocessingGroup" xmlns:wpi="http://schemas.microsoft.com/office/word/2010/wordprocessingInk" xmlns:wne="http://schemas.microsoft.com/office/word/2006/wordml" xmlns:wps="http://schemas.microsoft.com/office/word/2010/wordprocessingShape" mc:Ignorable="w14 w15 w16se w16cid w16 w16cex w16sdtdh wp14">
   <w:p>
     <w:pPr>
       <w:pStyle w:val="a6"/>
@@ -7803,7 +9692,7 @@
 </file>
 
 <file path=word/footer2.xml><?xml version="1.0" encoding="utf-8"?>
-<w:ftr xmlns:wpc="http://schemas.microsoft.com/office/word/2010/wordprocessingCanvas" xmlns:cx="http://schemas.microsoft.com/office/drawing/2014/chartex" xmlns:cx1="http://schemas.microsoft.com/office/drawing/2015/9/8/chartex" xmlns:cx2="http://schemas.microsoft.com/office/drawing/2015/10/21/chartex" xmlns:cx3="http://schemas.microsoft.com/office/drawing/2016/5/9/chartex" xmlns:cx4="http://schemas.microsoft.com/office/drawing/2016/5/10/chartex" xmlns:cx5="http://schemas.microsoft.com/office/drawing/2016/5/11/chartex" xmlns:cx6="http://schemas.microsoft.com/office/drawing/2016/5/12/chartex" xmlns:cx7="http://schemas.microsoft.com/office/drawing/2016/5/13/chartex" xmlns:cx8="http://schemas.microsoft.com/office/drawing/2016/5/14/chartex" xmlns:mc="http://schemas.openxmlformats.org/markup-compatibility/2006" xmlns:aink="http://schemas.microsoft.com/office/drawing/2016/ink" xmlns:am3d="http://schemas.microsoft.com/office/drawing/2017/model3d" xmlns:o="urn:schemas-microsoft-com:office:office" xmlns:r="http://schemas.openxmlformats.org/officeDocument/2006/relationships" xmlns:m="http://schemas.openxmlformats.org/officeDocument/2006/math" xmlns:v="urn:schemas-microsoft-com:vml" xmlns:wp14="http://schemas.microsoft.com/office/word/2010/wordprocessingDrawing" xmlns:wp="http://schemas.openxmlformats.org/drawingml/2006/wordprocessingDrawing" xmlns:w10="urn:schemas-microsoft-com:office:word" xmlns:w="http://schemas.openxmlformats.org/wordprocessingml/2006/main" xmlns:w14="http://schemas.microsoft.com/office/word/2010/wordml" xmlns:w15="http://schemas.microsoft.com/office/word/2012/wordml" xmlns:w16cex="http://schemas.microsoft.com/office/word/2018/wordml/cex" xmlns:w16cid="http://schemas.microsoft.com/office/word/2016/wordml/cid" xmlns:w16="http://schemas.microsoft.com/office/word/2018/wordml" xmlns:w16sdtdh="http://schemas.microsoft.com/office/word/2020/wordml/sdtdatahash" xmlns:w16se="http://schemas.microsoft.com/office/word/2015/wordml/symex" xmlns:wpg="http://schemas.microsoft.com/office/word/2010/wordprocessingGroup" xmlns:wpi="http://schemas.microsoft.com/office/word/2010/wordprocessingInk" xmlns:wne="http://schemas.microsoft.com/office/word/2006/wordml" xmlns:wps="http://schemas.microsoft.com/office/word/2010/wordprocessingShape" mc:Ignorable="w14 w15 w16se w16cid w16 w16cex w16sdtdh wp14">
+<w:ftr xmlns:wpc="http://schemas.microsoft.com/office/word/2010/wordprocessingCanvas" xmlns:cx="http://schemas.microsoft.com/office/drawing/2014/chartex" xmlns:cx1="http://schemas.microsoft.com/office/drawing/2015/9/8/chartex" xmlns:cx2="http://schemas.microsoft.com/office/drawing/2015/10/21/chartex" xmlns:cx3="http://schemas.microsoft.com/office/drawing/2016/5/9/chartex" xmlns:cx4="http://schemas.microsoft.com/office/drawing/2016/5/10/chartex" xmlns:cx5="http://schemas.microsoft.com/office/drawing/2016/5/11/chartex" xmlns:cx6="http://schemas.microsoft.com/office/drawing/2016/5/12/chartex" xmlns:cx7="http://schemas.microsoft.com/office/drawing/2016/5/13/chartex" xmlns:cx8="http://schemas.microsoft.com/office/drawing/2016/5/14/chartex" xmlns:mc="http://schemas.openxmlformats.org/markup-compatibility/2006" xmlns:aink="http://schemas.microsoft.com/office/drawing/2016/ink" xmlns:am3d="http://schemas.microsoft.com/office/drawing/2017/model3d" xmlns:o="urn:schemas-microsoft-com:office:office" xmlns:oel="http://schemas.microsoft.com/office/2019/extlst" xmlns:r="http://schemas.openxmlformats.org/officeDocument/2006/relationships" xmlns:m="http://schemas.openxmlformats.org/officeDocument/2006/math" xmlns:v="urn:schemas-microsoft-com:vml" xmlns:wp14="http://schemas.microsoft.com/office/word/2010/wordprocessingDrawing" xmlns:wp="http://schemas.openxmlformats.org/drawingml/2006/wordprocessingDrawing" xmlns:w10="urn:schemas-microsoft-com:office:word" xmlns:w="http://schemas.openxmlformats.org/wordprocessingml/2006/main" xmlns:w14="http://schemas.microsoft.com/office/word/2010/wordml" xmlns:w15="http://schemas.microsoft.com/office/word/2012/wordml" xmlns:w16cex="http://schemas.microsoft.com/office/word/2018/wordml/cex" xmlns:w16cid="http://schemas.microsoft.com/office/word/2016/wordml/cid" xmlns:w16="http://schemas.microsoft.com/office/word/2018/wordml" xmlns:w16sdtdh="http://schemas.microsoft.com/office/word/2020/wordml/sdtdatahash" xmlns:w16se="http://schemas.microsoft.com/office/word/2015/wordml/symex" xmlns:wpg="http://schemas.microsoft.com/office/word/2010/wordprocessingGroup" xmlns:wpi="http://schemas.microsoft.com/office/word/2010/wordprocessingInk" xmlns:wne="http://schemas.microsoft.com/office/word/2006/wordml" xmlns:wps="http://schemas.microsoft.com/office/word/2010/wordprocessingShape" mc:Ignorable="w14 w15 w16se w16cid w16 w16cex w16sdtdh wp14">
   <w:p>
     <w:pPr>
       <w:pStyle w:val="a6"/>
@@ -7813,7 +9702,7 @@
 </file>
 
 <file path=word/footer3.xml><?xml version="1.0" encoding="utf-8"?>
-<w:ftr xmlns:wpc="http://schemas.microsoft.com/office/word/2010/wordprocessingCanvas" xmlns:cx="http://schemas.microsoft.com/office/drawing/2014/chartex" xmlns:cx1="http://schemas.microsoft.com/office/drawing/2015/9/8/chartex" xmlns:cx2="http://schemas.microsoft.com/office/drawing/2015/10/21/chartex" xmlns:cx3="http://schemas.microsoft.com/office/drawing/2016/5/9/chartex" xmlns:cx4="http://schemas.microsoft.com/office/drawing/2016/5/10/chartex" xmlns:cx5="http://schemas.microsoft.com/office/drawing/2016/5/11/chartex" xmlns:cx6="http://schemas.microsoft.com/office/drawing/2016/5/12/chartex" xmlns:cx7="http://schemas.microsoft.com/office/drawing/2016/5/13/chartex" xmlns:cx8="http://schemas.microsoft.com/office/drawing/2016/5/14/chartex" xmlns:mc="http://schemas.openxmlformats.org/markup-compatibility/2006" xmlns:aink="http://schemas.microsoft.com/office/drawing/2016/ink" xmlns:am3d="http://schemas.microsoft.com/office/drawing/2017/model3d" xmlns:o="urn:schemas-microsoft-com:office:office" xmlns:r="http://schemas.openxmlformats.org/officeDocument/2006/relationships" xmlns:m="http://schemas.openxmlformats.org/officeDocument/2006/math" xmlns:v="urn:schemas-microsoft-com:vml" xmlns:wp14="http://schemas.microsoft.com/office/word/2010/wordprocessingDrawing" xmlns:wp="http://schemas.openxmlformats.org/drawingml/2006/wordprocessingDrawing" xmlns:w10="urn:schemas-microsoft-com:office:word" xmlns:w="http://schemas.openxmlformats.org/wordprocessingml/2006/main" xmlns:w14="http://schemas.microsoft.com/office/word/2010/wordml" xmlns:w15="http://schemas.microsoft.com/office/word/2012/wordml" xmlns:w16cex="http://schemas.microsoft.com/office/word/2018/wordml/cex" xmlns:w16cid="http://schemas.microsoft.com/office/word/2016/wordml/cid" xmlns:w16="http://schemas.microsoft.com/office/word/2018/wordml" xmlns:w16sdtdh="http://schemas.microsoft.com/office/word/2020/wordml/sdtdatahash" xmlns:w16se="http://schemas.microsoft.com/office/word/2015/wordml/symex" xmlns:wpg="http://schemas.microsoft.com/office/word/2010/wordprocessingGroup" xmlns:wpi="http://schemas.microsoft.com/office/word/2010/wordprocessingInk" xmlns:wne="http://schemas.microsoft.com/office/word/2006/wordml" xmlns:wps="http://schemas.microsoft.com/office/word/2010/wordprocessingShape" mc:Ignorable="w14 w15 w16se w16cid w16 w16cex w16sdtdh wp14">
+<w:ftr xmlns:wpc="http://schemas.microsoft.com/office/word/2010/wordprocessingCanvas" xmlns:cx="http://schemas.microsoft.com/office/drawing/2014/chartex" xmlns:cx1="http://schemas.microsoft.com/office/drawing/2015/9/8/chartex" xmlns:cx2="http://schemas.microsoft.com/office/drawing/2015/10/21/chartex" xmlns:cx3="http://schemas.microsoft.com/office/drawing/2016/5/9/chartex" xmlns:cx4="http://schemas.microsoft.com/office/drawing/2016/5/10/chartex" xmlns:cx5="http://schemas.microsoft.com/office/drawing/2016/5/11/chartex" xmlns:cx6="http://schemas.microsoft.com/office/drawing/2016/5/12/chartex" xmlns:cx7="http://schemas.microsoft.com/office/drawing/2016/5/13/chartex" xmlns:cx8="http://schemas.microsoft.com/office/drawing/2016/5/14/chartex" xmlns:mc="http://schemas.openxmlformats.org/markup-compatibility/2006" xmlns:aink="http://schemas.microsoft.com/office/drawing/2016/ink" xmlns:am3d="http://schemas.microsoft.com/office/drawing/2017/model3d" xmlns:o="urn:schemas-microsoft-com:office:office" xmlns:oel="http://schemas.microsoft.com/office/2019/extlst" xmlns:r="http://schemas.openxmlformats.org/officeDocument/2006/relationships" xmlns:m="http://schemas.openxmlformats.org/officeDocument/2006/math" xmlns:v="urn:schemas-microsoft-com:vml" xmlns:wp14="http://schemas.microsoft.com/office/word/2010/wordprocessingDrawing" xmlns:wp="http://schemas.openxmlformats.org/drawingml/2006/wordprocessingDrawing" xmlns:w10="urn:schemas-microsoft-com:office:word" xmlns:w="http://schemas.openxmlformats.org/wordprocessingml/2006/main" xmlns:w14="http://schemas.microsoft.com/office/word/2010/wordml" xmlns:w15="http://schemas.microsoft.com/office/word/2012/wordml" xmlns:w16cex="http://schemas.microsoft.com/office/word/2018/wordml/cex" xmlns:w16cid="http://schemas.microsoft.com/office/word/2016/wordml/cid" xmlns:w16="http://schemas.microsoft.com/office/word/2018/wordml" xmlns:w16sdtdh="http://schemas.microsoft.com/office/word/2020/wordml/sdtdatahash" xmlns:w16se="http://schemas.microsoft.com/office/word/2015/wordml/symex" xmlns:wpg="http://schemas.microsoft.com/office/word/2010/wordprocessingGroup" xmlns:wpi="http://schemas.microsoft.com/office/word/2010/wordprocessingInk" xmlns:wne="http://schemas.microsoft.com/office/word/2006/wordml" xmlns:wps="http://schemas.microsoft.com/office/word/2010/wordprocessingShape" mc:Ignorable="w14 w15 w16se w16cid w16 w16cex w16sdtdh wp14">
   <w:p>
     <w:pPr>
       <w:pStyle w:val="a6"/>
@@ -7823,7 +9712,7 @@
 </file>
 
 <file path=word/footer4.xml><?xml version="1.0" encoding="utf-8"?>
-<w:ftr xmlns:wpc="http://schemas.microsoft.com/office/word/2010/wordprocessingCanvas" xmlns:cx="http://schemas.microsoft.com/office/drawing/2014/chartex" xmlns:cx1="http://schemas.microsoft.com/office/drawing/2015/9/8/chartex" xmlns:cx2="http://schemas.microsoft.com/office/drawing/2015/10/21/chartex" xmlns:cx3="http://schemas.microsoft.com/office/drawing/2016/5/9/chartex" xmlns:cx4="http://schemas.microsoft.com/office/drawing/2016/5/10/chartex" xmlns:cx5="http://schemas.microsoft.com/office/drawing/2016/5/11/chartex" xmlns:cx6="http://schemas.microsoft.com/office/drawing/2016/5/12/chartex" xmlns:cx7="http://schemas.microsoft.com/office/drawing/2016/5/13/chartex" xmlns:cx8="http://schemas.microsoft.com/office/drawing/2016/5/14/chartex" xmlns:mc="http://schemas.openxmlformats.org/markup-compatibility/2006" xmlns:aink="http://schemas.microsoft.com/office/drawing/2016/ink" xmlns:am3d="http://schemas.microsoft.com/office/drawing/2017/model3d" xmlns:o="urn:schemas-microsoft-com:office:office" xmlns:r="http://schemas.openxmlformats.org/officeDocument/2006/relationships" xmlns:m="http://schemas.openxmlformats.org/officeDocument/2006/math" xmlns:v="urn:schemas-microsoft-com:vml" xmlns:wp14="http://schemas.microsoft.com/office/word/2010/wordprocessingDrawing" xmlns:wp="http://schemas.openxmlformats.org/drawingml/2006/wordprocessingDrawing" xmlns:w10="urn:schemas-microsoft-com:office:word" xmlns:w="http://schemas.openxmlformats.org/wordprocessingml/2006/main" xmlns:w14="http://schemas.microsoft.com/office/word/2010/wordml" xmlns:w15="http://schemas.microsoft.com/office/word/2012/wordml" xmlns:w16cex="http://schemas.microsoft.com/office/word/2018/wordml/cex" xmlns:w16cid="http://schemas.microsoft.com/office/word/2016/wordml/cid" xmlns:w16="http://schemas.microsoft.com/office/word/2018/wordml" xmlns:w16sdtdh="http://schemas.microsoft.com/office/word/2020/wordml/sdtdatahash" xmlns:w16se="http://schemas.microsoft.com/office/word/2015/wordml/symex" xmlns:wpg="http://schemas.microsoft.com/office/word/2010/wordprocessingGroup" xmlns:wpi="http://schemas.microsoft.com/office/word/2010/wordprocessingInk" xmlns:wne="http://schemas.microsoft.com/office/word/2006/wordml" xmlns:wps="http://schemas.microsoft.com/office/word/2010/wordprocessingShape" mc:Ignorable="w14 w15 w16se w16cid w16 w16cex w16sdtdh wp14">
+<w:ftr xmlns:wpc="http://schemas.microsoft.com/office/word/2010/wordprocessingCanvas" xmlns:cx="http://schemas.microsoft.com/office/drawing/2014/chartex" xmlns:cx1="http://schemas.microsoft.com/office/drawing/2015/9/8/chartex" xmlns:cx2="http://schemas.microsoft.com/office/drawing/2015/10/21/chartex" xmlns:cx3="http://schemas.microsoft.com/office/drawing/2016/5/9/chartex" xmlns:cx4="http://schemas.microsoft.com/office/drawing/2016/5/10/chartex" xmlns:cx5="http://schemas.microsoft.com/office/drawing/2016/5/11/chartex" xmlns:cx6="http://schemas.microsoft.com/office/drawing/2016/5/12/chartex" xmlns:cx7="http://schemas.microsoft.com/office/drawing/2016/5/13/chartex" xmlns:cx8="http://schemas.microsoft.com/office/drawing/2016/5/14/chartex" xmlns:mc="http://schemas.openxmlformats.org/markup-compatibility/2006" xmlns:aink="http://schemas.microsoft.com/office/drawing/2016/ink" xmlns:am3d="http://schemas.microsoft.com/office/drawing/2017/model3d" xmlns:o="urn:schemas-microsoft-com:office:office" xmlns:oel="http://schemas.microsoft.com/office/2019/extlst" xmlns:r="http://schemas.openxmlformats.org/officeDocument/2006/relationships" xmlns:m="http://schemas.openxmlformats.org/officeDocument/2006/math" xmlns:v="urn:schemas-microsoft-com:vml" xmlns:wp14="http://schemas.microsoft.com/office/word/2010/wordprocessingDrawing" xmlns:wp="http://schemas.openxmlformats.org/drawingml/2006/wordprocessingDrawing" xmlns:w10="urn:schemas-microsoft-com:office:word" xmlns:w="http://schemas.openxmlformats.org/wordprocessingml/2006/main" xmlns:w14="http://schemas.microsoft.com/office/word/2010/wordml" xmlns:w15="http://schemas.microsoft.com/office/word/2012/wordml" xmlns:w16cex="http://schemas.microsoft.com/office/word/2018/wordml/cex" xmlns:w16cid="http://schemas.microsoft.com/office/word/2016/wordml/cid" xmlns:w16="http://schemas.microsoft.com/office/word/2018/wordml" xmlns:w16sdtdh="http://schemas.microsoft.com/office/word/2020/wordml/sdtdatahash" xmlns:w16se="http://schemas.microsoft.com/office/word/2015/wordml/symex" xmlns:wpg="http://schemas.microsoft.com/office/word/2010/wordprocessingGroup" xmlns:wpi="http://schemas.microsoft.com/office/word/2010/wordprocessingInk" xmlns:wne="http://schemas.microsoft.com/office/word/2006/wordml" xmlns:wps="http://schemas.microsoft.com/office/word/2010/wordprocessingShape" mc:Ignorable="w14 w15 w16se w16cid w16 w16cex w16sdtdh wp14">
   <w:sdt>
     <w:sdtPr>
       <w:id w:val="-1998336093"/>
@@ -7832,7 +9721,6 @@
         <w:docPartUnique/>
       </w:docPartObj>
     </w:sdtPr>
-    <w:sdtEndPr/>
     <w:sdtContent>
       <w:p>
         <w:pPr>
@@ -7860,7 +9748,7 @@
 </file>
 
 <file path=word/footnotes.xml><?xml version="1.0" encoding="utf-8"?>
-<w:footnotes xmlns:wpc="http://schemas.microsoft.com/office/word/2010/wordprocessingCanvas" xmlns:cx="http://schemas.microsoft.com/office/drawing/2014/chartex" xmlns:cx1="http://schemas.microsoft.com/office/drawing/2015/9/8/chartex" xmlns:cx2="http://schemas.microsoft.com/office/drawing/2015/10/21/chartex" xmlns:cx3="http://schemas.microsoft.com/office/drawing/2016/5/9/chartex" xmlns:cx4="http://schemas.microsoft.com/office/drawing/2016/5/10/chartex" xmlns:cx5="http://schemas.microsoft.com/office/drawing/2016/5/11/chartex" xmlns:cx6="http://schemas.microsoft.com/office/drawing/2016/5/12/chartex" xmlns:cx7="http://schemas.microsoft.com/office/drawing/2016/5/13/chartex" xmlns:cx8="http://schemas.microsoft.com/office/drawing/2016/5/14/chartex" xmlns:mc="http://schemas.openxmlformats.org/markup-compatibility/2006" xmlns:aink="http://schemas.microsoft.com/office/drawing/2016/ink" xmlns:am3d="http://schemas.microsoft.com/office/drawing/2017/model3d" xmlns:o="urn:schemas-microsoft-com:office:office" xmlns:r="http://schemas.openxmlformats.org/officeDocument/2006/relationships" xmlns:m="http://schemas.openxmlformats.org/officeDocument/2006/math" xmlns:v="urn:schemas-microsoft-com:vml" xmlns:wp14="http://schemas.microsoft.com/office/word/2010/wordprocessingDrawing" xmlns:wp="http://schemas.openxmlformats.org/drawingml/2006/wordprocessingDrawing" xmlns:w10="urn:schemas-microsoft-com:office:word" xmlns:w="http://schemas.openxmlformats.org/wordprocessingml/2006/main" xmlns:w14="http://schemas.microsoft.com/office/word/2010/wordml" xmlns:w15="http://schemas.microsoft.com/office/word/2012/wordml" xmlns:w16cex="http://schemas.microsoft.com/office/word/2018/wordml/cex" xmlns:w16cid="http://schemas.microsoft.com/office/word/2016/wordml/cid" xmlns:w16="http://schemas.microsoft.com/office/word/2018/wordml" xmlns:w16sdtdh="http://schemas.microsoft.com/office/word/2020/wordml/sdtdatahash" xmlns:w16se="http://schemas.microsoft.com/office/word/2015/wordml/symex" xmlns:wpg="http://schemas.microsoft.com/office/word/2010/wordprocessingGroup" xmlns:wpi="http://schemas.microsoft.com/office/word/2010/wordprocessingInk" xmlns:wne="http://schemas.microsoft.com/office/word/2006/wordml" xmlns:wps="http://schemas.microsoft.com/office/word/2010/wordprocessingShape" mc:Ignorable="w14 w15 w16se w16cid w16 w16cex w16sdtdh wp14">
+<w:footnotes xmlns:wpc="http://schemas.microsoft.com/office/word/2010/wordprocessingCanvas" xmlns:cx="http://schemas.microsoft.com/office/drawing/2014/chartex" xmlns:cx1="http://schemas.microsoft.com/office/drawing/2015/9/8/chartex" xmlns:cx2="http://schemas.microsoft.com/office/drawing/2015/10/21/chartex" xmlns:cx3="http://schemas.microsoft.com/office/drawing/2016/5/9/chartex" xmlns:cx4="http://schemas.microsoft.com/office/drawing/2016/5/10/chartex" xmlns:cx5="http://schemas.microsoft.com/office/drawing/2016/5/11/chartex" xmlns:cx6="http://schemas.microsoft.com/office/drawing/2016/5/12/chartex" xmlns:cx7="http://schemas.microsoft.com/office/drawing/2016/5/13/chartex" xmlns:cx8="http://schemas.microsoft.com/office/drawing/2016/5/14/chartex" xmlns:mc="http://schemas.openxmlformats.org/markup-compatibility/2006" xmlns:aink="http://schemas.microsoft.com/office/drawing/2016/ink" xmlns:am3d="http://schemas.microsoft.com/office/drawing/2017/model3d" xmlns:o="urn:schemas-microsoft-com:office:office" xmlns:oel="http://schemas.microsoft.com/office/2019/extlst" xmlns:r="http://schemas.openxmlformats.org/officeDocument/2006/relationships" xmlns:m="http://schemas.openxmlformats.org/officeDocument/2006/math" xmlns:v="urn:schemas-microsoft-com:vml" xmlns:wp14="http://schemas.microsoft.com/office/word/2010/wordprocessingDrawing" xmlns:wp="http://schemas.openxmlformats.org/drawingml/2006/wordprocessingDrawing" xmlns:w10="urn:schemas-microsoft-com:office:word" xmlns:w="http://schemas.openxmlformats.org/wordprocessingml/2006/main" xmlns:w14="http://schemas.microsoft.com/office/word/2010/wordml" xmlns:w15="http://schemas.microsoft.com/office/word/2012/wordml" xmlns:w16cex="http://schemas.microsoft.com/office/word/2018/wordml/cex" xmlns:w16cid="http://schemas.microsoft.com/office/word/2016/wordml/cid" xmlns:w16="http://schemas.microsoft.com/office/word/2018/wordml" xmlns:w16sdtdh="http://schemas.microsoft.com/office/word/2020/wordml/sdtdatahash" xmlns:w16se="http://schemas.microsoft.com/office/word/2015/wordml/symex" xmlns:wpg="http://schemas.microsoft.com/office/word/2010/wordprocessingGroup" xmlns:wpi="http://schemas.microsoft.com/office/word/2010/wordprocessingInk" xmlns:wne="http://schemas.microsoft.com/office/word/2006/wordml" xmlns:wps="http://schemas.microsoft.com/office/word/2010/wordprocessingShape" mc:Ignorable="w14 w15 w16se w16cid w16 w16cex w16sdtdh wp14">
   <w:footnote w:type="separator" w:id="-1">
     <w:p>
       <w:r>
@@ -7879,7 +9767,7 @@
 </file>
 
 <file path=word/header1.xml><?xml version="1.0" encoding="utf-8"?>
-<w:hdr xmlns:wpc="http://schemas.microsoft.com/office/word/2010/wordprocessingCanvas" xmlns:cx="http://schemas.microsoft.com/office/drawing/2014/chartex" xmlns:cx1="http://schemas.microsoft.com/office/drawing/2015/9/8/chartex" xmlns:cx2="http://schemas.microsoft.com/office/drawing/2015/10/21/chartex" xmlns:cx3="http://schemas.microsoft.com/office/drawing/2016/5/9/chartex" xmlns:cx4="http://schemas.microsoft.com/office/drawing/2016/5/10/chartex" xmlns:cx5="http://schemas.microsoft.com/office/drawing/2016/5/11/chartex" xmlns:cx6="http://schemas.microsoft.com/office/drawing/2016/5/12/chartex" xmlns:cx7="http://schemas.microsoft.com/office/drawing/2016/5/13/chartex" xmlns:cx8="http://schemas.microsoft.com/office/drawing/2016/5/14/chartex" xmlns:mc="http://schemas.openxmlformats.org/markup-compatibility/2006" xmlns:aink="http://schemas.microsoft.com/office/drawing/2016/ink" xmlns:am3d="http://schemas.microsoft.com/office/drawing/2017/model3d" xmlns:o="urn:schemas-microsoft-com:office:office" xmlns:r="http://schemas.openxmlformats.org/officeDocument/2006/relationships" xmlns:m="http://schemas.openxmlformats.org/officeDocument/2006/math" xmlns:v="urn:schemas-microsoft-com:vml" xmlns:wp14="http://schemas.microsoft.com/office/word/2010/wordprocessingDrawing" xmlns:wp="http://schemas.openxmlformats.org/drawingml/2006/wordprocessingDrawing" xmlns:w10="urn:schemas-microsoft-com:office:word" xmlns:w="http://schemas.openxmlformats.org/wordprocessingml/2006/main" xmlns:w14="http://schemas.microsoft.com/office/word/2010/wordml" xmlns:w15="http://schemas.microsoft.com/office/word/2012/wordml" xmlns:w16cex="http://schemas.microsoft.com/office/word/2018/wordml/cex" xmlns:w16cid="http://schemas.microsoft.com/office/word/2016/wordml/cid" xmlns:w16="http://schemas.microsoft.com/office/word/2018/wordml" xmlns:w16sdtdh="http://schemas.microsoft.com/office/word/2020/wordml/sdtdatahash" xmlns:w16se="http://schemas.microsoft.com/office/word/2015/wordml/symex" xmlns:wpg="http://schemas.microsoft.com/office/word/2010/wordprocessingGroup" xmlns:wpi="http://schemas.microsoft.com/office/word/2010/wordprocessingInk" xmlns:wne="http://schemas.microsoft.com/office/word/2006/wordml" xmlns:wps="http://schemas.microsoft.com/office/word/2010/wordprocessingShape" mc:Ignorable="w14 w15 w16se w16cid w16 w16cex w16sdtdh wp14">
+<w:hdr xmlns:wpc="http://schemas.microsoft.com/office/word/2010/wordprocessingCanvas" xmlns:cx="http://schemas.microsoft.com/office/drawing/2014/chartex" xmlns:cx1="http://schemas.microsoft.com/office/drawing/2015/9/8/chartex" xmlns:cx2="http://schemas.microsoft.com/office/drawing/2015/10/21/chartex" xmlns:cx3="http://schemas.microsoft.com/office/drawing/2016/5/9/chartex" xmlns:cx4="http://schemas.microsoft.com/office/drawing/2016/5/10/chartex" xmlns:cx5="http://schemas.microsoft.com/office/drawing/2016/5/11/chartex" xmlns:cx6="http://schemas.microsoft.com/office/drawing/2016/5/12/chartex" xmlns:cx7="http://schemas.microsoft.com/office/drawing/2016/5/13/chartex" xmlns:cx8="http://schemas.microsoft.com/office/drawing/2016/5/14/chartex" xmlns:mc="http://schemas.openxmlformats.org/markup-compatibility/2006" xmlns:aink="http://schemas.microsoft.com/office/drawing/2016/ink" xmlns:am3d="http://schemas.microsoft.com/office/drawing/2017/model3d" xmlns:o="urn:schemas-microsoft-com:office:office" xmlns:oel="http://schemas.microsoft.com/office/2019/extlst" xmlns:r="http://schemas.openxmlformats.org/officeDocument/2006/relationships" xmlns:m="http://schemas.openxmlformats.org/officeDocument/2006/math" xmlns:v="urn:schemas-microsoft-com:vml" xmlns:wp14="http://schemas.microsoft.com/office/word/2010/wordprocessingDrawing" xmlns:wp="http://schemas.openxmlformats.org/drawingml/2006/wordprocessingDrawing" xmlns:w10="urn:schemas-microsoft-com:office:word" xmlns:w="http://schemas.openxmlformats.org/wordprocessingml/2006/main" xmlns:w14="http://schemas.microsoft.com/office/word/2010/wordml" xmlns:w15="http://schemas.microsoft.com/office/word/2012/wordml" xmlns:w16cex="http://schemas.microsoft.com/office/word/2018/wordml/cex" xmlns:w16cid="http://schemas.microsoft.com/office/word/2016/wordml/cid" xmlns:w16="http://schemas.microsoft.com/office/word/2018/wordml" xmlns:w16sdtdh="http://schemas.microsoft.com/office/word/2020/wordml/sdtdatahash" xmlns:w16se="http://schemas.microsoft.com/office/word/2015/wordml/symex" xmlns:wpg="http://schemas.microsoft.com/office/word/2010/wordprocessingGroup" xmlns:wpi="http://schemas.microsoft.com/office/word/2010/wordprocessingInk" xmlns:wne="http://schemas.microsoft.com/office/word/2006/wordml" xmlns:wps="http://schemas.microsoft.com/office/word/2010/wordprocessingShape" mc:Ignorable="w14 w15 w16se w16cid w16 w16cex w16sdtdh wp14">
   <w:p>
     <w:pPr>
       <w:pStyle w:val="a4"/>
@@ -7889,7 +9777,7 @@
 </file>
 
 <file path=word/header2.xml><?xml version="1.0" encoding="utf-8"?>
-<w:hdr xmlns:wpc="http://schemas.microsoft.com/office/word/2010/wordprocessingCanvas" xmlns:cx="http://schemas.microsoft.com/office/drawing/2014/chartex" xmlns:cx1="http://schemas.microsoft.com/office/drawing/2015/9/8/chartex" xmlns:cx2="http://schemas.microsoft.com/office/drawing/2015/10/21/chartex" xmlns:cx3="http://schemas.microsoft.com/office/drawing/2016/5/9/chartex" xmlns:cx4="http://schemas.microsoft.com/office/drawing/2016/5/10/chartex" xmlns:cx5="http://schemas.microsoft.com/office/drawing/2016/5/11/chartex" xmlns:cx6="http://schemas.microsoft.com/office/drawing/2016/5/12/chartex" xmlns:cx7="http://schemas.microsoft.com/office/drawing/2016/5/13/chartex" xmlns:cx8="http://schemas.microsoft.com/office/drawing/2016/5/14/chartex" xmlns:mc="http://schemas.openxmlformats.org/markup-compatibility/2006" xmlns:aink="http://schemas.microsoft.com/office/drawing/2016/ink" xmlns:am3d="http://schemas.microsoft.com/office/drawing/2017/model3d" xmlns:o="urn:schemas-microsoft-com:office:office" xmlns:r="http://schemas.openxmlformats.org/officeDocument/2006/relationships" xmlns:m="http://schemas.openxmlformats.org/officeDocument/2006/math" xmlns:v="urn:schemas-microsoft-com:vml" xmlns:wp14="http://schemas.microsoft.com/office/word/2010/wordprocessingDrawing" xmlns:wp="http://schemas.openxmlformats.org/drawingml/2006/wordprocessingDrawing" xmlns:w10="urn:schemas-microsoft-com:office:word" xmlns:w="http://schemas.openxmlformats.org/wordprocessingml/2006/main" xmlns:w14="http://schemas.microsoft.com/office/word/2010/wordml" xmlns:w15="http://schemas.microsoft.com/office/word/2012/wordml" xmlns:w16cex="http://schemas.microsoft.com/office/word/2018/wordml/cex" xmlns:w16cid="http://schemas.microsoft.com/office/word/2016/wordml/cid" xmlns:w16="http://schemas.microsoft.com/office/word/2018/wordml" xmlns:w16sdtdh="http://schemas.microsoft.com/office/word/2020/wordml/sdtdatahash" xmlns:w16se="http://schemas.microsoft.com/office/word/2015/wordml/symex" xmlns:wpg="http://schemas.microsoft.com/office/word/2010/wordprocessingGroup" xmlns:wpi="http://schemas.microsoft.com/office/word/2010/wordprocessingInk" xmlns:wne="http://schemas.microsoft.com/office/word/2006/wordml" xmlns:wps="http://schemas.microsoft.com/office/word/2010/wordprocessingShape" mc:Ignorable="w14 w15 w16se w16cid w16 w16cex w16sdtdh wp14">
+<w:hdr xmlns:wpc="http://schemas.microsoft.com/office/word/2010/wordprocessingCanvas" xmlns:cx="http://schemas.microsoft.com/office/drawing/2014/chartex" xmlns:cx1="http://schemas.microsoft.com/office/drawing/2015/9/8/chartex" xmlns:cx2="http://schemas.microsoft.com/office/drawing/2015/10/21/chartex" xmlns:cx3="http://schemas.microsoft.com/office/drawing/2016/5/9/chartex" xmlns:cx4="http://schemas.microsoft.com/office/drawing/2016/5/10/chartex" xmlns:cx5="http://schemas.microsoft.com/office/drawing/2016/5/11/chartex" xmlns:cx6="http://schemas.microsoft.com/office/drawing/2016/5/12/chartex" xmlns:cx7="http://schemas.microsoft.com/office/drawing/2016/5/13/chartex" xmlns:cx8="http://schemas.microsoft.com/office/drawing/2016/5/14/chartex" xmlns:mc="http://schemas.openxmlformats.org/markup-compatibility/2006" xmlns:aink="http://schemas.microsoft.com/office/drawing/2016/ink" xmlns:am3d="http://schemas.microsoft.com/office/drawing/2017/model3d" xmlns:o="urn:schemas-microsoft-com:office:office" xmlns:oel="http://schemas.microsoft.com/office/2019/extlst" xmlns:r="http://schemas.openxmlformats.org/officeDocument/2006/relationships" xmlns:m="http://schemas.openxmlformats.org/officeDocument/2006/math" xmlns:v="urn:schemas-microsoft-com:vml" xmlns:wp14="http://schemas.microsoft.com/office/word/2010/wordprocessingDrawing" xmlns:wp="http://schemas.openxmlformats.org/drawingml/2006/wordprocessingDrawing" xmlns:w10="urn:schemas-microsoft-com:office:word" xmlns:w="http://schemas.openxmlformats.org/wordprocessingml/2006/main" xmlns:w14="http://schemas.microsoft.com/office/word/2010/wordml" xmlns:w15="http://schemas.microsoft.com/office/word/2012/wordml" xmlns:w16cex="http://schemas.microsoft.com/office/word/2018/wordml/cex" xmlns:w16cid="http://schemas.microsoft.com/office/word/2016/wordml/cid" xmlns:w16="http://schemas.microsoft.com/office/word/2018/wordml" xmlns:w16sdtdh="http://schemas.microsoft.com/office/word/2020/wordml/sdtdatahash" xmlns:w16se="http://schemas.microsoft.com/office/word/2015/wordml/symex" xmlns:wpg="http://schemas.microsoft.com/office/word/2010/wordprocessingGroup" xmlns:wpi="http://schemas.microsoft.com/office/word/2010/wordprocessingInk" xmlns:wne="http://schemas.microsoft.com/office/word/2006/wordml" xmlns:wps="http://schemas.microsoft.com/office/word/2010/wordprocessingShape" mc:Ignorable="w14 w15 w16se w16cid w16 w16cex w16sdtdh wp14">
   <w:p>
     <w:pPr>
       <w:pStyle w:val="a4"/>
@@ -7899,7 +9787,7 @@
 </file>
 
 <file path=word/header3.xml><?xml version="1.0" encoding="utf-8"?>
-<w:hdr xmlns:wpc="http://schemas.microsoft.com/office/word/2010/wordprocessingCanvas" xmlns:cx="http://schemas.microsoft.com/office/drawing/2014/chartex" xmlns:cx1="http://schemas.microsoft.com/office/drawing/2015/9/8/chartex" xmlns:cx2="http://schemas.microsoft.com/office/drawing/2015/10/21/chartex" xmlns:cx3="http://schemas.microsoft.com/office/drawing/2016/5/9/chartex" xmlns:cx4="http://schemas.microsoft.com/office/drawing/2016/5/10/chartex" xmlns:cx5="http://schemas.microsoft.com/office/drawing/2016/5/11/chartex" xmlns:cx6="http://schemas.microsoft.com/office/drawing/2016/5/12/chartex" xmlns:cx7="http://schemas.microsoft.com/office/drawing/2016/5/13/chartex" xmlns:cx8="http://schemas.microsoft.com/office/drawing/2016/5/14/chartex" xmlns:mc="http://schemas.openxmlformats.org/markup-compatibility/2006" xmlns:aink="http://schemas.microsoft.com/office/drawing/2016/ink" xmlns:am3d="http://schemas.microsoft.com/office/drawing/2017/model3d" xmlns:o="urn:schemas-microsoft-com:office:office" xmlns:r="http://schemas.openxmlformats.org/officeDocument/2006/relationships" xmlns:m="http://schemas.openxmlformats.org/officeDocument/2006/math" xmlns:v="urn:schemas-microsoft-com:vml" xmlns:wp14="http://schemas.microsoft.com/office/word/2010/wordprocessingDrawing" xmlns:wp="http://schemas.openxmlformats.org/drawingml/2006/wordprocessingDrawing" xmlns:w10="urn:schemas-microsoft-com:office:word" xmlns:w="http://schemas.openxmlformats.org/wordprocessingml/2006/main" xmlns:w14="http://schemas.microsoft.com/office/word/2010/wordml" xmlns:w15="http://schemas.microsoft.com/office/word/2012/wordml" xmlns:w16cex="http://schemas.microsoft.com/office/word/2018/wordml/cex" xmlns:w16cid="http://schemas.microsoft.com/office/word/2016/wordml/cid" xmlns:w16="http://schemas.microsoft.com/office/word/2018/wordml" xmlns:w16sdtdh="http://schemas.microsoft.com/office/word/2020/wordml/sdtdatahash" xmlns:w16se="http://schemas.microsoft.com/office/word/2015/wordml/symex" xmlns:wpg="http://schemas.microsoft.com/office/word/2010/wordprocessingGroup" xmlns:wpi="http://schemas.microsoft.com/office/word/2010/wordprocessingInk" xmlns:wne="http://schemas.microsoft.com/office/word/2006/wordml" xmlns:wps="http://schemas.microsoft.com/office/word/2010/wordprocessingShape" mc:Ignorable="w14 w15 w16se w16cid w16 w16cex w16sdtdh wp14">
+<w:hdr xmlns:wpc="http://schemas.microsoft.com/office/word/2010/wordprocessingCanvas" xmlns:cx="http://schemas.microsoft.com/office/drawing/2014/chartex" xmlns:cx1="http://schemas.microsoft.com/office/drawing/2015/9/8/chartex" xmlns:cx2="http://schemas.microsoft.com/office/drawing/2015/10/21/chartex" xmlns:cx3="http://schemas.microsoft.com/office/drawing/2016/5/9/chartex" xmlns:cx4="http://schemas.microsoft.com/office/drawing/2016/5/10/chartex" xmlns:cx5="http://schemas.microsoft.com/office/drawing/2016/5/11/chartex" xmlns:cx6="http://schemas.microsoft.com/office/drawing/2016/5/12/chartex" xmlns:cx7="http://schemas.microsoft.com/office/drawing/2016/5/13/chartex" xmlns:cx8="http://schemas.microsoft.com/office/drawing/2016/5/14/chartex" xmlns:mc="http://schemas.openxmlformats.org/markup-compatibility/2006" xmlns:aink="http://schemas.microsoft.com/office/drawing/2016/ink" xmlns:am3d="http://schemas.microsoft.com/office/drawing/2017/model3d" xmlns:o="urn:schemas-microsoft-com:office:office" xmlns:oel="http://schemas.microsoft.com/office/2019/extlst" xmlns:r="http://schemas.openxmlformats.org/officeDocument/2006/relationships" xmlns:m="http://schemas.openxmlformats.org/officeDocument/2006/math" xmlns:v="urn:schemas-microsoft-com:vml" xmlns:wp14="http://schemas.microsoft.com/office/word/2010/wordprocessingDrawing" xmlns:wp="http://schemas.openxmlformats.org/drawingml/2006/wordprocessingDrawing" xmlns:w10="urn:schemas-microsoft-com:office:word" xmlns:w="http://schemas.openxmlformats.org/wordprocessingml/2006/main" xmlns:w14="http://schemas.microsoft.com/office/word/2010/wordml" xmlns:w15="http://schemas.microsoft.com/office/word/2012/wordml" xmlns:w16cex="http://schemas.microsoft.com/office/word/2018/wordml/cex" xmlns:w16cid="http://schemas.microsoft.com/office/word/2016/wordml/cid" xmlns:w16="http://schemas.microsoft.com/office/word/2018/wordml" xmlns:w16sdtdh="http://schemas.microsoft.com/office/word/2020/wordml/sdtdatahash" xmlns:w16se="http://schemas.microsoft.com/office/word/2015/wordml/symex" xmlns:wpg="http://schemas.microsoft.com/office/word/2010/wordprocessingGroup" xmlns:wpi="http://schemas.microsoft.com/office/word/2010/wordprocessingInk" xmlns:wne="http://schemas.microsoft.com/office/word/2006/wordml" xmlns:wps="http://schemas.microsoft.com/office/word/2010/wordprocessingShape" mc:Ignorable="w14 w15 w16se w16cid w16 w16cex w16sdtdh wp14">
   <w:p>
     <w:pPr>
       <w:pStyle w:val="a4"/>
@@ -7909,7 +9797,7 @@
 </file>
 
 <file path=word/numbering.xml><?xml version="1.0" encoding="utf-8"?>
-<w:numbering xmlns:wpc="http://schemas.microsoft.com/office/word/2010/wordprocessingCanvas" xmlns:cx="http://schemas.microsoft.com/office/drawing/2014/chartex" xmlns:cx1="http://schemas.microsoft.com/office/drawing/2015/9/8/chartex" xmlns:cx2="http://schemas.microsoft.com/office/drawing/2015/10/21/chartex" xmlns:cx3="http://schemas.microsoft.com/office/drawing/2016/5/9/chartex" xmlns:cx4="http://schemas.microsoft.com/office/drawing/2016/5/10/chartex" xmlns:cx5="http://schemas.microsoft.com/office/drawing/2016/5/11/chartex" xmlns:cx6="http://schemas.microsoft.com/office/drawing/2016/5/12/chartex" xmlns:cx7="http://schemas.microsoft.com/office/drawing/2016/5/13/chartex" xmlns:cx8="http://schemas.microsoft.com/office/drawing/2016/5/14/chartex" xmlns:mc="http://schemas.openxmlformats.org/markup-compatibility/2006" xmlns:aink="http://schemas.microsoft.com/office/drawing/2016/ink" xmlns:am3d="http://schemas.microsoft.com/office/drawing/2017/model3d" xmlns:o="urn:schemas-microsoft-com:office:office" xmlns:r="http://schemas.openxmlformats.org/officeDocument/2006/relationships" xmlns:m="http://schemas.openxmlformats.org/officeDocument/2006/math" xmlns:v="urn:schemas-microsoft-com:vml" xmlns:wp14="http://schemas.microsoft.com/office/word/2010/wordprocessingDrawing" xmlns:wp="http://schemas.openxmlformats.org/drawingml/2006/wordprocessingDrawing" xmlns:w10="urn:schemas-microsoft-com:office:word" xmlns:w="http://schemas.openxmlformats.org/wordprocessingml/2006/main" xmlns:w14="http://schemas.microsoft.com/office/word/2010/wordml" xmlns:w15="http://schemas.microsoft.com/office/word/2012/wordml" xmlns:w16cex="http://schemas.microsoft.com/office/word/2018/wordml/cex" xmlns:w16cid="http://schemas.microsoft.com/office/word/2016/wordml/cid" xmlns:w16="http://schemas.microsoft.com/office/word/2018/wordml" xmlns:w16sdtdh="http://schemas.microsoft.com/office/word/2020/wordml/sdtdatahash" xmlns:w16se="http://schemas.microsoft.com/office/word/2015/wordml/symex" xmlns:wpg="http://schemas.microsoft.com/office/word/2010/wordprocessingGroup" xmlns:wpi="http://schemas.microsoft.com/office/word/2010/wordprocessingInk" xmlns:wne="http://schemas.microsoft.com/office/word/2006/wordml" xmlns:wps="http://schemas.microsoft.com/office/word/2010/wordprocessingShape" mc:Ignorable="w14 w15 w16se w16cid w16 w16cex w16sdtdh wp14">
+<w:numbering xmlns:wpc="http://schemas.microsoft.com/office/word/2010/wordprocessingCanvas" xmlns:cx="http://schemas.microsoft.com/office/drawing/2014/chartex" xmlns:cx1="http://schemas.microsoft.com/office/drawing/2015/9/8/chartex" xmlns:cx2="http://schemas.microsoft.com/office/drawing/2015/10/21/chartex" xmlns:cx3="http://schemas.microsoft.com/office/drawing/2016/5/9/chartex" xmlns:cx4="http://schemas.microsoft.com/office/drawing/2016/5/10/chartex" xmlns:cx5="http://schemas.microsoft.com/office/drawing/2016/5/11/chartex" xmlns:cx6="http://schemas.microsoft.com/office/drawing/2016/5/12/chartex" xmlns:cx7="http://schemas.microsoft.com/office/drawing/2016/5/13/chartex" xmlns:cx8="http://schemas.microsoft.com/office/drawing/2016/5/14/chartex" xmlns:mc="http://schemas.openxmlformats.org/markup-compatibility/2006" xmlns:aink="http://schemas.microsoft.com/office/drawing/2016/ink" xmlns:am3d="http://schemas.microsoft.com/office/drawing/2017/model3d" xmlns:o="urn:schemas-microsoft-com:office:office" xmlns:oel="http://schemas.microsoft.com/office/2019/extlst" xmlns:r="http://schemas.openxmlformats.org/officeDocument/2006/relationships" xmlns:m="http://schemas.openxmlformats.org/officeDocument/2006/math" xmlns:v="urn:schemas-microsoft-com:vml" xmlns:wp14="http://schemas.microsoft.com/office/word/2010/wordprocessingDrawing" xmlns:wp="http://schemas.openxmlformats.org/drawingml/2006/wordprocessingDrawing" xmlns:w10="urn:schemas-microsoft-com:office:word" xmlns:w="http://schemas.openxmlformats.org/wordprocessingml/2006/main" xmlns:w14="http://schemas.microsoft.com/office/word/2010/wordml" xmlns:w15="http://schemas.microsoft.com/office/word/2012/wordml" xmlns:w16cex="http://schemas.microsoft.com/office/word/2018/wordml/cex" xmlns:w16cid="http://schemas.microsoft.com/office/word/2016/wordml/cid" xmlns:w16="http://schemas.microsoft.com/office/word/2018/wordml" xmlns:w16sdtdh="http://schemas.microsoft.com/office/word/2020/wordml/sdtdatahash" xmlns:w16se="http://schemas.microsoft.com/office/word/2015/wordml/symex" xmlns:wpg="http://schemas.microsoft.com/office/word/2010/wordprocessingGroup" xmlns:wpi="http://schemas.microsoft.com/office/word/2010/wordprocessingInk" xmlns:wne="http://schemas.microsoft.com/office/word/2006/wordml" xmlns:wps="http://schemas.microsoft.com/office/word/2010/wordprocessingShape" mc:Ignorable="w14 w15 w16se w16cid w16 w16cex w16sdtdh wp14">
   <w:abstractNum w:abstractNumId="0" w15:restartNumberingAfterBreak="0">
     <w:nsid w:val="FFFFFFFE"/>
     <w:multiLevelType w:val="singleLevel"/>
@@ -11281,7 +13169,7 @@
       </w:rPr>
     </w:lvl>
   </w:abstractNum>
-  <w:num w:numId="1">
+  <w:num w:numId="1" w16cid:durableId="1637955213">
     <w:abstractNumId w:val="0"/>
     <w:lvlOverride w:ilvl="0">
       <w:lvl w:ilvl="0">
@@ -11296,106 +13184,106 @@
       </w:lvl>
     </w:lvlOverride>
   </w:num>
-  <w:num w:numId="2">
+  <w:num w:numId="2" w16cid:durableId="1215431527">
     <w:abstractNumId w:val="34"/>
   </w:num>
-  <w:num w:numId="3">
+  <w:num w:numId="3" w16cid:durableId="1413549923">
     <w:abstractNumId w:val="20"/>
   </w:num>
-  <w:num w:numId="4">
+  <w:num w:numId="4" w16cid:durableId="1229344630">
     <w:abstractNumId w:val="13"/>
   </w:num>
-  <w:num w:numId="5">
+  <w:num w:numId="5" w16cid:durableId="345594876">
     <w:abstractNumId w:val="18"/>
   </w:num>
-  <w:num w:numId="6">
+  <w:num w:numId="6" w16cid:durableId="933127061">
     <w:abstractNumId w:val="22"/>
   </w:num>
-  <w:num w:numId="7">
+  <w:num w:numId="7" w16cid:durableId="1868176160">
     <w:abstractNumId w:val="7"/>
   </w:num>
-  <w:num w:numId="8">
+  <w:num w:numId="8" w16cid:durableId="1959944043">
     <w:abstractNumId w:val="4"/>
   </w:num>
-  <w:num w:numId="9">
+  <w:num w:numId="9" w16cid:durableId="1385250969">
     <w:abstractNumId w:val="27"/>
   </w:num>
-  <w:num w:numId="10">
+  <w:num w:numId="10" w16cid:durableId="617184396">
     <w:abstractNumId w:val="15"/>
   </w:num>
-  <w:num w:numId="11">
+  <w:num w:numId="11" w16cid:durableId="106430663">
     <w:abstractNumId w:val="28"/>
   </w:num>
-  <w:num w:numId="12">
+  <w:num w:numId="12" w16cid:durableId="1229876290">
     <w:abstractNumId w:val="31"/>
   </w:num>
-  <w:num w:numId="13">
+  <w:num w:numId="13" w16cid:durableId="1240091139">
     <w:abstractNumId w:val="30"/>
   </w:num>
-  <w:num w:numId="14">
+  <w:num w:numId="14" w16cid:durableId="1897545502">
     <w:abstractNumId w:val="9"/>
   </w:num>
-  <w:num w:numId="15">
+  <w:num w:numId="15" w16cid:durableId="700784098">
     <w:abstractNumId w:val="8"/>
   </w:num>
-  <w:num w:numId="16">
+  <w:num w:numId="16" w16cid:durableId="1817064104">
     <w:abstractNumId w:val="1"/>
   </w:num>
-  <w:num w:numId="17">
+  <w:num w:numId="17" w16cid:durableId="1066534974">
     <w:abstractNumId w:val="21"/>
   </w:num>
-  <w:num w:numId="18">
+  <w:num w:numId="18" w16cid:durableId="1764565171">
     <w:abstractNumId w:val="29"/>
   </w:num>
-  <w:num w:numId="19">
+  <w:num w:numId="19" w16cid:durableId="1605380718">
     <w:abstractNumId w:val="24"/>
   </w:num>
-  <w:num w:numId="20">
+  <w:num w:numId="20" w16cid:durableId="925579475">
     <w:abstractNumId w:val="14"/>
   </w:num>
-  <w:num w:numId="21">
+  <w:num w:numId="21" w16cid:durableId="1702047314">
     <w:abstractNumId w:val="3"/>
   </w:num>
-  <w:num w:numId="22">
+  <w:num w:numId="22" w16cid:durableId="116996324">
     <w:abstractNumId w:val="19"/>
   </w:num>
-  <w:num w:numId="23">
+  <w:num w:numId="23" w16cid:durableId="120539892">
     <w:abstractNumId w:val="32"/>
   </w:num>
-  <w:num w:numId="24">
+  <w:num w:numId="24" w16cid:durableId="285091010">
     <w:abstractNumId w:val="5"/>
   </w:num>
-  <w:num w:numId="25">
+  <w:num w:numId="25" w16cid:durableId="1323969490">
     <w:abstractNumId w:val="11"/>
   </w:num>
-  <w:num w:numId="26">
+  <w:num w:numId="26" w16cid:durableId="845294080">
     <w:abstractNumId w:val="16"/>
   </w:num>
-  <w:num w:numId="27">
+  <w:num w:numId="27" w16cid:durableId="1633554212">
     <w:abstractNumId w:val="33"/>
   </w:num>
-  <w:num w:numId="28">
+  <w:num w:numId="28" w16cid:durableId="1879584272">
     <w:abstractNumId w:val="12"/>
   </w:num>
-  <w:num w:numId="29">
+  <w:num w:numId="29" w16cid:durableId="209847500">
     <w:abstractNumId w:val="23"/>
   </w:num>
-  <w:num w:numId="30">
+  <w:num w:numId="30" w16cid:durableId="15350986">
     <w:abstractNumId w:val="10"/>
   </w:num>
-  <w:num w:numId="31">
+  <w:num w:numId="31" w16cid:durableId="1783526584">
     <w:abstractNumId w:val="17"/>
   </w:num>
-  <w:num w:numId="32">
+  <w:num w:numId="32" w16cid:durableId="7559501">
     <w:abstractNumId w:val="2"/>
   </w:num>
-  <w:num w:numId="33">
+  <w:num w:numId="33" w16cid:durableId="424083912">
     <w:abstractNumId w:val="26"/>
   </w:num>
-  <w:num w:numId="34">
+  <w:num w:numId="34" w16cid:durableId="778180993">
     <w:abstractNumId w:val="25"/>
   </w:num>
-  <w:num w:numId="35">
+  <w:num w:numId="35" w16cid:durableId="1434664916">
     <w:abstractNumId w:val="6"/>
   </w:num>
   <w:numIdMacAtCleanup w:val="15"/>

</xml_diff>